<commit_message>
Apply Jasper's corrections and drop unbacked skills
- GPA is 3.95 at Columbia, not 3.91.
- Harmoniqs, not Hamoniqs. NYU Abu Dhabi qualification is for 2027.
- Reading group covered all 33 chapters of Andrew Childs' notes; say so.
- Restore Quantum Optimization & ML to the Columbia coursework line.
- Title both thesis advisors "Dr." rather than mixing Dr. and Prof.
- Replace every em dash with a colon, comma, or full stop.
- Tag Q-Search by what is interesting about it, Gemini and stabilizer
  simulation, rather than by Python.
- Cut skills nothing on the page backs up: Go, Java, TypeScript,
  TensorFlow, scikit-learn, spectral graph theory. Add query complexity.

Co-Authored-By: Claude Opus 5 <noreply@anthropic.com>
Claude-Session: https://claude.ai/code/session_01EbsTbSDgvxSSfAYTVqmk9g
</commit_message>
<xml_diff>
--- a/resume/jaspersands_resume.docx
+++ b/resume/jaspersands_resume.docx
@@ -44,7 +44,7 @@
           <w:sz w:val="18"/>
           <w:szCs w:val="18"/>
         </w:rPr>
-        <w:t xml:space="preserve">Quantum algorithms, error correction, and machine learning for qubit control. MS at Columbia, quantum computing track — thesis at Diraq and UNSW Sydney on automating silicon spin qubit measurement.</w:t>
+        <w:t xml:space="preserve">Quantum algorithms, error correction, and machine learning for qubit control. MS at Columbia, quantum computing track. Thesis at Diraq and UNSW Sydney on automating silicon spin qubit measurement.</w:t>
       </w:r>
     </w:p>
     <w:p>
@@ -89,23 +89,23 @@
           <w:sz w:val="18"/>
           <w:szCs w:val="18"/>
         </w:rPr>
-        <w:t xml:space="preserve">, MS in Computer Science — Quantum Computing Track</w:t>
-      </w:r>
-      <w:r>
-        <w:rPr>
-          <w:rFonts w:ascii="Times New Roman" w:cs="Times New Roman" w:eastAsia="Times New Roman" w:hAnsi="Times New Roman"/>
-          <w:sz w:val="18"/>
-          <w:szCs w:val="18"/>
-        </w:rPr>
-        <w:t xml:space="preserve"> · </w:t>
-      </w:r>
-      <w:r>
-        <w:rPr>
-          <w:rFonts w:ascii="Times New Roman" w:cs="Times New Roman" w:eastAsia="Times New Roman" w:hAnsi="Times New Roman"/>
-          <w:sz w:val="18"/>
-          <w:szCs w:val="18"/>
-        </w:rPr>
-        <w:t xml:space="preserve">GPA 3.91/4.0</w:t>
+        <w:t xml:space="preserve">, MS in Computer Science, Quantum Computing Track</w:t>
+      </w:r>
+      <w:r>
+        <w:rPr>
+          <w:rFonts w:ascii="Times New Roman" w:cs="Times New Roman" w:eastAsia="Times New Roman" w:hAnsi="Times New Roman"/>
+          <w:sz w:val="18"/>
+          <w:szCs w:val="18"/>
+        </w:rPr>
+        <w:t xml:space="preserve"> · </w:t>
+      </w:r>
+      <w:r>
+        <w:rPr>
+          <w:rFonts w:ascii="Times New Roman" w:cs="Times New Roman" w:eastAsia="Times New Roman" w:hAnsi="Times New Roman"/>
+          <w:sz w:val="18"/>
+          <w:szCs w:val="18"/>
+        </w:rPr>
+        <w:t xml:space="preserve">GPA 3.95/4.0</w:t>
       </w:r>
       <w:r>
         <w:tab/>
@@ -139,7 +139,7 @@
           <w:sz w:val="18"/>
           <w:szCs w:val="18"/>
         </w:rPr>
-        <w:t xml:space="preserve">automating silicon spin qubit measurement with machine learning — Diraq and UNSW Sydney, Sep 2026 – May 2027, co-supervised by Dr. Nard Dumoulin Stuyck and Prof. Henry Yuen.</w:t>
+        <w:t xml:space="preserve">automating silicon spin qubit measurement with machine learning. Diraq and UNSW Sydney, Sep 2026 – May 2027, co-supervised by Dr. Nard Dumoulin Stuyck and Dr. Henry Yuen.</w:t>
       </w:r>
     </w:p>
     <w:p>
@@ -194,7 +194,23 @@
           <w:sz w:val="18"/>
           <w:szCs w:val="18"/>
         </w:rPr>
-        <w:t xml:space="preserve">Quantum Simulation &amp; Computing Lab. </w:t>
+        <w:t xml:space="preserve">Quantum Simulation &amp; Computing Lab</w:t>
+      </w:r>
+      <w:r>
+        <w:rPr>
+          <w:rFonts w:ascii="Times New Roman" w:cs="Times New Roman" w:eastAsia="Times New Roman" w:hAnsi="Times New Roman"/>
+          <w:sz w:val="18"/>
+          <w:szCs w:val="18"/>
+        </w:rPr>
+        <w:t xml:space="preserve"> · </w:t>
+      </w:r>
+      <w:r>
+        <w:rPr>
+          <w:rFonts w:ascii="Times New Roman" w:cs="Times New Roman" w:eastAsia="Times New Roman" w:hAnsi="Times New Roman"/>
+          <w:sz w:val="18"/>
+          <w:szCs w:val="18"/>
+        </w:rPr>
+        <w:t xml:space="preserve">Quantum Optimization &amp; ML. </w:t>
       </w:r>
       <w:r>
         <w:rPr>
@@ -383,7 +399,7 @@
           <w:sz w:val="18"/>
           <w:szCs w:val="18"/>
         </w:rPr>
-        <w:t xml:space="preserve"> — quantum amplitude estimation for financial Value at Risk</w:t>
+        <w:t xml:space="preserve">: quantum amplitude estimation for financial Value at Risk</w:t>
       </w:r>
       <w:r>
         <w:rPr>
@@ -412,7 +428,7 @@
           <w:sz w:val="18"/>
           <w:szCs w:val="18"/>
         </w:rPr>
-        <w:t xml:space="preserve">iQuHACK 2026 — Overall Winner</w:t>
+        <w:t xml:space="preserve">Overall Winner, iQuHACK 2026</w:t>
       </w:r>
     </w:p>
     <w:p>
@@ -456,7 +472,7 @@
           <w:sz w:val="18"/>
           <w:szCs w:val="18"/>
         </w:rPr>
-        <w:t xml:space="preserve"> — surface-code decoding in the browser</w:t>
+        <w:t xml:space="preserve">: surface-code decoding in the browser</w:t>
       </w:r>
       <w:r>
         <w:rPr>
@@ -529,7 +545,7 @@
           <w:sz w:val="18"/>
           <w:szCs w:val="18"/>
         </w:rPr>
-        <w:t xml:space="preserve"> — transverse-field Ising model</w:t>
+        <w:t xml:space="preserve">: transverse-field Ising model</w:t>
       </w:r>
       <w:r>
         <w:rPr>
@@ -597,7 +613,7 @@
           <w:sz w:val="18"/>
           <w:szCs w:val="18"/>
         </w:rPr>
-        <w:t xml:space="preserve"> — multi-agent quantum algorithm discovery engine</w:t>
+        <w:t xml:space="preserve">: multi-agent quantum algorithm discovery engine</w:t>
       </w:r>
       <w:r>
         <w:rPr>
@@ -615,7 +631,7 @@
           <w:sz w:val="18"/>
           <w:szCs w:val="18"/>
         </w:rPr>
-        <w:t xml:space="preserve">Python, Gemini</w:t>
+        <w:t xml:space="preserve">Gemini, stabilizer simulation</w:t>
       </w:r>
       <w:r>
         <w:tab/>
@@ -970,7 +986,7 @@
           <w:sz w:val="18"/>
           <w:szCs w:val="18"/>
         </w:rPr>
-        <w:t xml:space="preserve">, Columbia (Dr. Eugene Wu, Sep–Dec 2025) — SMS survey data into actuarial and climate-risk features for agricultural loss estimation. </w:t>
+        <w:t xml:space="preserve">, Columbia (Dr. Eugene Wu, Sep–Dec 2025): SMS survey data into actuarial and climate-risk features for agricultural loss estimation. </w:t>
       </w:r>
       <w:r>
         <w:rPr>
@@ -988,7 +1004,7 @@
           <w:sz w:val="18"/>
           <w:szCs w:val="18"/>
         </w:rPr>
-        <w:t xml:space="preserve">, WashU (Dr. Umar Iqbal, Sep 2024–Jun 2025) — distributed pipelines parsing billions of forum posts.</w:t>
+        <w:t xml:space="preserve">, WashU (Dr. Umar Iqbal, Sep 2024–Jun 2025): distributed pipelines parsing billions of forum posts.</w:t>
       </w:r>
     </w:p>
     <w:p>
@@ -1235,7 +1251,7 @@
           <w:sz w:val="18"/>
           <w:szCs w:val="18"/>
         </w:rPr>
-        <w:t xml:space="preserve">, Associate Application Security Engineer (May–Jul 2020) — vulnerability triage and client disclosure work.</w:t>
+        <w:t xml:space="preserve">, Associate Application Security Engineer (May–Jul 2020): vulnerability triage and client disclosure work.</w:t>
       </w:r>
     </w:p>
     <w:p>
@@ -1316,7 +1332,7 @@
           <w:sz w:val="18"/>
           <w:szCs w:val="18"/>
         </w:rPr>
-        <w:t xml:space="preserve">Qualified, NYUAD Quantum Hackathon for Social Good 2026</w:t>
+        <w:t xml:space="preserve">Qualified, NYU Abu Dhabi Quantum Hackathon for Social Good 2027</w:t>
       </w:r>
       <w:r>
         <w:rPr>
@@ -1342,7 +1358,7 @@
           <w:sz w:val="18"/>
           <w:szCs w:val="18"/>
         </w:rPr>
-        <w:t xml:space="preserve">, Hamoniqs Quantum Design Hackathon 2026</w:t>
+        <w:t xml:space="preserve">, Harmoniqs Quantum Design Hackathon 2026</w:t>
       </w:r>
       <w:r>
         <w:rPr>
@@ -1396,7 +1412,7 @@
           <w:sz w:val="18"/>
           <w:szCs w:val="18"/>
         </w:rPr>
-        <w:t xml:space="preserve">, Columbia Quantum Algorithms Reading Group (Sep 2025–Jun 2026) — weekly sessions on Hamiltonian simulation and LCU.</w:t>
+        <w:t xml:space="preserve">, Columbia Quantum Algorithms Reading Group (Sep 2025–Jun 2026): ran weekly sessions covering all 33 chapters of Andrew Childs' quantum algorithms lecture notes, each with simulation checks.</w:t>
       </w:r>
     </w:p>
     <w:p>
@@ -1463,7 +1479,7 @@
           <w:sz w:val="18"/>
           <w:szCs w:val="18"/>
         </w:rPr>
-        <w:t xml:space="preserve">Python, C++, Rust, C, Go, Java, TypeScript, MATLAB</w:t>
+        <w:t xml:space="preserve">Python, C++, Rust, C, MATLAB</w:t>
       </w:r>
     </w:p>
     <w:p>
@@ -1487,7 +1503,7 @@
           <w:sz w:val="18"/>
           <w:szCs w:val="18"/>
         </w:rPr>
-        <w:t xml:space="preserve">PyTorch, TensorFlow, scikit-learn, Hugging Face, CUDA · Linux, Git, Docker, WebAssembly, AWS, GCP, Elasticsearch, LaTeX</w:t>
+        <w:t xml:space="preserve">PyTorch, CUDA, Hugging Face · Linux, Git, Docker, WebAssembly, AWS, GCP, Elasticsearch, LaTeX</w:t>
       </w:r>
     </w:p>
     <w:p>
@@ -1511,7 +1527,7 @@
           <w:sz w:val="18"/>
           <w:szCs w:val="18"/>
         </w:rPr>
-        <w:t xml:space="preserve">Linear algebra, spectral graph theory, tensor networks, probability, optimization, quantum complexity (BQP, QMA)</w:t>
+        <w:t xml:space="preserve">Linear algebra, tensor networks, probability, convex optimization, quantum complexity (BQP, QMA), query complexity</w:t>
       </w:r>
     </w:p>
     <w:sectPr>

</xml_diff>

<commit_message>
Give every project a bullet, add the QEC and hardware tooling
- All five projects now carry a bullet. Three of them used a plain
  indented line purely because it saved vertical space, which read as
  inconsistent rather than deliberate.
- Split Columbia coursework and the TA line in two, so the second line
  is a choice rather than a wrap.
- Say "MS in computer science" in the tagline, matching Education.
- Skills: add Qiskit Runtime, Stim, PyMatching, QuTiP, randomized
  benchmarking, and tomography. Drop Cirq and PennyLane to pay for them.
- Q-Search is tagged "LLM agents, circuit synthesis" rather than naming a
  model vendor, pending confirmation of which one it actually runs on.
- Trim the research "Also" line from three wrapped lines to two.

Co-Authored-By: Claude Opus 5 <noreply@anthropic.com>
Claude-Session: https://claude.ai/code/session_01EbsTbSDgvxSSfAYTVqmk9g
</commit_message>
<xml_diff>
--- a/resume/jaspersands_resume.docx
+++ b/resume/jaspersands_resume.docx
@@ -44,7 +44,7 @@
           <w:sz w:val="18"/>
           <w:szCs w:val="18"/>
         </w:rPr>
-        <w:t xml:space="preserve">Quantum algorithms, error correction, and machine learning for qubit control. MS at Columbia, quantum computing track. Thesis at Diraq and UNSW Sydney on automating silicon spin qubit measurement.</w:t>
+        <w:t xml:space="preserve">Quantum algorithms, error correction, and machine learning for qubit control. MS in computer science at Columbia. Thesis at Diraq and UNSW Sydney on automating silicon spin qubit measurement.</w:t>
       </w:r>
     </w:p>
     <w:p>
@@ -210,8 +210,13 @@
           <w:sz w:val="18"/>
           <w:szCs w:val="18"/>
         </w:rPr>
-        <w:t xml:space="preserve">Quantum Optimization &amp; ML. </w:t>
-      </w:r>
+        <w:t xml:space="preserve">Quantum Optimization &amp; ML.</w:t>
+      </w:r>
+    </w:p>
+    <w:p>
+      <w:pPr>
+        <w:spacing w:before="6" w:line="215" w:lineRule="exact"/>
+      </w:pPr>
       <w:r>
         <w:rPr>
           <w:rFonts w:ascii="Times New Roman" w:cs="Times New Roman" w:eastAsia="Times New Roman" w:hAnsi="Times New Roman"/>
@@ -228,7 +233,7 @@
           <w:sz w:val="18"/>
           <w:szCs w:val="18"/>
         </w:rPr>
-        <w:t xml:space="preserve">Intro to Quantum Computing.</w:t>
+        <w:t xml:space="preserve">Introduction to Quantum Computing.</w:t>
       </w:r>
     </w:p>
     <w:p>
@@ -579,221 +584,6 @@
     </w:p>
     <w:p>
       <w:pPr>
-        <w:spacing w:before="6" w:line="215" w:lineRule="exact"/>
-      </w:pPr>
-      <w:r>
-        <w:rPr>
-          <w:rFonts w:ascii="Times New Roman" w:cs="Times New Roman" w:eastAsia="Times New Roman" w:hAnsi="Times New Roman"/>
-          <w:sz w:val="18"/>
-          <w:szCs w:val="18"/>
-        </w:rPr>
-        <w:t xml:space="preserve">Digitized adiabatic ground-state preparation on Heron's native fractional RZZ gates, roughly halving logical-to-physical translation error, with palindromic Trotter steps and a schedule flattened where the gap closes.</w:t>
-      </w:r>
-    </w:p>
-    <w:p>
-      <w:pPr>
-        <w:tabs>
-          <w:tab w:val="right" w:pos="10656"/>
-        </w:tabs>
-        <w:spacing w:before="54" w:line="215" w:lineRule="exact"/>
-      </w:pPr>
-      <w:r>
-        <w:rPr>
-          <w:rFonts w:ascii="Times New Roman" w:cs="Times New Roman" w:eastAsia="Times New Roman" w:hAnsi="Times New Roman"/>
-          <w:b/>
-          <w:bCs/>
-          <w:sz w:val="18"/>
-          <w:szCs w:val="18"/>
-        </w:rPr>
-        <w:t xml:space="preserve">Q-Search</w:t>
-      </w:r>
-      <w:r>
-        <w:rPr>
-          <w:rFonts w:ascii="Times New Roman" w:cs="Times New Roman" w:eastAsia="Times New Roman" w:hAnsi="Times New Roman"/>
-          <w:sz w:val="18"/>
-          <w:szCs w:val="18"/>
-        </w:rPr>
-        <w:t xml:space="preserve">: multi-agent quantum algorithm discovery engine</w:t>
-      </w:r>
-      <w:r>
-        <w:rPr>
-          <w:rFonts w:ascii="Times New Roman" w:cs="Times New Roman" w:eastAsia="Times New Roman" w:hAnsi="Times New Roman"/>
-          <w:sz w:val="18"/>
-          <w:szCs w:val="18"/>
-        </w:rPr>
-        <w:t xml:space="preserve"> · </w:t>
-      </w:r>
-      <w:r>
-        <w:rPr>
-          <w:rFonts w:ascii="Times New Roman" w:cs="Times New Roman" w:eastAsia="Times New Roman" w:hAnsi="Times New Roman"/>
-          <w:i/>
-          <w:iCs/>
-          <w:sz w:val="18"/>
-          <w:szCs w:val="18"/>
-        </w:rPr>
-        <w:t xml:space="preserve">Gemini, stabilizer simulation</w:t>
-      </w:r>
-      <w:r>
-        <w:tab/>
-      </w:r>
-      <w:r>
-        <w:rPr>
-          <w:rFonts w:ascii="Times New Roman" w:cs="Times New Roman" w:eastAsia="Times New Roman" w:hAnsi="Times New Roman"/>
-          <w:sz w:val="18"/>
-          <w:szCs w:val="18"/>
-        </w:rPr>
-        <w:t xml:space="preserve">qsearch.jaspersands.com</w:t>
-      </w:r>
-    </w:p>
-    <w:p>
-      <w:pPr>
-        <w:spacing w:before="6" w:line="215" w:lineRule="exact"/>
-      </w:pPr>
-      <w:r>
-        <w:rPr>
-          <w:rFonts w:ascii="Times New Roman" w:cs="Times New Roman" w:eastAsia="Times New Roman" w:hAnsi="Times New Roman"/>
-          <w:sz w:val="18"/>
-          <w:szCs w:val="18"/>
-        </w:rPr>
-        <w:t xml:space="preserve">Agents propose problems, design circuits, verify them by stabilizer and oracle simulation, and fit complexity scaling across 795 runs.</w:t>
-      </w:r>
-    </w:p>
-    <w:p>
-      <w:pPr>
-        <w:tabs>
-          <w:tab w:val="right" w:pos="10656"/>
-        </w:tabs>
-        <w:spacing w:before="54" w:line="215" w:lineRule="exact"/>
-      </w:pPr>
-      <w:r>
-        <w:rPr>
-          <w:rFonts w:ascii="Times New Roman" w:cs="Times New Roman" w:eastAsia="Times New Roman" w:hAnsi="Times New Roman"/>
-          <w:b/>
-          <w:bCs/>
-          <w:sz w:val="18"/>
-          <w:szCs w:val="18"/>
-        </w:rPr>
-        <w:t xml:space="preserve">LLM-Based Lossless Text Compression</w:t>
-      </w:r>
-      <w:r>
-        <w:rPr>
-          <w:rFonts w:ascii="Times New Roman" w:cs="Times New Roman" w:eastAsia="Times New Roman" w:hAnsi="Times New Roman"/>
-          <w:sz w:val="18"/>
-          <w:szCs w:val="18"/>
-        </w:rPr>
-        <w:t xml:space="preserve"> · </w:t>
-      </w:r>
-      <w:r>
-        <w:rPr>
-          <w:rFonts w:ascii="Times New Roman" w:cs="Times New Roman" w:eastAsia="Times New Roman" w:hAnsi="Times New Roman"/>
-          <w:i/>
-          <w:iCs/>
-          <w:sz w:val="18"/>
-          <w:szCs w:val="18"/>
-        </w:rPr>
-        <w:t xml:space="preserve">PyTorch, CUDA</w:t>
-      </w:r>
-      <w:r>
-        <w:tab/>
-      </w:r>
-      <w:r>
-        <w:rPr>
-          <w:rFonts w:ascii="Times New Roman" w:cs="Times New Roman" w:eastAsia="Times New Roman" w:hAnsi="Times New Roman"/>
-          <w:sz w:val="18"/>
-          <w:szCs w:val="18"/>
-        </w:rPr>
-        <w:t xml:space="preserve">Systems optimization</w:t>
-      </w:r>
-    </w:p>
-    <w:p>
-      <w:pPr>
-        <w:spacing w:before="6" w:line="215" w:lineRule="exact"/>
-      </w:pPr>
-      <w:r>
-        <w:rPr>
-          <w:rFonts w:ascii="Times New Roman" w:cs="Times New Roman" w:eastAsia="Times New Roman" w:hAnsi="Times New Roman"/>
-          <w:sz w:val="18"/>
-          <w:szCs w:val="18"/>
-        </w:rPr>
-        <w:t xml:space="preserve">Arithmetic coding on autoregressive LLM predictions: 5–16× average and 39× best-case compression, beating zstd and gzip; static KV caching and CUDA graphs for throughput.</w:t>
-      </w:r>
-    </w:p>
-    <w:p>
-      <w:pPr>
-        <w:pBdr>
-          <w:bottom w:val="single" w:color="000000" w:sz="6" w:space="1"/>
-        </w:pBdr>
-        <w:spacing w:after="16" w:before="100" w:line="215" w:lineRule="exact"/>
-      </w:pPr>
-      <w:r>
-        <w:rPr>
-          <w:rFonts w:ascii="Times New Roman" w:cs="Times New Roman" w:eastAsia="Times New Roman" w:hAnsi="Times New Roman"/>
-          <w:b/>
-          <w:bCs/>
-          <w:spacing w:val="16"/>
-          <w:sz w:val="17"/>
-          <w:szCs w:val="17"/>
-        </w:rPr>
-        <w:t xml:space="preserve">RESEARCH</w:t>
-      </w:r>
-    </w:p>
-    <w:p>
-      <w:pPr>
-        <w:tabs>
-          <w:tab w:val="right" w:pos="10656"/>
-        </w:tabs>
-        <w:spacing w:before="42" w:line="215" w:lineRule="exact"/>
-      </w:pPr>
-      <w:r>
-        <w:rPr>
-          <w:rFonts w:ascii="Times New Roman" w:cs="Times New Roman" w:eastAsia="Times New Roman" w:hAnsi="Times New Roman"/>
-          <w:b/>
-          <w:bCs/>
-          <w:sz w:val="18"/>
-          <w:szCs w:val="18"/>
-        </w:rPr>
-        <w:t xml:space="preserve">Cidon Systems Research Lab</w:t>
-      </w:r>
-      <w:r>
-        <w:rPr>
-          <w:rFonts w:ascii="Times New Roman" w:cs="Times New Roman" w:eastAsia="Times New Roman" w:hAnsi="Times New Roman"/>
-          <w:sz w:val="18"/>
-          <w:szCs w:val="18"/>
-        </w:rPr>
-        <w:t xml:space="preserve">, Columbia University</w:t>
-      </w:r>
-      <w:r>
-        <w:rPr>
-          <w:rFonts w:ascii="Times New Roman" w:cs="Times New Roman" w:eastAsia="Times New Roman" w:hAnsi="Times New Roman"/>
-          <w:sz w:val="18"/>
-          <w:szCs w:val="18"/>
-        </w:rPr>
-        <w:t xml:space="preserve"> · </w:t>
-      </w:r>
-      <w:r>
-        <w:rPr>
-          <w:rFonts w:ascii="Times New Roman" w:cs="Times New Roman" w:eastAsia="Times New Roman" w:hAnsi="Times New Roman"/>
-          <w:i/>
-          <w:iCs/>
-          <w:sz w:val="18"/>
-          <w:szCs w:val="18"/>
-        </w:rPr>
-        <w:t xml:space="preserve">Graduate Researcher</w:t>
-      </w:r>
-      <w:r>
-        <w:tab/>
-      </w:r>
-      <w:r>
-        <w:rPr>
-          <w:rFonts w:ascii="Times New Roman" w:cs="Times New Roman" w:eastAsia="Times New Roman" w:hAnsi="Times New Roman"/>
-          <w:sz w:val="18"/>
-          <w:szCs w:val="18"/>
-        </w:rPr>
-        <w:t xml:space="preserve">Sep 2025 – Jun 2026</w:t>
-      </w:r>
-    </w:p>
-    <w:p>
-      <w:pPr>
         <w:pStyle w:val="ListParagraph"/>
         <w:numPr>
           <w:ilvl w:val="0"/>
@@ -807,7 +597,7 @@
           <w:sz w:val="18"/>
           <w:szCs w:val="18"/>
         </w:rPr>
-        <w:t xml:space="preserve">Built phishing and spam detection pipelines with Dr. Asaf Cidon and Barracuda Networks, combining language-model embeddings with production email telemetry and tuning for precision against a fixed false-positive budget.</w:t>
+        <w:t xml:space="preserve">Digitized adiabatic ground-state preparation on Heron's native fractional RZZ gates, roughly halving logical-to-physical translation error, with palindromic Trotter steps and a schedule flattened where the gap closes.</w:t>
       </w:r>
     </w:p>
     <w:p>
@@ -825,15 +615,15 @@
           <w:sz w:val="18"/>
           <w:szCs w:val="18"/>
         </w:rPr>
-        <w:t xml:space="preserve">Complex Resilient Intelligent Systems Lab</w:t>
-      </w:r>
-      <w:r>
-        <w:rPr>
-          <w:rFonts w:ascii="Times New Roman" w:cs="Times New Roman" w:eastAsia="Times New Roman" w:hAnsi="Times New Roman"/>
-          <w:sz w:val="18"/>
-          <w:szCs w:val="18"/>
-        </w:rPr>
-        <w:t xml:space="preserve">, Columbia University</w:t>
+        <w:t xml:space="preserve">Q-Search</w:t>
+      </w:r>
+      <w:r>
+        <w:rPr>
+          <w:rFonts w:ascii="Times New Roman" w:cs="Times New Roman" w:eastAsia="Times New Roman" w:hAnsi="Times New Roman"/>
+          <w:sz w:val="18"/>
+          <w:szCs w:val="18"/>
+        </w:rPr>
+        <w:t xml:space="preserve">: multi-agent quantum algorithm discovery engine</w:t>
       </w:r>
       <w:r>
         <w:rPr>
@@ -851,7 +641,7 @@
           <w:sz w:val="18"/>
           <w:szCs w:val="18"/>
         </w:rPr>
-        <w:t xml:space="preserve">Graduate Researcher</w:t>
+        <w:t xml:space="preserve">LLM agents, circuit synthesis</w:t>
       </w:r>
       <w:r>
         <w:tab/>
@@ -862,7 +652,7 @@
           <w:sz w:val="18"/>
           <w:szCs w:val="18"/>
         </w:rPr>
-        <w:t xml:space="preserve">May – Dec 2025</w:t>
+        <w:t xml:space="preserve">qsearch.jaspersands.com</w:t>
       </w:r>
     </w:p>
     <w:p>
@@ -880,7 +670,7 @@
           <w:sz w:val="18"/>
           <w:szCs w:val="18"/>
         </w:rPr>
-        <w:t xml:space="preserve">Reduced hallucination in generative protein modeling under Dr. Venkat Venkatasubramanian by grounding outputs in molecular graph data.</w:t>
+        <w:t xml:space="preserve">Agents propose problems, design circuits, verify them by simulation, and fit complexity scaling across 795 runs.</w:t>
       </w:r>
     </w:p>
     <w:p>
@@ -898,15 +688,7 @@
           <w:sz w:val="18"/>
           <w:szCs w:val="18"/>
         </w:rPr>
-        <w:t xml:space="preserve">Foster Care Policy Database</w:t>
-      </w:r>
-      <w:r>
-        <w:rPr>
-          <w:rFonts w:ascii="Times New Roman" w:cs="Times New Roman" w:eastAsia="Times New Roman" w:hAnsi="Times New Roman"/>
-          <w:sz w:val="18"/>
-          <w:szCs w:val="18"/>
-        </w:rPr>
-        <w:t xml:space="preserve">, Washington University in St. Louis</w:t>
+        <w:t xml:space="preserve">LLM-Based Lossless Text Compression</w:t>
       </w:r>
       <w:r>
         <w:rPr>
@@ -924,7 +706,7 @@
           <w:sz w:val="18"/>
           <w:szCs w:val="18"/>
         </w:rPr>
-        <w:t xml:space="preserve">Undergraduate Researcher</w:t>
+        <w:t xml:space="preserve">PyTorch, CUDA</w:t>
       </w:r>
       <w:r>
         <w:tab/>
@@ -935,7 +717,7 @@
           <w:sz w:val="18"/>
           <w:szCs w:val="18"/>
         </w:rPr>
-        <w:t xml:space="preserve">Sep 2024 – Jun 2025</w:t>
+        <w:t xml:space="preserve">Systems optimization</w:t>
       </w:r>
     </w:p>
     <w:p>
@@ -953,58 +735,7 @@
           <w:sz w:val="18"/>
           <w:szCs w:val="18"/>
         </w:rPr>
-        <w:t xml:space="preserve">Fine-tuned LLaMA-3 with Unsloth and Hugging Face for QA over 50k foster-care policy documents, with human-in-the-loop feedback.</w:t>
-      </w:r>
-    </w:p>
-    <w:p>
-      <w:pPr>
-        <w:spacing w:before="42" w:line="215" w:lineRule="exact"/>
-      </w:pPr>
-      <w:r>
-        <w:rPr>
-          <w:rFonts w:ascii="Times New Roman" w:cs="Times New Roman" w:eastAsia="Times New Roman" w:hAnsi="Times New Roman"/>
-          <w:b/>
-          <w:bCs/>
-          <w:sz w:val="18"/>
-          <w:szCs w:val="18"/>
-        </w:rPr>
-        <w:t xml:space="preserve">Also: </w:t>
-      </w:r>
-      <w:r>
-        <w:rPr>
-          <w:rFonts w:ascii="Times New Roman" w:cs="Times New Roman" w:eastAsia="Times New Roman" w:hAnsi="Times New Roman"/>
-          <w:b/>
-          <w:bCs/>
-          <w:sz w:val="18"/>
-          <w:szCs w:val="18"/>
-        </w:rPr>
-        <w:t xml:space="preserve">Desdr Open Insurance Toolkit</w:t>
-      </w:r>
-      <w:r>
-        <w:rPr>
-          <w:rFonts w:ascii="Times New Roman" w:cs="Times New Roman" w:eastAsia="Times New Roman" w:hAnsi="Times New Roman"/>
-          <w:sz w:val="18"/>
-          <w:szCs w:val="18"/>
-        </w:rPr>
-        <w:t xml:space="preserve">, Columbia (Dr. Eugene Wu, Sep–Dec 2025): SMS survey data into actuarial and climate-risk features for agricultural loss estimation. </w:t>
-      </w:r>
-      <w:r>
-        <w:rPr>
-          <w:rFonts w:ascii="Times New Roman" w:cs="Times New Roman" w:eastAsia="Times New Roman" w:hAnsi="Times New Roman"/>
-          <w:b/>
-          <w:bCs/>
-          <w:sz w:val="18"/>
-          <w:szCs w:val="18"/>
-        </w:rPr>
-        <w:t xml:space="preserve">Computer Vision &amp; AI Lab</w:t>
-      </w:r>
-      <w:r>
-        <w:rPr>
-          <w:rFonts w:ascii="Times New Roman" w:cs="Times New Roman" w:eastAsia="Times New Roman" w:hAnsi="Times New Roman"/>
-          <w:sz w:val="18"/>
-          <w:szCs w:val="18"/>
-        </w:rPr>
-        <w:t xml:space="preserve">, WashU (Dr. Umar Iqbal, Sep 2024–Jun 2025): distributed pipelines parsing billions of forum posts.</w:t>
+        <w:t xml:space="preserve">Arithmetic coding on autoregressive LLM predictions: 5–16× average and 39× best-case compression, beating zstd and gzip; static KV caching and CUDA graphs for throughput.</w:t>
       </w:r>
     </w:p>
     <w:p>
@@ -1023,7 +754,7 @@
           <w:sz w:val="17"/>
           <w:szCs w:val="17"/>
         </w:rPr>
-        <w:t xml:space="preserve">EXPERIENCE</w:t>
+        <w:t xml:space="preserve">RESEARCH</w:t>
       </w:r>
     </w:p>
     <w:p>
@@ -1041,7 +772,15 @@
           <w:sz w:val="18"/>
           <w:szCs w:val="18"/>
         </w:rPr>
-        <w:t xml:space="preserve">Smack Technologies</w:t>
+        <w:t xml:space="preserve">Cidon Systems Research Lab</w:t>
+      </w:r>
+      <w:r>
+        <w:rPr>
+          <w:rFonts w:ascii="Times New Roman" w:cs="Times New Roman" w:eastAsia="Times New Roman" w:hAnsi="Times New Roman"/>
+          <w:sz w:val="18"/>
+          <w:szCs w:val="18"/>
+        </w:rPr>
+        <w:t xml:space="preserve">, Columbia University</w:t>
       </w:r>
       <w:r>
         <w:rPr>
@@ -1059,7 +798,7 @@
           <w:sz w:val="18"/>
           <w:szCs w:val="18"/>
         </w:rPr>
-        <w:t xml:space="preserve">Software Engineer Intern</w:t>
+        <w:t xml:space="preserve">Graduate Researcher</w:t>
       </w:r>
       <w:r>
         <w:tab/>
@@ -1070,7 +809,7 @@
           <w:sz w:val="18"/>
           <w:szCs w:val="18"/>
         </w:rPr>
-        <w:t xml:space="preserve">May – Aug 2026</w:t>
+        <w:t xml:space="preserve">Sep 2025 – Jun 2026</w:t>
       </w:r>
     </w:p>
     <w:p>
@@ -1088,7 +827,7 @@
           <w:sz w:val="18"/>
           <w:szCs w:val="18"/>
         </w:rPr>
-        <w:t xml:space="preserve">Wrote physics simulations and decision models for the core technology pipelines, plus benchmarks validating the learned policies.</w:t>
+        <w:t xml:space="preserve">Built phishing and spam detection pipelines with Dr. Asaf Cidon and Barracuda Networks, combining language-model embeddings with production email telemetry and tuning for precision against a fixed false-positive budget.</w:t>
       </w:r>
     </w:p>
     <w:p>
@@ -1106,7 +845,15 @@
           <w:sz w:val="18"/>
           <w:szCs w:val="18"/>
         </w:rPr>
-        <w:t xml:space="preserve">Highnote</w:t>
+        <w:t xml:space="preserve">Complex Resilient Intelligent Systems Lab</w:t>
+      </w:r>
+      <w:r>
+        <w:rPr>
+          <w:rFonts w:ascii="Times New Roman" w:cs="Times New Roman" w:eastAsia="Times New Roman" w:hAnsi="Times New Roman"/>
+          <w:sz w:val="18"/>
+          <w:szCs w:val="18"/>
+        </w:rPr>
+        <w:t xml:space="preserve">, Columbia University</w:t>
       </w:r>
       <w:r>
         <w:rPr>
@@ -1124,7 +871,7 @@
           <w:sz w:val="18"/>
           <w:szCs w:val="18"/>
         </w:rPr>
-        <w:t xml:space="preserve">Cybersecurity Engineer Intern</w:t>
+        <w:t xml:space="preserve">Graduate Researcher</w:t>
       </w:r>
       <w:r>
         <w:tab/>
@@ -1135,7 +882,7 @@
           <w:sz w:val="18"/>
           <w:szCs w:val="18"/>
         </w:rPr>
-        <w:t xml:space="preserve">May – Jul 2024</w:t>
+        <w:t xml:space="preserve">May – Dec 2025</w:t>
       </w:r>
     </w:p>
     <w:p>
@@ -1153,7 +900,7 @@
           <w:sz w:val="18"/>
           <w:szCs w:val="18"/>
         </w:rPr>
-        <w:t xml:space="preserve">Designed and deployed the company-wide SIEM for a card-issuing fintech, unifying AWS, GCP, and Datadog telemetry into one Elasticsearch cluster ingesting over 1 TB/day, and wrote 100+ rule-based and ML anomaly detections.</w:t>
+        <w:t xml:space="preserve">Reduced hallucination in generative protein modeling under Dr. Venkat Venkatasubramanian by grounding outputs in molecular graph data.</w:t>
       </w:r>
     </w:p>
     <w:p>
@@ -1171,7 +918,15 @@
           <w:sz w:val="18"/>
           <w:szCs w:val="18"/>
         </w:rPr>
-        <w:t xml:space="preserve">Mindtrip</w:t>
+        <w:t xml:space="preserve">Foster Care Policy Database</w:t>
+      </w:r>
+      <w:r>
+        <w:rPr>
+          <w:rFonts w:ascii="Times New Roman" w:cs="Times New Roman" w:eastAsia="Times New Roman" w:hAnsi="Times New Roman"/>
+          <w:sz w:val="18"/>
+          <w:szCs w:val="18"/>
+        </w:rPr>
+        <w:t xml:space="preserve">, Washington University in St. Louis</w:t>
       </w:r>
       <w:r>
         <w:rPr>
@@ -1189,7 +944,7 @@
           <w:sz w:val="18"/>
           <w:szCs w:val="18"/>
         </w:rPr>
-        <w:t xml:space="preserve">Software Engineer Intern</w:t>
+        <w:t xml:space="preserve">Undergraduate Researcher</w:t>
       </w:r>
       <w:r>
         <w:tab/>
@@ -1200,7 +955,7 @@
           <w:sz w:val="18"/>
           <w:szCs w:val="18"/>
         </w:rPr>
-        <w:t xml:space="preserve">May – Jul 2023</w:t>
+        <w:t xml:space="preserve">Sep 2024 – Jun 2025</w:t>
       </w:r>
     </w:p>
     <w:p>
@@ -1218,7 +973,7 @@
           <w:sz w:val="18"/>
           <w:szCs w:val="18"/>
         </w:rPr>
-        <w:t xml:space="preserve">Built internal admin and secure-query tooling in JavaScript and Rails via Retool, saving roughly 250 engineering hours a month.</w:t>
+        <w:t xml:space="preserve">Fine-tuned LLaMA-3 with Unsloth and Hugging Face for QA over 50k foster-care policy documents, with human-in-the-loop feedback.</w:t>
       </w:r>
     </w:p>
     <w:p>
@@ -1233,25 +988,43 @@
           <w:sz w:val="18"/>
           <w:szCs w:val="18"/>
         </w:rPr>
-        <w:t xml:space="preserve">Earlier: </w:t>
-      </w:r>
-      <w:r>
-        <w:rPr>
-          <w:rFonts w:ascii="Times New Roman" w:cs="Times New Roman" w:eastAsia="Times New Roman" w:hAnsi="Times New Roman"/>
-          <w:b/>
-          <w:bCs/>
-          <w:sz w:val="18"/>
-          <w:szCs w:val="18"/>
-        </w:rPr>
-        <w:t xml:space="preserve">Bugcrowd</w:t>
-      </w:r>
-      <w:r>
-        <w:rPr>
-          <w:rFonts w:ascii="Times New Roman" w:cs="Times New Roman" w:eastAsia="Times New Roman" w:hAnsi="Times New Roman"/>
-          <w:sz w:val="18"/>
-          <w:szCs w:val="18"/>
-        </w:rPr>
-        <w:t xml:space="preserve">, Associate Application Security Engineer (May–Jul 2020): vulnerability triage and client disclosure work.</w:t>
+        <w:t xml:space="preserve">Also: </w:t>
+      </w:r>
+      <w:r>
+        <w:rPr>
+          <w:rFonts w:ascii="Times New Roman" w:cs="Times New Roman" w:eastAsia="Times New Roman" w:hAnsi="Times New Roman"/>
+          <w:b/>
+          <w:bCs/>
+          <w:sz w:val="18"/>
+          <w:szCs w:val="18"/>
+        </w:rPr>
+        <w:t xml:space="preserve">Desdr Open Insurance Toolkit</w:t>
+      </w:r>
+      <w:r>
+        <w:rPr>
+          <w:rFonts w:ascii="Times New Roman" w:cs="Times New Roman" w:eastAsia="Times New Roman" w:hAnsi="Times New Roman"/>
+          <w:sz w:val="18"/>
+          <w:szCs w:val="18"/>
+        </w:rPr>
+        <w:t xml:space="preserve">, Columbia (Dr. Eugene Wu, Sep–Dec 2025): survey data into actuarial and climate-risk features. </w:t>
+      </w:r>
+      <w:r>
+        <w:rPr>
+          <w:rFonts w:ascii="Times New Roman" w:cs="Times New Roman" w:eastAsia="Times New Roman" w:hAnsi="Times New Roman"/>
+          <w:b/>
+          <w:bCs/>
+          <w:sz w:val="18"/>
+          <w:szCs w:val="18"/>
+        </w:rPr>
+        <w:t xml:space="preserve">Computer Vision &amp; AI Lab</w:t>
+      </w:r>
+      <w:r>
+        <w:rPr>
+          <w:rFonts w:ascii="Times New Roman" w:cs="Times New Roman" w:eastAsia="Times New Roman" w:hAnsi="Times New Roman"/>
+          <w:sz w:val="18"/>
+          <w:szCs w:val="18"/>
+        </w:rPr>
+        <w:t xml:space="preserve">, WashU (Dr. Umar Iqbal, Sep 2024–Jun 2025): pipelines parsing billions of forum posts.</w:t>
       </w:r>
     </w:p>
     <w:p>
@@ -1270,7 +1043,54 @@
           <w:sz w:val="17"/>
           <w:szCs w:val="17"/>
         </w:rPr>
-        <w:t xml:space="preserve">HONORS &amp; LEADERSHIP</w:t>
+        <w:t xml:space="preserve">EXPERIENCE</w:t>
+      </w:r>
+    </w:p>
+    <w:p>
+      <w:pPr>
+        <w:tabs>
+          <w:tab w:val="right" w:pos="10656"/>
+        </w:tabs>
+        <w:spacing w:before="42" w:line="215" w:lineRule="exact"/>
+      </w:pPr>
+      <w:r>
+        <w:rPr>
+          <w:rFonts w:ascii="Times New Roman" w:cs="Times New Roman" w:eastAsia="Times New Roman" w:hAnsi="Times New Roman"/>
+          <w:b/>
+          <w:bCs/>
+          <w:sz w:val="18"/>
+          <w:szCs w:val="18"/>
+        </w:rPr>
+        <w:t xml:space="preserve">Smack Technologies</w:t>
+      </w:r>
+      <w:r>
+        <w:rPr>
+          <w:rFonts w:ascii="Times New Roman" w:cs="Times New Roman" w:eastAsia="Times New Roman" w:hAnsi="Times New Roman"/>
+          <w:sz w:val="18"/>
+          <w:szCs w:val="18"/>
+        </w:rPr>
+        <w:t xml:space="preserve"> · </w:t>
+      </w:r>
+      <w:r>
+        <w:rPr>
+          <w:rFonts w:ascii="Times New Roman" w:cs="Times New Roman" w:eastAsia="Times New Roman" w:hAnsi="Times New Roman"/>
+          <w:i/>
+          <w:iCs/>
+          <w:sz w:val="18"/>
+          <w:szCs w:val="18"/>
+        </w:rPr>
+        <w:t xml:space="preserve">Software Engineer Intern</w:t>
+      </w:r>
+      <w:r>
+        <w:tab/>
+      </w:r>
+      <w:r>
+        <w:rPr>
+          <w:rFonts w:ascii="Times New Roman" w:cs="Times New Roman" w:eastAsia="Times New Roman" w:hAnsi="Times New Roman"/>
+          <w:sz w:val="18"/>
+          <w:szCs w:val="18"/>
+        </w:rPr>
+        <w:t xml:space="preserve">May – Aug 2026</w:t>
       </w:r>
     </w:p>
     <w:p>
@@ -1285,106 +1105,57 @@
       <w:r>
         <w:rPr>
           <w:rFonts w:ascii="Times New Roman" w:cs="Times New Roman" w:eastAsia="Times New Roman" w:hAnsi="Times New Roman"/>
-          <w:b/>
-          <w:bCs/>
-          <w:sz w:val="18"/>
-          <w:szCs w:val="18"/>
-        </w:rPr>
-        <w:t xml:space="preserve">Overall Winner</w:t>
-      </w:r>
-      <w:r>
-        <w:rPr>
-          <w:rFonts w:ascii="Times New Roman" w:cs="Times New Roman" w:eastAsia="Times New Roman" w:hAnsi="Times New Roman"/>
-          <w:sz w:val="18"/>
-          <w:szCs w:val="18"/>
-        </w:rPr>
-        <w:t xml:space="preserve"> and </w:t>
-      </w:r>
-      <w:r>
-        <w:rPr>
-          <w:rFonts w:ascii="Times New Roman" w:cs="Times New Roman" w:eastAsia="Times New Roman" w:hAnsi="Times New Roman"/>
-          <w:b/>
-          <w:bCs/>
-          <w:sz w:val="18"/>
-          <w:szCs w:val="18"/>
-        </w:rPr>
-        <w:t xml:space="preserve">NVIDIA Ecosystem Award</w:t>
-      </w:r>
-      <w:r>
-        <w:rPr>
-          <w:rFonts w:ascii="Times New Roman" w:cs="Times New Roman" w:eastAsia="Times New Roman" w:hAnsi="Times New Roman"/>
-          <w:sz w:val="18"/>
-          <w:szCs w:val="18"/>
-        </w:rPr>
-        <w:t xml:space="preserve">, MIT iQuHACK 2026</w:t>
-      </w:r>
-      <w:r>
-        <w:rPr>
-          <w:rFonts w:ascii="Times New Roman" w:cs="Times New Roman" w:eastAsia="Times New Roman" w:hAnsi="Times New Roman"/>
-          <w:sz w:val="18"/>
-          <w:szCs w:val="18"/>
-        </w:rPr>
-        <w:t xml:space="preserve"> · </w:t>
-      </w:r>
-      <w:r>
-        <w:rPr>
-          <w:rFonts w:ascii="Times New Roman" w:cs="Times New Roman" w:eastAsia="Times New Roman" w:hAnsi="Times New Roman"/>
-          <w:sz w:val="18"/>
-          <w:szCs w:val="18"/>
-        </w:rPr>
-        <w:t xml:space="preserve">Qualified, NYU Abu Dhabi Quantum Hackathon for Social Good 2027</w:t>
-      </w:r>
-      <w:r>
-        <w:rPr>
-          <w:rFonts w:ascii="Times New Roman" w:cs="Times New Roman" w:eastAsia="Times New Roman" w:hAnsi="Times New Roman"/>
-          <w:sz w:val="18"/>
-          <w:szCs w:val="18"/>
-        </w:rPr>
-        <w:t xml:space="preserve"> · </w:t>
-      </w:r>
-      <w:r>
-        <w:rPr>
-          <w:rFonts w:ascii="Times New Roman" w:cs="Times New Roman" w:eastAsia="Times New Roman" w:hAnsi="Times New Roman"/>
-          <w:b/>
-          <w:bCs/>
-          <w:sz w:val="18"/>
-          <w:szCs w:val="18"/>
-        </w:rPr>
-        <w:t xml:space="preserve">Audience Favorite</w:t>
-      </w:r>
-      <w:r>
-        <w:rPr>
-          <w:rFonts w:ascii="Times New Roman" w:cs="Times New Roman" w:eastAsia="Times New Roman" w:hAnsi="Times New Roman"/>
-          <w:sz w:val="18"/>
-          <w:szCs w:val="18"/>
-        </w:rPr>
-        <w:t xml:space="preserve">, Harmoniqs Quantum Design Hackathon 2026</w:t>
-      </w:r>
-      <w:r>
-        <w:rPr>
-          <w:rFonts w:ascii="Times New Roman" w:cs="Times New Roman" w:eastAsia="Times New Roman" w:hAnsi="Times New Roman"/>
-          <w:sz w:val="18"/>
-          <w:szCs w:val="18"/>
-        </w:rPr>
-        <w:t xml:space="preserve"> · </w:t>
-      </w:r>
-      <w:r>
-        <w:rPr>
-          <w:rFonts w:ascii="Times New Roman" w:cs="Times New Roman" w:eastAsia="Times New Roman" w:hAnsi="Times New Roman"/>
-          <w:b/>
-          <w:bCs/>
-          <w:sz w:val="18"/>
-          <w:szCs w:val="18"/>
-        </w:rPr>
-        <w:t xml:space="preserve">Runner-Up</w:t>
-      </w:r>
-      <w:r>
-        <w:rPr>
-          <w:rFonts w:ascii="Times New Roman" w:cs="Times New Roman" w:eastAsia="Times New Roman" w:hAnsi="Times New Roman"/>
-          <w:sz w:val="18"/>
-          <w:szCs w:val="18"/>
-        </w:rPr>
-        <w:t xml:space="preserve">, Qualcomm Snapdragon Multiverse Hackathon 2026</w:t>
+          <w:sz w:val="18"/>
+          <w:szCs w:val="18"/>
+        </w:rPr>
+        <w:t xml:space="preserve">Wrote physics simulations and decision models for the core technology pipelines, plus benchmarks validating the learned policies.</w:t>
+      </w:r>
+    </w:p>
+    <w:p>
+      <w:pPr>
+        <w:tabs>
+          <w:tab w:val="right" w:pos="10656"/>
+        </w:tabs>
+        <w:spacing w:before="54" w:line="215" w:lineRule="exact"/>
+      </w:pPr>
+      <w:r>
+        <w:rPr>
+          <w:rFonts w:ascii="Times New Roman" w:cs="Times New Roman" w:eastAsia="Times New Roman" w:hAnsi="Times New Roman"/>
+          <w:b/>
+          <w:bCs/>
+          <w:sz w:val="18"/>
+          <w:szCs w:val="18"/>
+        </w:rPr>
+        <w:t xml:space="preserve">Highnote</w:t>
+      </w:r>
+      <w:r>
+        <w:rPr>
+          <w:rFonts w:ascii="Times New Roman" w:cs="Times New Roman" w:eastAsia="Times New Roman" w:hAnsi="Times New Roman"/>
+          <w:sz w:val="18"/>
+          <w:szCs w:val="18"/>
+        </w:rPr>
+        <w:t xml:space="preserve"> · </w:t>
+      </w:r>
+      <w:r>
+        <w:rPr>
+          <w:rFonts w:ascii="Times New Roman" w:cs="Times New Roman" w:eastAsia="Times New Roman" w:hAnsi="Times New Roman"/>
+          <w:i/>
+          <w:iCs/>
+          <w:sz w:val="18"/>
+          <w:szCs w:val="18"/>
+        </w:rPr>
+        <w:t xml:space="preserve">Cybersecurity Engineer Intern</w:t>
+      </w:r>
+      <w:r>
+        <w:tab/>
+      </w:r>
+      <w:r>
+        <w:rPr>
+          <w:rFonts w:ascii="Times New Roman" w:cs="Times New Roman" w:eastAsia="Times New Roman" w:hAnsi="Times New Roman"/>
+          <w:sz w:val="18"/>
+          <w:szCs w:val="18"/>
+        </w:rPr>
+        <w:t xml:space="preserve">May – Jul 2024</w:t>
       </w:r>
     </w:p>
     <w:p>
@@ -1399,20 +1170,108 @@
       <w:r>
         <w:rPr>
           <w:rFonts w:ascii="Times New Roman" w:cs="Times New Roman" w:eastAsia="Times New Roman" w:hAnsi="Times New Roman"/>
-          <w:b/>
-          <w:bCs/>
-          <w:sz w:val="18"/>
-          <w:szCs w:val="18"/>
-        </w:rPr>
-        <w:t xml:space="preserve">Graduate Lead</w:t>
-      </w:r>
-      <w:r>
-        <w:rPr>
-          <w:rFonts w:ascii="Times New Roman" w:cs="Times New Roman" w:eastAsia="Times New Roman" w:hAnsi="Times New Roman"/>
-          <w:sz w:val="18"/>
-          <w:szCs w:val="18"/>
-        </w:rPr>
-        <w:t xml:space="preserve">, Columbia Quantum Algorithms Reading Group (Sep 2025–Jun 2026): ran weekly sessions covering all 33 chapters of Andrew Childs' quantum algorithms lecture notes, each with simulation checks.</w:t>
+          <w:sz w:val="18"/>
+          <w:szCs w:val="18"/>
+        </w:rPr>
+        <w:t xml:space="preserve">Designed and deployed the company-wide SIEM for a card-issuing fintech, unifying AWS, GCP, and Datadog telemetry into one Elasticsearch cluster ingesting over 1 TB/day, and wrote 100+ rule-based and ML anomaly detections.</w:t>
+      </w:r>
+    </w:p>
+    <w:p>
+      <w:pPr>
+        <w:tabs>
+          <w:tab w:val="right" w:pos="10656"/>
+        </w:tabs>
+        <w:spacing w:before="54" w:line="215" w:lineRule="exact"/>
+      </w:pPr>
+      <w:r>
+        <w:rPr>
+          <w:rFonts w:ascii="Times New Roman" w:cs="Times New Roman" w:eastAsia="Times New Roman" w:hAnsi="Times New Roman"/>
+          <w:b/>
+          <w:bCs/>
+          <w:sz w:val="18"/>
+          <w:szCs w:val="18"/>
+        </w:rPr>
+        <w:t xml:space="preserve">Mindtrip</w:t>
+      </w:r>
+      <w:r>
+        <w:rPr>
+          <w:rFonts w:ascii="Times New Roman" w:cs="Times New Roman" w:eastAsia="Times New Roman" w:hAnsi="Times New Roman"/>
+          <w:sz w:val="18"/>
+          <w:szCs w:val="18"/>
+        </w:rPr>
+        <w:t xml:space="preserve"> · </w:t>
+      </w:r>
+      <w:r>
+        <w:rPr>
+          <w:rFonts w:ascii="Times New Roman" w:cs="Times New Roman" w:eastAsia="Times New Roman" w:hAnsi="Times New Roman"/>
+          <w:i/>
+          <w:iCs/>
+          <w:sz w:val="18"/>
+          <w:szCs w:val="18"/>
+        </w:rPr>
+        <w:t xml:space="preserve">Software Engineer Intern</w:t>
+      </w:r>
+      <w:r>
+        <w:tab/>
+      </w:r>
+      <w:r>
+        <w:rPr>
+          <w:rFonts w:ascii="Times New Roman" w:cs="Times New Roman" w:eastAsia="Times New Roman" w:hAnsi="Times New Roman"/>
+          <w:sz w:val="18"/>
+          <w:szCs w:val="18"/>
+        </w:rPr>
+        <w:t xml:space="preserve">May – Jul 2023</w:t>
+      </w:r>
+    </w:p>
+    <w:p>
+      <w:pPr>
+        <w:pStyle w:val="ListParagraph"/>
+        <w:numPr>
+          <w:ilvl w:val="0"/>
+          <w:numId w:val="2"/>
+        </w:numPr>
+        <w:spacing w:before="12" w:line="215" w:lineRule="exact"/>
+      </w:pPr>
+      <w:r>
+        <w:rPr>
+          <w:rFonts w:ascii="Times New Roman" w:cs="Times New Roman" w:eastAsia="Times New Roman" w:hAnsi="Times New Roman"/>
+          <w:sz w:val="18"/>
+          <w:szCs w:val="18"/>
+        </w:rPr>
+        <w:t xml:space="preserve">Built internal admin and secure-query tooling in JavaScript and Rails via Retool, saving roughly 250 engineering hours a month.</w:t>
+      </w:r>
+    </w:p>
+    <w:p>
+      <w:pPr>
+        <w:spacing w:before="42" w:line="215" w:lineRule="exact"/>
+      </w:pPr>
+      <w:r>
+        <w:rPr>
+          <w:rFonts w:ascii="Times New Roman" w:cs="Times New Roman" w:eastAsia="Times New Roman" w:hAnsi="Times New Roman"/>
+          <w:b/>
+          <w:bCs/>
+          <w:sz w:val="18"/>
+          <w:szCs w:val="18"/>
+        </w:rPr>
+        <w:t xml:space="preserve">Earlier: </w:t>
+      </w:r>
+      <w:r>
+        <w:rPr>
+          <w:rFonts w:ascii="Times New Roman" w:cs="Times New Roman" w:eastAsia="Times New Roman" w:hAnsi="Times New Roman"/>
+          <w:b/>
+          <w:bCs/>
+          <w:sz w:val="18"/>
+          <w:szCs w:val="18"/>
+        </w:rPr>
+        <w:t xml:space="preserve">Bugcrowd</w:t>
+      </w:r>
+      <w:r>
+        <w:rPr>
+          <w:rFonts w:ascii="Times New Roman" w:cs="Times New Roman" w:eastAsia="Times New Roman" w:hAnsi="Times New Roman"/>
+          <w:sz w:val="18"/>
+          <w:szCs w:val="18"/>
+        </w:rPr>
+        <w:t xml:space="preserve">, Associate Application Security Engineer (May–Jul 2020): vulnerability triage and client disclosure work.</w:t>
       </w:r>
     </w:p>
     <w:p>
@@ -1431,6 +1290,167 @@
           <w:sz w:val="17"/>
           <w:szCs w:val="17"/>
         </w:rPr>
+        <w:t xml:space="preserve">HONORS &amp; LEADERSHIP</w:t>
+      </w:r>
+    </w:p>
+    <w:p>
+      <w:pPr>
+        <w:pStyle w:val="ListParagraph"/>
+        <w:numPr>
+          <w:ilvl w:val="0"/>
+          <w:numId w:val="2"/>
+        </w:numPr>
+        <w:spacing w:before="12" w:line="215" w:lineRule="exact"/>
+      </w:pPr>
+      <w:r>
+        <w:rPr>
+          <w:rFonts w:ascii="Times New Roman" w:cs="Times New Roman" w:eastAsia="Times New Roman" w:hAnsi="Times New Roman"/>
+          <w:b/>
+          <w:bCs/>
+          <w:sz w:val="18"/>
+          <w:szCs w:val="18"/>
+        </w:rPr>
+        <w:t xml:space="preserve">Overall Winner</w:t>
+      </w:r>
+      <w:r>
+        <w:rPr>
+          <w:rFonts w:ascii="Times New Roman" w:cs="Times New Roman" w:eastAsia="Times New Roman" w:hAnsi="Times New Roman"/>
+          <w:sz w:val="18"/>
+          <w:szCs w:val="18"/>
+        </w:rPr>
+        <w:t xml:space="preserve"> and </w:t>
+      </w:r>
+      <w:r>
+        <w:rPr>
+          <w:rFonts w:ascii="Times New Roman" w:cs="Times New Roman" w:eastAsia="Times New Roman" w:hAnsi="Times New Roman"/>
+          <w:b/>
+          <w:bCs/>
+          <w:sz w:val="18"/>
+          <w:szCs w:val="18"/>
+        </w:rPr>
+        <w:t xml:space="preserve">NVIDIA Ecosystem Award</w:t>
+      </w:r>
+      <w:r>
+        <w:rPr>
+          <w:rFonts w:ascii="Times New Roman" w:cs="Times New Roman" w:eastAsia="Times New Roman" w:hAnsi="Times New Roman"/>
+          <w:sz w:val="18"/>
+          <w:szCs w:val="18"/>
+        </w:rPr>
+        <w:t xml:space="preserve">, MIT iQuHACK 2026</w:t>
+      </w:r>
+      <w:r>
+        <w:rPr>
+          <w:rFonts w:ascii="Times New Roman" w:cs="Times New Roman" w:eastAsia="Times New Roman" w:hAnsi="Times New Roman"/>
+          <w:sz w:val="18"/>
+          <w:szCs w:val="18"/>
+        </w:rPr>
+        <w:t xml:space="preserve"> · </w:t>
+      </w:r>
+      <w:r>
+        <w:rPr>
+          <w:rFonts w:ascii="Times New Roman" w:cs="Times New Roman" w:eastAsia="Times New Roman" w:hAnsi="Times New Roman"/>
+          <w:sz w:val="18"/>
+          <w:szCs w:val="18"/>
+        </w:rPr>
+        <w:t xml:space="preserve">Qualified, NYU Abu Dhabi Quantum Hackathon for Social Good 2027</w:t>
+      </w:r>
+      <w:r>
+        <w:rPr>
+          <w:rFonts w:ascii="Times New Roman" w:cs="Times New Roman" w:eastAsia="Times New Roman" w:hAnsi="Times New Roman"/>
+          <w:sz w:val="18"/>
+          <w:szCs w:val="18"/>
+        </w:rPr>
+        <w:t xml:space="preserve"> · </w:t>
+      </w:r>
+      <w:r>
+        <w:rPr>
+          <w:rFonts w:ascii="Times New Roman" w:cs="Times New Roman" w:eastAsia="Times New Roman" w:hAnsi="Times New Roman"/>
+          <w:b/>
+          <w:bCs/>
+          <w:sz w:val="18"/>
+          <w:szCs w:val="18"/>
+        </w:rPr>
+        <w:t xml:space="preserve">Audience Favorite</w:t>
+      </w:r>
+      <w:r>
+        <w:rPr>
+          <w:rFonts w:ascii="Times New Roman" w:cs="Times New Roman" w:eastAsia="Times New Roman" w:hAnsi="Times New Roman"/>
+          <w:sz w:val="18"/>
+          <w:szCs w:val="18"/>
+        </w:rPr>
+        <w:t xml:space="preserve">, Harmoniqs Quantum Design Hackathon 2026</w:t>
+      </w:r>
+      <w:r>
+        <w:rPr>
+          <w:rFonts w:ascii="Times New Roman" w:cs="Times New Roman" w:eastAsia="Times New Roman" w:hAnsi="Times New Roman"/>
+          <w:sz w:val="18"/>
+          <w:szCs w:val="18"/>
+        </w:rPr>
+        <w:t xml:space="preserve"> · </w:t>
+      </w:r>
+      <w:r>
+        <w:rPr>
+          <w:rFonts w:ascii="Times New Roman" w:cs="Times New Roman" w:eastAsia="Times New Roman" w:hAnsi="Times New Roman"/>
+          <w:b/>
+          <w:bCs/>
+          <w:sz w:val="18"/>
+          <w:szCs w:val="18"/>
+        </w:rPr>
+        <w:t xml:space="preserve">Runner-Up</w:t>
+      </w:r>
+      <w:r>
+        <w:rPr>
+          <w:rFonts w:ascii="Times New Roman" w:cs="Times New Roman" w:eastAsia="Times New Roman" w:hAnsi="Times New Roman"/>
+          <w:sz w:val="18"/>
+          <w:szCs w:val="18"/>
+        </w:rPr>
+        <w:t xml:space="preserve">, Qualcomm Snapdragon Multiverse Hackathon 2026</w:t>
+      </w:r>
+    </w:p>
+    <w:p>
+      <w:pPr>
+        <w:pStyle w:val="ListParagraph"/>
+        <w:numPr>
+          <w:ilvl w:val="0"/>
+          <w:numId w:val="2"/>
+        </w:numPr>
+        <w:spacing w:before="12" w:line="215" w:lineRule="exact"/>
+      </w:pPr>
+      <w:r>
+        <w:rPr>
+          <w:rFonts w:ascii="Times New Roman" w:cs="Times New Roman" w:eastAsia="Times New Roman" w:hAnsi="Times New Roman"/>
+          <w:b/>
+          <w:bCs/>
+          <w:sz w:val="18"/>
+          <w:szCs w:val="18"/>
+        </w:rPr>
+        <w:t xml:space="preserve">Graduate Lead</w:t>
+      </w:r>
+      <w:r>
+        <w:rPr>
+          <w:rFonts w:ascii="Times New Roman" w:cs="Times New Roman" w:eastAsia="Times New Roman" w:hAnsi="Times New Roman"/>
+          <w:sz w:val="18"/>
+          <w:szCs w:val="18"/>
+        </w:rPr>
+        <w:t xml:space="preserve">, Columbia Quantum Algorithms Reading Group (Sep 2025–Jun 2026): ran weekly sessions covering all 33 chapters of Andrew Childs' quantum algorithms lecture notes, each with simulation checks.</w:t>
+      </w:r>
+    </w:p>
+    <w:p>
+      <w:pPr>
+        <w:pBdr>
+          <w:bottom w:val="single" w:color="000000" w:sz="6" w:space="1"/>
+        </w:pBdr>
+        <w:spacing w:after="16" w:before="100" w:line="215" w:lineRule="exact"/>
+      </w:pPr>
+      <w:r>
+        <w:rPr>
+          <w:rFonts w:ascii="Times New Roman" w:cs="Times New Roman" w:eastAsia="Times New Roman" w:hAnsi="Times New Roman"/>
+          <w:b/>
+          <w:bCs/>
+          <w:spacing w:val="16"/>
+          <w:sz w:val="17"/>
+          <w:szCs w:val="17"/>
+        </w:rPr>
         <w:t xml:space="preserve">SKILLS</w:t>
       </w:r>
     </w:p>
@@ -1455,7 +1475,7 @@
           <w:sz w:val="18"/>
           <w:szCs w:val="18"/>
         </w:rPr>
-        <w:t xml:space="preserve">Qiskit, Cirq, PennyLane, CUDA-Q · Hamiltonian simulation, phase estimation, amplitude amplification and estimation, QSVT and block encoding, LCU · surface codes, MWPM and Union-Find decoding · VQE, QAOA · noise modeling and transpilation</w:t>
+        <w:t xml:space="preserve">Qiskit and Qiskit Runtime, CUDA-Q, Stim, PyMatching, QuTiP · Hamiltonian simulation, phase estimation, amplitude amplification and estimation, QSVT and block encoding, LCU · surface codes, MWPM and Union-Find decoding · VQE, QAOA · randomized benchmarking, tomography, noise modeling, transpilation</w:t>
       </w:r>
     </w:p>
     <w:p>

</xml_diff>

<commit_message>
Compress the Q-Search entry to two single-line bullets
Drop the GPT/Gemini split, abbreviate the hidden subgroup problem to
HSP as the site already does, and demote the negative-result index from
the subject of its own clause to a trailing one, keeping the 1,200+
baselines and 720+ theorem modules as the numbers that carry.

Both bullets now sit on one line each. The page drops from 99.3% to
96.3% of a page, which is the first real slack the layout has had.

Co-Authored-By: Claude Opus 5 <noreply@anthropic.com>
Claude-Session: https://claude.ai/code/session_01EbsTbSDgvxSSfAYTVqmk9g
</commit_message>
<xml_diff>
--- a/resume/jaspersands_resume.docx
+++ b/resume/jaspersands_resume.docx
@@ -615,7 +615,7 @@
           <w:sz w:val="18"/>
           <w:szCs w:val="18"/>
         </w:rPr>
-        <w:t xml:space="preserve">Automated search for structural quantum advantage on non-abelian hidden subgroup, dihedral coset, and linear code equivalence problems, pairing GPT theoretical reasoning with Gemini agentic engineering.</w:t>
+        <w:t xml:space="preserve">Automated search for structural quantum advantage on non-abelian HSP, dihedral coset, and linear code equivalence problems.</w:t>
       </w:r>
     </w:p>
     <w:p>
@@ -633,7 +633,7 @@
           <w:sz w:val="18"/>
           <w:szCs w:val="18"/>
         </w:rPr>
-        <w:t xml:space="preserve">Formal proof gates test every proposed mechanism against 1,200+ classical baselines; 800+ negative results are permanently indexed across 720+ theorem modules.</w:t>
+        <w:t xml:space="preserve">Formal proof gates test each mechanism against 1,200+ classical baselines across 720+ theorem modules, indexing negative results.</w:t>
       </w:r>
     </w:p>
     <w:p>

</xml_diff>

<commit_message>
Drop Bugcrowd and the CV lab, spend the room on bigger type
Both were the weakest entries left: Bugcrowd is a 2020 internship from
before undergrad, and the CV lab was already compressed into half of a
shared "Also" line. Removing the lab orphaned that line across two rows,
so it is trimmed back to one.

The freed space goes into readability rather than white space: body type
from 9.15pt to 9.4pt, section headings and the contact line up to match,
and side margins widened from 0.55in to a standard 0.5in so the wider
column absorbs the larger glyphs. The .docx follows at 9.5pt, since
Word measures in half-points and cannot express 9.4.

Both formats land at 98.2% of one page.

Co-Authored-By: Claude Opus 5 <noreply@anthropic.com>
Claude-Session: https://claude.ai/code/session_01EbsTbSDgvxSSfAYTVqmk9g
</commit_message>
<xml_diff>
--- a/resume/jaspersands_resume.docx
+++ b/resume/jaspersands_resume.docx
@@ -27,22 +27,22 @@
       <w:r>
         <w:rPr>
           <w:rFonts w:ascii="Times New Roman" w:cs="Times New Roman" w:eastAsia="Times New Roman" w:hAnsi="Times New Roman"/>
-          <w:sz w:val="16"/>
-          <w:szCs w:val="16"/>
+          <w:sz w:val="17"/>
+          <w:szCs w:val="17"/>
         </w:rPr>
         <w:t xml:space="preserve">Palo Alto, CA | (650) 924-8429 | jaspersands02@gmail.com | js6908@columbia.edu | jaspersands.com | github.com/Jaspersands | linkedin.com/in/jaspersands</w:t>
       </w:r>
     </w:p>
     <w:p>
       <w:pPr>
-        <w:spacing w:before="60" w:line="215" w:lineRule="exact"/>
+        <w:spacing w:before="60" w:line="221" w:lineRule="exact"/>
         <w:jc w:val="center"/>
       </w:pPr>
       <w:r>
         <w:rPr>
           <w:rFonts w:ascii="Times New Roman" w:cs="Times New Roman" w:eastAsia="Times New Roman" w:hAnsi="Times New Roman"/>
-          <w:sz w:val="18"/>
-          <w:szCs w:val="18"/>
+          <w:sz w:val="19"/>
+          <w:szCs w:val="19"/>
         </w:rPr>
         <w:t xml:space="preserve">Quantum algorithms, error correction, and machine learning for qubit control. MS in computer science at Columbia. Thesis at Diraq and UNSW Sydney on automating silicon spin qubit measurement.</w:t>
       </w:r>
@@ -52,7 +52,7 @@
         <w:pBdr>
           <w:bottom w:val="single" w:color="000000" w:sz="6" w:space="1"/>
         </w:pBdr>
-        <w:spacing w:after="16" w:before="100" w:line="215" w:lineRule="exact"/>
+        <w:spacing w:after="16" w:before="100" w:line="221" w:lineRule="exact"/>
       </w:pPr>
       <w:r>
         <w:rPr>
@@ -60,50 +60,50 @@
           <w:b/>
           <w:bCs/>
           <w:spacing w:val="16"/>
-          <w:sz w:val="17"/>
-          <w:szCs w:val="17"/>
-        </w:rPr>
-        <w:t xml:space="preserve">EDUCATION</w:t>
-      </w:r>
-    </w:p>
-    <w:p>
-      <w:pPr>
-        <w:tabs>
-          <w:tab w:val="right" w:pos="10656"/>
-        </w:tabs>
-        <w:spacing w:before="42" w:line="215" w:lineRule="exact"/>
-      </w:pPr>
-      <w:r>
-        <w:rPr>
-          <w:rFonts w:ascii="Times New Roman" w:cs="Times New Roman" w:eastAsia="Times New Roman" w:hAnsi="Times New Roman"/>
-          <w:b/>
-          <w:bCs/>
           <w:sz w:val="18"/>
           <w:szCs w:val="18"/>
         </w:rPr>
+        <w:t xml:space="preserve">EDUCATION</w:t>
+      </w:r>
+    </w:p>
+    <w:p>
+      <w:pPr>
+        <w:tabs>
+          <w:tab w:val="right" w:pos="10800"/>
+        </w:tabs>
+        <w:spacing w:before="42" w:line="221" w:lineRule="exact"/>
+      </w:pPr>
+      <w:r>
+        <w:rPr>
+          <w:rFonts w:ascii="Times New Roman" w:cs="Times New Roman" w:eastAsia="Times New Roman" w:hAnsi="Times New Roman"/>
+          <w:b/>
+          <w:bCs/>
+          <w:sz w:val="19"/>
+          <w:szCs w:val="19"/>
+        </w:rPr>
         <w:t xml:space="preserve">Columbia University</w:t>
       </w:r>
       <w:r>
         <w:rPr>
           <w:rFonts w:ascii="Times New Roman" w:cs="Times New Roman" w:eastAsia="Times New Roman" w:hAnsi="Times New Roman"/>
-          <w:sz w:val="18"/>
-          <w:szCs w:val="18"/>
+          <w:sz w:val="19"/>
+          <w:szCs w:val="19"/>
         </w:rPr>
         <w:t xml:space="preserve">, MS in Computer Science, Quantum Computing Track</w:t>
       </w:r>
       <w:r>
         <w:rPr>
           <w:rFonts w:ascii="Times New Roman" w:cs="Times New Roman" w:eastAsia="Times New Roman" w:hAnsi="Times New Roman"/>
-          <w:sz w:val="18"/>
-          <w:szCs w:val="18"/>
+          <w:sz w:val="19"/>
+          <w:szCs w:val="19"/>
         </w:rPr>
         <w:t xml:space="preserve"> · </w:t>
       </w:r>
       <w:r>
         <w:rPr>
           <w:rFonts w:ascii="Times New Roman" w:cs="Times New Roman" w:eastAsia="Times New Roman" w:hAnsi="Times New Roman"/>
-          <w:sz w:val="18"/>
-          <w:szCs w:val="18"/>
+          <w:sz w:val="19"/>
+          <w:szCs w:val="19"/>
         </w:rPr>
         <w:t xml:space="preserve">GPA 3.95/4.0</w:t>
       </w:r>
@@ -113,125 +113,125 @@
       <w:r>
         <w:rPr>
           <w:rFonts w:ascii="Times New Roman" w:cs="Times New Roman" w:eastAsia="Times New Roman" w:hAnsi="Times New Roman"/>
-          <w:sz w:val="18"/>
-          <w:szCs w:val="18"/>
+          <w:sz w:val="19"/>
+          <w:szCs w:val="19"/>
         </w:rPr>
         <w:t xml:space="preserve">Sep 2025 – May 2027</w:t>
       </w:r>
     </w:p>
     <w:p>
       <w:pPr>
-        <w:spacing w:before="6" w:line="215" w:lineRule="exact"/>
-      </w:pPr>
-      <w:r>
-        <w:rPr>
-          <w:rFonts w:ascii="Times New Roman" w:cs="Times New Roman" w:eastAsia="Times New Roman" w:hAnsi="Times New Roman"/>
-          <w:b/>
-          <w:bCs/>
-          <w:sz w:val="18"/>
-          <w:szCs w:val="18"/>
+        <w:spacing w:before="6" w:line="221" w:lineRule="exact"/>
+      </w:pPr>
+      <w:r>
+        <w:rPr>
+          <w:rFonts w:ascii="Times New Roman" w:cs="Times New Roman" w:eastAsia="Times New Roman" w:hAnsi="Times New Roman"/>
+          <w:b/>
+          <w:bCs/>
+          <w:sz w:val="19"/>
+          <w:szCs w:val="19"/>
         </w:rPr>
         <w:t xml:space="preserve">Thesis: </w:t>
       </w:r>
       <w:r>
         <w:rPr>
           <w:rFonts w:ascii="Times New Roman" w:cs="Times New Roman" w:eastAsia="Times New Roman" w:hAnsi="Times New Roman"/>
-          <w:sz w:val="18"/>
-          <w:szCs w:val="18"/>
+          <w:sz w:val="19"/>
+          <w:szCs w:val="19"/>
         </w:rPr>
         <w:t xml:space="preserve">automating silicon spin qubit measurement with machine learning. Diraq and UNSW Sydney, Sep 2026 – May 2027, co-supervised by Dr. Nard Dumoulin Stuyck and Dr. Henry Yuen.</w:t>
       </w:r>
     </w:p>
     <w:p>
       <w:pPr>
-        <w:spacing w:before="6" w:line="215" w:lineRule="exact"/>
-      </w:pPr>
-      <w:r>
-        <w:rPr>
-          <w:rFonts w:ascii="Times New Roman" w:cs="Times New Roman" w:eastAsia="Times New Roman" w:hAnsi="Times New Roman"/>
-          <w:b/>
-          <w:bCs/>
-          <w:sz w:val="18"/>
-          <w:szCs w:val="18"/>
+        <w:spacing w:before="6" w:line="221" w:lineRule="exact"/>
+      </w:pPr>
+      <w:r>
+        <w:rPr>
+          <w:rFonts w:ascii="Times New Roman" w:cs="Times New Roman" w:eastAsia="Times New Roman" w:hAnsi="Times New Roman"/>
+          <w:b/>
+          <w:bCs/>
+          <w:sz w:val="19"/>
+          <w:szCs w:val="19"/>
         </w:rPr>
         <w:t xml:space="preserve">Coursework: </w:t>
       </w:r>
       <w:r>
         <w:rPr>
           <w:rFonts w:ascii="Times New Roman" w:cs="Times New Roman" w:eastAsia="Times New Roman" w:hAnsi="Times New Roman"/>
-          <w:sz w:val="18"/>
-          <w:szCs w:val="18"/>
+          <w:sz w:val="19"/>
+          <w:szCs w:val="19"/>
         </w:rPr>
         <w:t xml:space="preserve">Quantum Error Correction</w:t>
       </w:r>
       <w:r>
         <w:rPr>
           <w:rFonts w:ascii="Times New Roman" w:cs="Times New Roman" w:eastAsia="Times New Roman" w:hAnsi="Times New Roman"/>
-          <w:sz w:val="18"/>
-          <w:szCs w:val="18"/>
+          <w:sz w:val="19"/>
+          <w:szCs w:val="19"/>
         </w:rPr>
         <w:t xml:space="preserve"> · </w:t>
       </w:r>
       <w:r>
         <w:rPr>
           <w:rFonts w:ascii="Times New Roman" w:cs="Times New Roman" w:eastAsia="Times New Roman" w:hAnsi="Times New Roman"/>
-          <w:sz w:val="18"/>
-          <w:szCs w:val="18"/>
+          <w:sz w:val="19"/>
+          <w:szCs w:val="19"/>
         </w:rPr>
         <w:t xml:space="preserve">Quantum Engineering</w:t>
       </w:r>
       <w:r>
         <w:rPr>
           <w:rFonts w:ascii="Times New Roman" w:cs="Times New Roman" w:eastAsia="Times New Roman" w:hAnsi="Times New Roman"/>
-          <w:sz w:val="18"/>
-          <w:szCs w:val="18"/>
+          <w:sz w:val="19"/>
+          <w:szCs w:val="19"/>
         </w:rPr>
         <w:t xml:space="preserve"> · </w:t>
       </w:r>
       <w:r>
         <w:rPr>
           <w:rFonts w:ascii="Times New Roman" w:cs="Times New Roman" w:eastAsia="Times New Roman" w:hAnsi="Times New Roman"/>
-          <w:sz w:val="18"/>
-          <w:szCs w:val="18"/>
+          <w:sz w:val="19"/>
+          <w:szCs w:val="19"/>
         </w:rPr>
         <w:t xml:space="preserve">Quantum Simulation &amp; Computing Lab</w:t>
       </w:r>
       <w:r>
         <w:rPr>
           <w:rFonts w:ascii="Times New Roman" w:cs="Times New Roman" w:eastAsia="Times New Roman" w:hAnsi="Times New Roman"/>
-          <w:sz w:val="18"/>
-          <w:szCs w:val="18"/>
+          <w:sz w:val="19"/>
+          <w:szCs w:val="19"/>
         </w:rPr>
         <w:t xml:space="preserve"> · </w:t>
       </w:r>
       <w:r>
         <w:rPr>
           <w:rFonts w:ascii="Times New Roman" w:cs="Times New Roman" w:eastAsia="Times New Roman" w:hAnsi="Times New Roman"/>
-          <w:sz w:val="18"/>
-          <w:szCs w:val="18"/>
+          <w:sz w:val="19"/>
+          <w:szCs w:val="19"/>
         </w:rPr>
         <w:t xml:space="preserve">Quantum Optimization &amp; ML.</w:t>
       </w:r>
     </w:p>
     <w:p>
       <w:pPr>
-        <w:spacing w:before="6" w:line="215" w:lineRule="exact"/>
-      </w:pPr>
-      <w:r>
-        <w:rPr>
-          <w:rFonts w:ascii="Times New Roman" w:cs="Times New Roman" w:eastAsia="Times New Roman" w:hAnsi="Times New Roman"/>
-          <w:b/>
-          <w:bCs/>
-          <w:sz w:val="18"/>
-          <w:szCs w:val="18"/>
+        <w:spacing w:before="6" w:line="221" w:lineRule="exact"/>
+      </w:pPr>
+      <w:r>
+        <w:rPr>
+          <w:rFonts w:ascii="Times New Roman" w:cs="Times New Roman" w:eastAsia="Times New Roman" w:hAnsi="Times New Roman"/>
+          <w:b/>
+          <w:bCs/>
+          <w:sz w:val="19"/>
+          <w:szCs w:val="19"/>
         </w:rPr>
         <w:t xml:space="preserve">TA: </w:t>
       </w:r>
       <w:r>
         <w:rPr>
           <w:rFonts w:ascii="Times New Roman" w:cs="Times New Roman" w:eastAsia="Times New Roman" w:hAnsi="Times New Roman"/>
-          <w:sz w:val="18"/>
-          <w:szCs w:val="18"/>
+          <w:sz w:val="19"/>
+          <w:szCs w:val="19"/>
         </w:rPr>
         <w:t xml:space="preserve">Introduction to Quantum Computing.</w:t>
       </w:r>
@@ -239,41 +239,41 @@
     <w:p>
       <w:pPr>
         <w:tabs>
-          <w:tab w:val="right" w:pos="10656"/>
+          <w:tab w:val="right" w:pos="10800"/>
         </w:tabs>
-        <w:spacing w:before="54" w:line="215" w:lineRule="exact"/>
-      </w:pPr>
-      <w:r>
-        <w:rPr>
-          <w:rFonts w:ascii="Times New Roman" w:cs="Times New Roman" w:eastAsia="Times New Roman" w:hAnsi="Times New Roman"/>
-          <w:b/>
-          <w:bCs/>
-          <w:sz w:val="18"/>
-          <w:szCs w:val="18"/>
+        <w:spacing w:before="54" w:line="221" w:lineRule="exact"/>
+      </w:pPr>
+      <w:r>
+        <w:rPr>
+          <w:rFonts w:ascii="Times New Roman" w:cs="Times New Roman" w:eastAsia="Times New Roman" w:hAnsi="Times New Roman"/>
+          <w:b/>
+          <w:bCs/>
+          <w:sz w:val="19"/>
+          <w:szCs w:val="19"/>
         </w:rPr>
         <w:t xml:space="preserve">Washington University in St. Louis</w:t>
       </w:r>
       <w:r>
         <w:rPr>
           <w:rFonts w:ascii="Times New Roman" w:cs="Times New Roman" w:eastAsia="Times New Roman" w:hAnsi="Times New Roman"/>
-          <w:sz w:val="18"/>
-          <w:szCs w:val="18"/>
+          <w:sz w:val="19"/>
+          <w:szCs w:val="19"/>
         </w:rPr>
         <w:t xml:space="preserve">, BS in Computer Science and Economics</w:t>
       </w:r>
       <w:r>
         <w:rPr>
           <w:rFonts w:ascii="Times New Roman" w:cs="Times New Roman" w:eastAsia="Times New Roman" w:hAnsi="Times New Roman"/>
-          <w:sz w:val="18"/>
-          <w:szCs w:val="18"/>
+          <w:sz w:val="19"/>
+          <w:szCs w:val="19"/>
         </w:rPr>
         <w:t xml:space="preserve"> · </w:t>
       </w:r>
       <w:r>
         <w:rPr>
           <w:rFonts w:ascii="Times New Roman" w:cs="Times New Roman" w:eastAsia="Times New Roman" w:hAnsi="Times New Roman"/>
-          <w:sz w:val="18"/>
-          <w:szCs w:val="18"/>
+          <w:sz w:val="19"/>
+          <w:szCs w:val="19"/>
         </w:rPr>
         <w:t xml:space="preserve">GPA 3.81/4.0</w:t>
       </w:r>
@@ -283,63 +283,63 @@
       <w:r>
         <w:rPr>
           <w:rFonts w:ascii="Times New Roman" w:cs="Times New Roman" w:eastAsia="Times New Roman" w:hAnsi="Times New Roman"/>
-          <w:sz w:val="18"/>
-          <w:szCs w:val="18"/>
+          <w:sz w:val="19"/>
+          <w:szCs w:val="19"/>
         </w:rPr>
         <w:t xml:space="preserve">Aug 2021 – May 2025</w:t>
       </w:r>
     </w:p>
     <w:p>
       <w:pPr>
-        <w:spacing w:before="6" w:line="215" w:lineRule="exact"/>
-      </w:pPr>
-      <w:r>
-        <w:rPr>
-          <w:rFonts w:ascii="Times New Roman" w:cs="Times New Roman" w:eastAsia="Times New Roman" w:hAnsi="Times New Roman"/>
-          <w:b/>
-          <w:bCs/>
-          <w:sz w:val="18"/>
-          <w:szCs w:val="18"/>
+        <w:spacing w:before="6" w:line="221" w:lineRule="exact"/>
+      </w:pPr>
+      <w:r>
+        <w:rPr>
+          <w:rFonts w:ascii="Times New Roman" w:cs="Times New Roman" w:eastAsia="Times New Roman" w:hAnsi="Times New Roman"/>
+          <w:b/>
+          <w:bCs/>
+          <w:sz w:val="19"/>
+          <w:szCs w:val="19"/>
         </w:rPr>
         <w:t xml:space="preserve">Coursework: </w:t>
       </w:r>
       <w:r>
         <w:rPr>
           <w:rFonts w:ascii="Times New Roman" w:cs="Times New Roman" w:eastAsia="Times New Roman" w:hAnsi="Times New Roman"/>
-          <w:sz w:val="18"/>
-          <w:szCs w:val="18"/>
+          <w:sz w:val="19"/>
+          <w:szCs w:val="19"/>
         </w:rPr>
         <w:t xml:space="preserve">Machine Learning</w:t>
       </w:r>
       <w:r>
         <w:rPr>
           <w:rFonts w:ascii="Times New Roman" w:cs="Times New Roman" w:eastAsia="Times New Roman" w:hAnsi="Times New Roman"/>
-          <w:sz w:val="18"/>
-          <w:szCs w:val="18"/>
+          <w:sz w:val="19"/>
+          <w:szCs w:val="19"/>
         </w:rPr>
         <w:t xml:space="preserve"> · </w:t>
       </w:r>
       <w:r>
         <w:rPr>
           <w:rFonts w:ascii="Times New Roman" w:cs="Times New Roman" w:eastAsia="Times New Roman" w:hAnsi="Times New Roman"/>
-          <w:sz w:val="18"/>
-          <w:szCs w:val="18"/>
+          <w:sz w:val="19"/>
+          <w:szCs w:val="19"/>
         </w:rPr>
         <w:t xml:space="preserve">Analysis of Algorithms</w:t>
       </w:r>
       <w:r>
         <w:rPr>
           <w:rFonts w:ascii="Times New Roman" w:cs="Times New Roman" w:eastAsia="Times New Roman" w:hAnsi="Times New Roman"/>
-          <w:sz w:val="18"/>
-          <w:szCs w:val="18"/>
+          <w:sz w:val="19"/>
+          <w:szCs w:val="19"/>
         </w:rPr>
         <w:t xml:space="preserve"> · </w:t>
       </w:r>
       <w:r>
         <w:rPr>
           <w:rFonts w:ascii="Times New Roman" w:cs="Times New Roman" w:eastAsia="Times New Roman" w:hAnsi="Times New Roman"/>
-          <w:sz w:val="18"/>
-          <w:szCs w:val="18"/>
+          <w:sz w:val="19"/>
+          <w:szCs w:val="19"/>
         </w:rPr>
         <w:t xml:space="preserve">Computer Security. </w:t>
       </w:r>
@@ -348,16 +348,16 @@
           <w:rFonts w:ascii="Times New Roman" w:cs="Times New Roman" w:eastAsia="Times New Roman" w:hAnsi="Times New Roman"/>
           <w:b/>
           <w:bCs/>
-          <w:sz w:val="18"/>
-          <w:szCs w:val="18"/>
+          <w:sz w:val="19"/>
+          <w:szCs w:val="19"/>
         </w:rPr>
         <w:t xml:space="preserve">TA: </w:t>
       </w:r>
       <w:r>
         <w:rPr>
           <w:rFonts w:ascii="Times New Roman" w:cs="Times New Roman" w:eastAsia="Times New Roman" w:hAnsi="Times New Roman"/>
-          <w:sz w:val="18"/>
-          <w:szCs w:val="18"/>
+          <w:sz w:val="19"/>
+          <w:szCs w:val="19"/>
         </w:rPr>
         <w:t xml:space="preserve">Malware Analysis; Parallel Programming.</w:t>
       </w:r>
@@ -367,7 +367,7 @@
         <w:pBdr>
           <w:bottom w:val="single" w:color="000000" w:sz="6" w:space="1"/>
         </w:pBdr>
-        <w:spacing w:after="16" w:before="100" w:line="215" w:lineRule="exact"/>
+        <w:spacing w:after="16" w:before="100" w:line="221" w:lineRule="exact"/>
       </w:pPr>
       <w:r>
         <w:rPr>
@@ -375,42 +375,42 @@
           <w:b/>
           <w:bCs/>
           <w:spacing w:val="16"/>
-          <w:sz w:val="17"/>
-          <w:szCs w:val="17"/>
-        </w:rPr>
-        <w:t xml:space="preserve">SELECTED PROJECTS</w:t>
-      </w:r>
-    </w:p>
-    <w:p>
-      <w:pPr>
-        <w:tabs>
-          <w:tab w:val="right" w:pos="10656"/>
-        </w:tabs>
-        <w:spacing w:before="42" w:line="215" w:lineRule="exact"/>
-      </w:pPr>
-      <w:r>
-        <w:rPr>
-          <w:rFonts w:ascii="Times New Roman" w:cs="Times New Roman" w:eastAsia="Times New Roman" w:hAnsi="Times New Roman"/>
-          <w:b/>
-          <w:bCs/>
           <w:sz w:val="18"/>
           <w:szCs w:val="18"/>
         </w:rPr>
+        <w:t xml:space="preserve">SELECTED PROJECTS</w:t>
+      </w:r>
+    </w:p>
+    <w:p>
+      <w:pPr>
+        <w:tabs>
+          <w:tab w:val="right" w:pos="10800"/>
+        </w:tabs>
+        <w:spacing w:before="42" w:line="221" w:lineRule="exact"/>
+      </w:pPr>
+      <w:r>
+        <w:rPr>
+          <w:rFonts w:ascii="Times New Roman" w:cs="Times New Roman" w:eastAsia="Times New Roman" w:hAnsi="Times New Roman"/>
+          <w:b/>
+          <w:bCs/>
+          <w:sz w:val="19"/>
+          <w:szCs w:val="19"/>
+        </w:rPr>
         <w:t xml:space="preserve">WhatTheDuck</w:t>
       </w:r>
       <w:r>
         <w:rPr>
           <w:rFonts w:ascii="Times New Roman" w:cs="Times New Roman" w:eastAsia="Times New Roman" w:hAnsi="Times New Roman"/>
-          <w:sz w:val="18"/>
-          <w:szCs w:val="18"/>
+          <w:sz w:val="19"/>
+          <w:szCs w:val="19"/>
         </w:rPr>
         <w:t xml:space="preserve">: quantum amplitude estimation for financial Value at Risk</w:t>
       </w:r>
       <w:r>
         <w:rPr>
           <w:rFonts w:ascii="Times New Roman" w:cs="Times New Roman" w:eastAsia="Times New Roman" w:hAnsi="Times New Roman"/>
-          <w:sz w:val="18"/>
-          <w:szCs w:val="18"/>
+          <w:sz w:val="19"/>
+          <w:szCs w:val="19"/>
         </w:rPr>
         <w:t xml:space="preserve"> · </w:t>
       </w:r>
@@ -419,8 +419,8 @@
           <w:rFonts w:ascii="Times New Roman" w:cs="Times New Roman" w:eastAsia="Times New Roman" w:hAnsi="Times New Roman"/>
           <w:i/>
           <w:iCs/>
-          <w:sz w:val="18"/>
-          <w:szCs w:val="18"/>
+          <w:sz w:val="19"/>
+          <w:szCs w:val="19"/>
         </w:rPr>
         <w:t xml:space="preserve">CUDA-Q, C++</w:t>
       </w:r>
@@ -430,8 +430,8 @@
       <w:r>
         <w:rPr>
           <w:rFonts w:ascii="Times New Roman" w:cs="Times New Roman" w:eastAsia="Times New Roman" w:hAnsi="Times New Roman"/>
-          <w:sz w:val="18"/>
-          <w:szCs w:val="18"/>
+          <w:sz w:val="19"/>
+          <w:szCs w:val="19"/>
         </w:rPr>
         <w:t xml:space="preserve">Overall Winner, iQuHACK 2026</w:t>
       </w:r>
@@ -443,13 +443,13 @@
           <w:ilvl w:val="0"/>
           <w:numId w:val="2"/>
         </w:numPr>
-        <w:spacing w:before="12" w:line="215" w:lineRule="exact"/>
-      </w:pPr>
-      <w:r>
-        <w:rPr>
-          <w:rFonts w:ascii="Times New Roman" w:cs="Times New Roman" w:eastAsia="Times New Roman" w:hAnsi="Times New Roman"/>
-          <w:sz w:val="18"/>
-          <w:szCs w:val="18"/>
+        <w:spacing w:before="12" w:line="221" w:lineRule="exact"/>
+      </w:pPr>
+      <w:r>
+        <w:rPr>
+          <w:rFonts w:ascii="Times New Roman" w:cs="Times New Roman" w:eastAsia="Times New Roman" w:hAnsi="Times New Roman"/>
+          <w:sz w:val="19"/>
+          <w:szCs w:val="19"/>
         </w:rPr>
         <w:t xml:space="preserve">Wrote the GPU-accelerated state preparation, threshold oracle, and bisection search driving Iterative Quantum Amplitude Estimation.</w:t>
       </w:r>
@@ -461,13 +461,13 @@
           <w:ilvl w:val="0"/>
           <w:numId w:val="2"/>
         </w:numPr>
-        <w:spacing w:before="12" w:line="215" w:lineRule="exact"/>
-      </w:pPr>
-      <w:r>
-        <w:rPr>
-          <w:rFonts w:ascii="Times New Roman" w:cs="Times New Roman" w:eastAsia="Times New Roman" w:hAnsi="Times New Roman"/>
-          <w:sz w:val="18"/>
-          <w:szCs w:val="18"/>
+        <w:spacing w:before="12" w:line="221" w:lineRule="exact"/>
+      </w:pPr>
+      <w:r>
+        <w:rPr>
+          <w:rFonts w:ascii="Times New Roman" w:cs="Times New Roman" w:eastAsia="Times New Roman" w:hAnsi="Times New Roman"/>
+          <w:sz w:val="19"/>
+          <w:szCs w:val="19"/>
         </w:rPr>
         <w:t xml:space="preserve">Measured query scaling matched the O(1/ε) bound against an O(1/ε²) quasi-Monte Carlo classical baseline.</w:t>
       </w:r>
@@ -475,33 +475,33 @@
     <w:p>
       <w:pPr>
         <w:tabs>
-          <w:tab w:val="right" w:pos="10656"/>
+          <w:tab w:val="right" w:pos="10800"/>
         </w:tabs>
-        <w:spacing w:before="54" w:line="215" w:lineRule="exact"/>
-      </w:pPr>
-      <w:r>
-        <w:rPr>
-          <w:rFonts w:ascii="Times New Roman" w:cs="Times New Roman" w:eastAsia="Times New Roman" w:hAnsi="Times New Roman"/>
-          <w:b/>
-          <w:bCs/>
-          <w:sz w:val="18"/>
-          <w:szCs w:val="18"/>
+        <w:spacing w:before="54" w:line="221" w:lineRule="exact"/>
+      </w:pPr>
+      <w:r>
+        <w:rPr>
+          <w:rFonts w:ascii="Times New Roman" w:cs="Times New Roman" w:eastAsia="Times New Roman" w:hAnsi="Times New Roman"/>
+          <w:b/>
+          <w:bCs/>
+          <w:sz w:val="19"/>
+          <w:szCs w:val="19"/>
         </w:rPr>
         <w:t xml:space="preserve">WASM QEC Simulator</w:t>
       </w:r>
       <w:r>
         <w:rPr>
           <w:rFonts w:ascii="Times New Roman" w:cs="Times New Roman" w:eastAsia="Times New Roman" w:hAnsi="Times New Roman"/>
-          <w:sz w:val="18"/>
-          <w:szCs w:val="18"/>
+          <w:sz w:val="19"/>
+          <w:szCs w:val="19"/>
         </w:rPr>
         <w:t xml:space="preserve">: surface-code decoding in the browser</w:t>
       </w:r>
       <w:r>
         <w:rPr>
           <w:rFonts w:ascii="Times New Roman" w:cs="Times New Roman" w:eastAsia="Times New Roman" w:hAnsi="Times New Roman"/>
-          <w:sz w:val="18"/>
-          <w:szCs w:val="18"/>
+          <w:sz w:val="19"/>
+          <w:szCs w:val="19"/>
         </w:rPr>
         <w:t xml:space="preserve"> · </w:t>
       </w:r>
@@ -510,8 +510,8 @@
           <w:rFonts w:ascii="Times New Roman" w:cs="Times New Roman" w:eastAsia="Times New Roman" w:hAnsi="Times New Roman"/>
           <w:i/>
           <w:iCs/>
-          <w:sz w:val="18"/>
-          <w:szCs w:val="18"/>
+          <w:sz w:val="19"/>
+          <w:szCs w:val="19"/>
         </w:rPr>
         <w:t xml:space="preserve">Rust, WebAssembly</w:t>
       </w:r>
@@ -521,8 +521,8 @@
       <w:r>
         <w:rPr>
           <w:rFonts w:ascii="Times New Roman" w:cs="Times New Roman" w:eastAsia="Times New Roman" w:hAnsi="Times New Roman"/>
-          <w:sz w:val="18"/>
-          <w:szCs w:val="18"/>
+          <w:sz w:val="19"/>
+          <w:szCs w:val="19"/>
         </w:rPr>
         <w:t xml:space="preserve">qcompiler.jaspersands.com</w:t>
       </w:r>
@@ -534,13 +534,13 @@
           <w:ilvl w:val="0"/>
           <w:numId w:val="2"/>
         </w:numPr>
-        <w:spacing w:before="12" w:line="215" w:lineRule="exact"/>
-      </w:pPr>
-      <w:r>
-        <w:rPr>
-          <w:rFonts w:ascii="Times New Roman" w:cs="Times New Roman" w:eastAsia="Times New Roman" w:hAnsi="Times New Roman"/>
-          <w:sz w:val="18"/>
-          <w:szCs w:val="18"/>
+        <w:spacing w:before="12" w:line="221" w:lineRule="exact"/>
+      </w:pPr>
+      <w:r>
+        <w:rPr>
+          <w:rFonts w:ascii="Times New Roman" w:cs="Times New Roman" w:eastAsia="Times New Roman" w:hAnsi="Times New Roman"/>
+          <w:sz w:val="19"/>
+          <w:szCs w:val="19"/>
         </w:rPr>
         <w:t xml:space="preserve">Symplectic stabilizer simulator for rotated and XZZX surface codes, with exact MWPM and Union-Find decoding running client-side.</w:t>
       </w:r>
@@ -552,13 +552,13 @@
           <w:ilvl w:val="0"/>
           <w:numId w:val="2"/>
         </w:numPr>
-        <w:spacing w:before="12" w:line="215" w:lineRule="exact"/>
-      </w:pPr>
-      <w:r>
-        <w:rPr>
-          <w:rFonts w:ascii="Times New Roman" w:cs="Times New Roman" w:eastAsia="Times New Roman" w:hAnsi="Times New Roman"/>
-          <w:sz w:val="18"/>
-          <w:szCs w:val="18"/>
+        <w:spacing w:before="12" w:line="221" w:lineRule="exact"/>
+      </w:pPr>
+      <w:r>
+        <w:rPr>
+          <w:rFonts w:ascii="Times New Roman" w:cs="Times New Roman" w:eastAsia="Times New Roman" w:hAnsi="Times New Roman"/>
+          <w:sz w:val="19"/>
+          <w:szCs w:val="19"/>
         </w:rPr>
         <w:t xml:space="preserve">Finite-size scaling over d = 3, 5, 7 at 20k shots/point puts the phenomenological threshold at 3.2%.</w:t>
       </w:r>
@@ -566,25 +566,25 @@
     <w:p>
       <w:pPr>
         <w:tabs>
-          <w:tab w:val="right" w:pos="10656"/>
+          <w:tab w:val="right" w:pos="10800"/>
         </w:tabs>
-        <w:spacing w:before="54" w:line="215" w:lineRule="exact"/>
-      </w:pPr>
-      <w:r>
-        <w:rPr>
-          <w:rFonts w:ascii="Times New Roman" w:cs="Times New Roman" w:eastAsia="Times New Roman" w:hAnsi="Times New Roman"/>
-          <w:b/>
-          <w:bCs/>
-          <w:sz w:val="18"/>
-          <w:szCs w:val="18"/>
+        <w:spacing w:before="54" w:line="221" w:lineRule="exact"/>
+      </w:pPr>
+      <w:r>
+        <w:rPr>
+          <w:rFonts w:ascii="Times New Roman" w:cs="Times New Roman" w:eastAsia="Times New Roman" w:hAnsi="Times New Roman"/>
+          <w:b/>
+          <w:bCs/>
+          <w:sz w:val="19"/>
+          <w:szCs w:val="19"/>
         </w:rPr>
         <w:t xml:space="preserve">Q-Search</w:t>
       </w:r>
       <w:r>
         <w:rPr>
           <w:rFonts w:ascii="Times New Roman" w:cs="Times New Roman" w:eastAsia="Times New Roman" w:hAnsi="Times New Roman"/>
-          <w:sz w:val="18"/>
-          <w:szCs w:val="18"/>
+          <w:sz w:val="19"/>
+          <w:szCs w:val="19"/>
         </w:rPr>
         <w:t xml:space="preserve">: proof-gated quantum algorithm research and verification engine</w:t>
       </w:r>
@@ -594,8 +594,8 @@
       <w:r>
         <w:rPr>
           <w:rFonts w:ascii="Times New Roman" w:cs="Times New Roman" w:eastAsia="Times New Roman" w:hAnsi="Times New Roman"/>
-          <w:sz w:val="18"/>
-          <w:szCs w:val="18"/>
+          <w:sz w:val="19"/>
+          <w:szCs w:val="19"/>
         </w:rPr>
         <w:t xml:space="preserve">qsearch.jaspersands.com</w:t>
       </w:r>
@@ -607,13 +607,13 @@
           <w:ilvl w:val="0"/>
           <w:numId w:val="2"/>
         </w:numPr>
-        <w:spacing w:before="12" w:line="215" w:lineRule="exact"/>
-      </w:pPr>
-      <w:r>
-        <w:rPr>
-          <w:rFonts w:ascii="Times New Roman" w:cs="Times New Roman" w:eastAsia="Times New Roman" w:hAnsi="Times New Roman"/>
-          <w:sz w:val="18"/>
-          <w:szCs w:val="18"/>
+        <w:spacing w:before="12" w:line="221" w:lineRule="exact"/>
+      </w:pPr>
+      <w:r>
+        <w:rPr>
+          <w:rFonts w:ascii="Times New Roman" w:cs="Times New Roman" w:eastAsia="Times New Roman" w:hAnsi="Times New Roman"/>
+          <w:sz w:val="19"/>
+          <w:szCs w:val="19"/>
         </w:rPr>
         <w:t xml:space="preserve">Automated search for structural quantum advantage on non-abelian HSP, dihedral coset, and linear code equivalence problems.</w:t>
       </w:r>
@@ -625,13 +625,13 @@
           <w:ilvl w:val="0"/>
           <w:numId w:val="2"/>
         </w:numPr>
-        <w:spacing w:before="12" w:line="215" w:lineRule="exact"/>
-      </w:pPr>
-      <w:r>
-        <w:rPr>
-          <w:rFonts w:ascii="Times New Roman" w:cs="Times New Roman" w:eastAsia="Times New Roman" w:hAnsi="Times New Roman"/>
-          <w:sz w:val="18"/>
-          <w:szCs w:val="18"/>
+        <w:spacing w:before="12" w:line="221" w:lineRule="exact"/>
+      </w:pPr>
+      <w:r>
+        <w:rPr>
+          <w:rFonts w:ascii="Times New Roman" w:cs="Times New Roman" w:eastAsia="Times New Roman" w:hAnsi="Times New Roman"/>
+          <w:sz w:val="19"/>
+          <w:szCs w:val="19"/>
         </w:rPr>
         <w:t xml:space="preserve">Formal proof gates test each mechanism against 1,200+ classical baselines across 720+ theorem modules, indexing negative results.</w:t>
       </w:r>
@@ -639,25 +639,25 @@
     <w:p>
       <w:pPr>
         <w:tabs>
-          <w:tab w:val="right" w:pos="10656"/>
+          <w:tab w:val="right" w:pos="10800"/>
         </w:tabs>
-        <w:spacing w:before="54" w:line="215" w:lineRule="exact"/>
-      </w:pPr>
-      <w:r>
-        <w:rPr>
-          <w:rFonts w:ascii="Times New Roman" w:cs="Times New Roman" w:eastAsia="Times New Roman" w:hAnsi="Times New Roman"/>
-          <w:b/>
-          <w:bCs/>
-          <w:sz w:val="18"/>
-          <w:szCs w:val="18"/>
+        <w:spacing w:before="54" w:line="221" w:lineRule="exact"/>
+      </w:pPr>
+      <w:r>
+        <w:rPr>
+          <w:rFonts w:ascii="Times New Roman" w:cs="Times New Roman" w:eastAsia="Times New Roman" w:hAnsi="Times New Roman"/>
+          <w:b/>
+          <w:bCs/>
+          <w:sz w:val="19"/>
+          <w:szCs w:val="19"/>
         </w:rPr>
         <w:t xml:space="preserve">LLM-Based Lossless Text Compression</w:t>
       </w:r>
       <w:r>
         <w:rPr>
           <w:rFonts w:ascii="Times New Roman" w:cs="Times New Roman" w:eastAsia="Times New Roman" w:hAnsi="Times New Roman"/>
-          <w:sz w:val="18"/>
-          <w:szCs w:val="18"/>
+          <w:sz w:val="19"/>
+          <w:szCs w:val="19"/>
         </w:rPr>
         <w:t xml:space="preserve"> · </w:t>
       </w:r>
@@ -666,8 +666,8 @@
           <w:rFonts w:ascii="Times New Roman" w:cs="Times New Roman" w:eastAsia="Times New Roman" w:hAnsi="Times New Roman"/>
           <w:i/>
           <w:iCs/>
-          <w:sz w:val="18"/>
-          <w:szCs w:val="18"/>
+          <w:sz w:val="19"/>
+          <w:szCs w:val="19"/>
         </w:rPr>
         <w:t xml:space="preserve">PyTorch, CUDA</w:t>
       </w:r>
@@ -677,8 +677,8 @@
       <w:r>
         <w:rPr>
           <w:rFonts w:ascii="Times New Roman" w:cs="Times New Roman" w:eastAsia="Times New Roman" w:hAnsi="Times New Roman"/>
-          <w:sz w:val="18"/>
-          <w:szCs w:val="18"/>
+          <w:sz w:val="19"/>
+          <w:szCs w:val="19"/>
         </w:rPr>
         <w:t xml:space="preserve">Systems optimization</w:t>
       </w:r>
@@ -690,13 +690,13 @@
           <w:ilvl w:val="0"/>
           <w:numId w:val="2"/>
         </w:numPr>
-        <w:spacing w:before="12" w:line="215" w:lineRule="exact"/>
-      </w:pPr>
-      <w:r>
-        <w:rPr>
-          <w:rFonts w:ascii="Times New Roman" w:cs="Times New Roman" w:eastAsia="Times New Roman" w:hAnsi="Times New Roman"/>
-          <w:sz w:val="18"/>
-          <w:szCs w:val="18"/>
+        <w:spacing w:before="12" w:line="221" w:lineRule="exact"/>
+      </w:pPr>
+      <w:r>
+        <w:rPr>
+          <w:rFonts w:ascii="Times New Roman" w:cs="Times New Roman" w:eastAsia="Times New Roman" w:hAnsi="Times New Roman"/>
+          <w:sz w:val="19"/>
+          <w:szCs w:val="19"/>
         </w:rPr>
         <w:t xml:space="preserve">Arithmetic coding on autoregressive LLM predictions: 5–16× average and 39× best-case compression, beating zstd and gzip; static KV caching and CUDA graphs for throughput.</w:t>
       </w:r>
@@ -706,7 +706,7 @@
         <w:pBdr>
           <w:bottom w:val="single" w:color="000000" w:sz="6" w:space="1"/>
         </w:pBdr>
-        <w:spacing w:after="16" w:before="100" w:line="215" w:lineRule="exact"/>
+        <w:spacing w:after="16" w:before="100" w:line="221" w:lineRule="exact"/>
       </w:pPr>
       <w:r>
         <w:rPr>
@@ -714,42 +714,42 @@
           <w:b/>
           <w:bCs/>
           <w:spacing w:val="16"/>
-          <w:sz w:val="17"/>
-          <w:szCs w:val="17"/>
-        </w:rPr>
-        <w:t xml:space="preserve">RESEARCH</w:t>
-      </w:r>
-    </w:p>
-    <w:p>
-      <w:pPr>
-        <w:tabs>
-          <w:tab w:val="right" w:pos="10656"/>
-        </w:tabs>
-        <w:spacing w:before="42" w:line="215" w:lineRule="exact"/>
-      </w:pPr>
-      <w:r>
-        <w:rPr>
-          <w:rFonts w:ascii="Times New Roman" w:cs="Times New Roman" w:eastAsia="Times New Roman" w:hAnsi="Times New Roman"/>
-          <w:b/>
-          <w:bCs/>
           <w:sz w:val="18"/>
           <w:szCs w:val="18"/>
         </w:rPr>
+        <w:t xml:space="preserve">RESEARCH</w:t>
+      </w:r>
+    </w:p>
+    <w:p>
+      <w:pPr>
+        <w:tabs>
+          <w:tab w:val="right" w:pos="10800"/>
+        </w:tabs>
+        <w:spacing w:before="42" w:line="221" w:lineRule="exact"/>
+      </w:pPr>
+      <w:r>
+        <w:rPr>
+          <w:rFonts w:ascii="Times New Roman" w:cs="Times New Roman" w:eastAsia="Times New Roman" w:hAnsi="Times New Roman"/>
+          <w:b/>
+          <w:bCs/>
+          <w:sz w:val="19"/>
+          <w:szCs w:val="19"/>
+        </w:rPr>
         <w:t xml:space="preserve">Cidon Systems Research Lab</w:t>
       </w:r>
       <w:r>
         <w:rPr>
           <w:rFonts w:ascii="Times New Roman" w:cs="Times New Roman" w:eastAsia="Times New Roman" w:hAnsi="Times New Roman"/>
-          <w:sz w:val="18"/>
-          <w:szCs w:val="18"/>
+          <w:sz w:val="19"/>
+          <w:szCs w:val="19"/>
         </w:rPr>
         <w:t xml:space="preserve">, Columbia University</w:t>
       </w:r>
       <w:r>
         <w:rPr>
           <w:rFonts w:ascii="Times New Roman" w:cs="Times New Roman" w:eastAsia="Times New Roman" w:hAnsi="Times New Roman"/>
-          <w:sz w:val="18"/>
-          <w:szCs w:val="18"/>
+          <w:sz w:val="19"/>
+          <w:szCs w:val="19"/>
         </w:rPr>
         <w:t xml:space="preserve"> · </w:t>
       </w:r>
@@ -758,8 +758,8 @@
           <w:rFonts w:ascii="Times New Roman" w:cs="Times New Roman" w:eastAsia="Times New Roman" w:hAnsi="Times New Roman"/>
           <w:i/>
           <w:iCs/>
-          <w:sz w:val="18"/>
-          <w:szCs w:val="18"/>
+          <w:sz w:val="19"/>
+          <w:szCs w:val="19"/>
         </w:rPr>
         <w:t xml:space="preserve">Graduate Researcher</w:t>
       </w:r>
@@ -769,8 +769,8 @@
       <w:r>
         <w:rPr>
           <w:rFonts w:ascii="Times New Roman" w:cs="Times New Roman" w:eastAsia="Times New Roman" w:hAnsi="Times New Roman"/>
-          <w:sz w:val="18"/>
-          <w:szCs w:val="18"/>
+          <w:sz w:val="19"/>
+          <w:szCs w:val="19"/>
         </w:rPr>
         <w:t xml:space="preserve">Sep 2025 – Jun 2026</w:t>
       </w:r>
@@ -782,13 +782,13 @@
           <w:ilvl w:val="0"/>
           <w:numId w:val="2"/>
         </w:numPr>
-        <w:spacing w:before="12" w:line="215" w:lineRule="exact"/>
-      </w:pPr>
-      <w:r>
-        <w:rPr>
-          <w:rFonts w:ascii="Times New Roman" w:cs="Times New Roman" w:eastAsia="Times New Roman" w:hAnsi="Times New Roman"/>
-          <w:sz w:val="18"/>
-          <w:szCs w:val="18"/>
+        <w:spacing w:before="12" w:line="221" w:lineRule="exact"/>
+      </w:pPr>
+      <w:r>
+        <w:rPr>
+          <w:rFonts w:ascii="Times New Roman" w:cs="Times New Roman" w:eastAsia="Times New Roman" w:hAnsi="Times New Roman"/>
+          <w:sz w:val="19"/>
+          <w:szCs w:val="19"/>
         </w:rPr>
         <w:t xml:space="preserve">Built phishing and spam detection pipelines with Dr. Asaf Cidon and Barracuda Networks, combining language-model embeddings with production email telemetry and tuning for precision against a fixed false-positive budget.</w:t>
       </w:r>
@@ -796,33 +796,33 @@
     <w:p>
       <w:pPr>
         <w:tabs>
-          <w:tab w:val="right" w:pos="10656"/>
+          <w:tab w:val="right" w:pos="10800"/>
         </w:tabs>
-        <w:spacing w:before="54" w:line="215" w:lineRule="exact"/>
-      </w:pPr>
-      <w:r>
-        <w:rPr>
-          <w:rFonts w:ascii="Times New Roman" w:cs="Times New Roman" w:eastAsia="Times New Roman" w:hAnsi="Times New Roman"/>
-          <w:b/>
-          <w:bCs/>
-          <w:sz w:val="18"/>
-          <w:szCs w:val="18"/>
+        <w:spacing w:before="54" w:line="221" w:lineRule="exact"/>
+      </w:pPr>
+      <w:r>
+        <w:rPr>
+          <w:rFonts w:ascii="Times New Roman" w:cs="Times New Roman" w:eastAsia="Times New Roman" w:hAnsi="Times New Roman"/>
+          <w:b/>
+          <w:bCs/>
+          <w:sz w:val="19"/>
+          <w:szCs w:val="19"/>
         </w:rPr>
         <w:t xml:space="preserve">Complex Resilient Intelligent Systems Lab</w:t>
       </w:r>
       <w:r>
         <w:rPr>
           <w:rFonts w:ascii="Times New Roman" w:cs="Times New Roman" w:eastAsia="Times New Roman" w:hAnsi="Times New Roman"/>
-          <w:sz w:val="18"/>
-          <w:szCs w:val="18"/>
+          <w:sz w:val="19"/>
+          <w:szCs w:val="19"/>
         </w:rPr>
         <w:t xml:space="preserve">, Columbia University</w:t>
       </w:r>
       <w:r>
         <w:rPr>
           <w:rFonts w:ascii="Times New Roman" w:cs="Times New Roman" w:eastAsia="Times New Roman" w:hAnsi="Times New Roman"/>
-          <w:sz w:val="18"/>
-          <w:szCs w:val="18"/>
+          <w:sz w:val="19"/>
+          <w:szCs w:val="19"/>
         </w:rPr>
         <w:t xml:space="preserve"> · </w:t>
       </w:r>
@@ -831,8 +831,8 @@
           <w:rFonts w:ascii="Times New Roman" w:cs="Times New Roman" w:eastAsia="Times New Roman" w:hAnsi="Times New Roman"/>
           <w:i/>
           <w:iCs/>
-          <w:sz w:val="18"/>
-          <w:szCs w:val="18"/>
+          <w:sz w:val="19"/>
+          <w:szCs w:val="19"/>
         </w:rPr>
         <w:t xml:space="preserve">Graduate Researcher</w:t>
       </w:r>
@@ -842,8 +842,8 @@
       <w:r>
         <w:rPr>
           <w:rFonts w:ascii="Times New Roman" w:cs="Times New Roman" w:eastAsia="Times New Roman" w:hAnsi="Times New Roman"/>
-          <w:sz w:val="18"/>
-          <w:szCs w:val="18"/>
+          <w:sz w:val="19"/>
+          <w:szCs w:val="19"/>
         </w:rPr>
         <w:t xml:space="preserve">May – Dec 2025</w:t>
       </w:r>
@@ -855,13 +855,13 @@
           <w:ilvl w:val="0"/>
           <w:numId w:val="2"/>
         </w:numPr>
-        <w:spacing w:before="12" w:line="215" w:lineRule="exact"/>
-      </w:pPr>
-      <w:r>
-        <w:rPr>
-          <w:rFonts w:ascii="Times New Roman" w:cs="Times New Roman" w:eastAsia="Times New Roman" w:hAnsi="Times New Roman"/>
-          <w:sz w:val="18"/>
-          <w:szCs w:val="18"/>
+        <w:spacing w:before="12" w:line="221" w:lineRule="exact"/>
+      </w:pPr>
+      <w:r>
+        <w:rPr>
+          <w:rFonts w:ascii="Times New Roman" w:cs="Times New Roman" w:eastAsia="Times New Roman" w:hAnsi="Times New Roman"/>
+          <w:sz w:val="19"/>
+          <w:szCs w:val="19"/>
         </w:rPr>
         <w:t xml:space="preserve">Reduced hallucination in generative protein modeling under Dr. Venkat Venkatasubramanian by grounding outputs in molecular graph data.</w:t>
       </w:r>
@@ -869,33 +869,33 @@
     <w:p>
       <w:pPr>
         <w:tabs>
-          <w:tab w:val="right" w:pos="10656"/>
+          <w:tab w:val="right" w:pos="10800"/>
         </w:tabs>
-        <w:spacing w:before="54" w:line="215" w:lineRule="exact"/>
-      </w:pPr>
-      <w:r>
-        <w:rPr>
-          <w:rFonts w:ascii="Times New Roman" w:cs="Times New Roman" w:eastAsia="Times New Roman" w:hAnsi="Times New Roman"/>
-          <w:b/>
-          <w:bCs/>
-          <w:sz w:val="18"/>
-          <w:szCs w:val="18"/>
+        <w:spacing w:before="54" w:line="221" w:lineRule="exact"/>
+      </w:pPr>
+      <w:r>
+        <w:rPr>
+          <w:rFonts w:ascii="Times New Roman" w:cs="Times New Roman" w:eastAsia="Times New Roman" w:hAnsi="Times New Roman"/>
+          <w:b/>
+          <w:bCs/>
+          <w:sz w:val="19"/>
+          <w:szCs w:val="19"/>
         </w:rPr>
         <w:t xml:space="preserve">Foster Care Policy Database</w:t>
       </w:r>
       <w:r>
         <w:rPr>
           <w:rFonts w:ascii="Times New Roman" w:cs="Times New Roman" w:eastAsia="Times New Roman" w:hAnsi="Times New Roman"/>
-          <w:sz w:val="18"/>
-          <w:szCs w:val="18"/>
+          <w:sz w:val="19"/>
+          <w:szCs w:val="19"/>
         </w:rPr>
         <w:t xml:space="preserve">, Washington University in St. Louis</w:t>
       </w:r>
       <w:r>
         <w:rPr>
           <w:rFonts w:ascii="Times New Roman" w:cs="Times New Roman" w:eastAsia="Times New Roman" w:hAnsi="Times New Roman"/>
-          <w:sz w:val="18"/>
-          <w:szCs w:val="18"/>
+          <w:sz w:val="19"/>
+          <w:szCs w:val="19"/>
         </w:rPr>
         <w:t xml:space="preserve"> · </w:t>
       </w:r>
@@ -904,8 +904,8 @@
           <w:rFonts w:ascii="Times New Roman" w:cs="Times New Roman" w:eastAsia="Times New Roman" w:hAnsi="Times New Roman"/>
           <w:i/>
           <w:iCs/>
-          <w:sz w:val="18"/>
-          <w:szCs w:val="18"/>
+          <w:sz w:val="19"/>
+          <w:szCs w:val="19"/>
         </w:rPr>
         <w:t xml:space="preserve">Undergraduate Researcher</w:t>
       </w:r>
@@ -915,8 +915,8 @@
       <w:r>
         <w:rPr>
           <w:rFonts w:ascii="Times New Roman" w:cs="Times New Roman" w:eastAsia="Times New Roman" w:hAnsi="Times New Roman"/>
-          <w:sz w:val="18"/>
-          <w:szCs w:val="18"/>
+          <w:sz w:val="19"/>
+          <w:szCs w:val="19"/>
         </w:rPr>
         <w:t xml:space="preserve">Sep 2024 – Jun 2025</w:t>
       </w:r>
@@ -928,28 +928,28 @@
           <w:ilvl w:val="0"/>
           <w:numId w:val="2"/>
         </w:numPr>
-        <w:spacing w:before="12" w:line="215" w:lineRule="exact"/>
-      </w:pPr>
-      <w:r>
-        <w:rPr>
-          <w:rFonts w:ascii="Times New Roman" w:cs="Times New Roman" w:eastAsia="Times New Roman" w:hAnsi="Times New Roman"/>
-          <w:sz w:val="18"/>
-          <w:szCs w:val="18"/>
+        <w:spacing w:before="12" w:line="221" w:lineRule="exact"/>
+      </w:pPr>
+      <w:r>
+        <w:rPr>
+          <w:rFonts w:ascii="Times New Roman" w:cs="Times New Roman" w:eastAsia="Times New Roman" w:hAnsi="Times New Roman"/>
+          <w:sz w:val="19"/>
+          <w:szCs w:val="19"/>
         </w:rPr>
         <w:t xml:space="preserve">Fine-tuned LLaMA-3 with Unsloth and Hugging Face for QA over 50k foster-care policy documents, with human-in-the-loop feedback.</w:t>
       </w:r>
     </w:p>
     <w:p>
       <w:pPr>
-        <w:spacing w:before="42" w:line="215" w:lineRule="exact"/>
-      </w:pPr>
-      <w:r>
-        <w:rPr>
-          <w:rFonts w:ascii="Times New Roman" w:cs="Times New Roman" w:eastAsia="Times New Roman" w:hAnsi="Times New Roman"/>
-          <w:b/>
-          <w:bCs/>
-          <w:sz w:val="18"/>
-          <w:szCs w:val="18"/>
+        <w:spacing w:before="42" w:line="221" w:lineRule="exact"/>
+      </w:pPr>
+      <w:r>
+        <w:rPr>
+          <w:rFonts w:ascii="Times New Roman" w:cs="Times New Roman" w:eastAsia="Times New Roman" w:hAnsi="Times New Roman"/>
+          <w:b/>
+          <w:bCs/>
+          <w:sz w:val="19"/>
+          <w:szCs w:val="19"/>
         </w:rPr>
         <w:t xml:space="preserve">Also: </w:t>
       </w:r>
@@ -958,36 +958,18 @@
           <w:rFonts w:ascii="Times New Roman" w:cs="Times New Roman" w:eastAsia="Times New Roman" w:hAnsi="Times New Roman"/>
           <w:b/>
           <w:bCs/>
-          <w:sz w:val="18"/>
-          <w:szCs w:val="18"/>
+          <w:sz w:val="19"/>
+          <w:szCs w:val="19"/>
         </w:rPr>
         <w:t xml:space="preserve">Desdr Open Insurance Toolkit</w:t>
       </w:r>
       <w:r>
         <w:rPr>
           <w:rFonts w:ascii="Times New Roman" w:cs="Times New Roman" w:eastAsia="Times New Roman" w:hAnsi="Times New Roman"/>
-          <w:sz w:val="18"/>
-          <w:szCs w:val="18"/>
-        </w:rPr>
-        <w:t xml:space="preserve">, Columbia (Dr. Eugene Wu, Sep–Dec 2025): survey data into actuarial and climate-risk features. </w:t>
-      </w:r>
-      <w:r>
-        <w:rPr>
-          <w:rFonts w:ascii="Times New Roman" w:cs="Times New Roman" w:eastAsia="Times New Roman" w:hAnsi="Times New Roman"/>
-          <w:b/>
-          <w:bCs/>
-          <w:sz w:val="18"/>
-          <w:szCs w:val="18"/>
-        </w:rPr>
-        <w:t xml:space="preserve">Computer Vision &amp; AI Lab</w:t>
-      </w:r>
-      <w:r>
-        <w:rPr>
-          <w:rFonts w:ascii="Times New Roman" w:cs="Times New Roman" w:eastAsia="Times New Roman" w:hAnsi="Times New Roman"/>
-          <w:sz w:val="18"/>
-          <w:szCs w:val="18"/>
-        </w:rPr>
-        <w:t xml:space="preserve">, WashU (Dr. Umar Iqbal, Sep 2024–Jun 2025): pipelines parsing billions of forum posts.</w:t>
+          <w:sz w:val="19"/>
+          <w:szCs w:val="19"/>
+        </w:rPr>
+        <w:t xml:space="preserve">, Columbia (Dr. Eugene Wu, Sep–Dec 2025): survey data into actuarial and climate-risk features.</w:t>
       </w:r>
     </w:p>
     <w:p>
@@ -995,7 +977,7 @@
         <w:pBdr>
           <w:bottom w:val="single" w:color="000000" w:sz="6" w:space="1"/>
         </w:pBdr>
-        <w:spacing w:after="16" w:before="100" w:line="215" w:lineRule="exact"/>
+        <w:spacing w:after="16" w:before="100" w:line="221" w:lineRule="exact"/>
       </w:pPr>
       <w:r>
         <w:rPr>
@@ -1003,34 +985,34 @@
           <w:b/>
           <w:bCs/>
           <w:spacing w:val="16"/>
-          <w:sz w:val="17"/>
-          <w:szCs w:val="17"/>
-        </w:rPr>
-        <w:t xml:space="preserve">EXPERIENCE</w:t>
-      </w:r>
-    </w:p>
-    <w:p>
-      <w:pPr>
-        <w:tabs>
-          <w:tab w:val="right" w:pos="10656"/>
-        </w:tabs>
-        <w:spacing w:before="42" w:line="215" w:lineRule="exact"/>
-      </w:pPr>
-      <w:r>
-        <w:rPr>
-          <w:rFonts w:ascii="Times New Roman" w:cs="Times New Roman" w:eastAsia="Times New Roman" w:hAnsi="Times New Roman"/>
-          <w:b/>
-          <w:bCs/>
           <w:sz w:val="18"/>
           <w:szCs w:val="18"/>
         </w:rPr>
+        <w:t xml:space="preserve">EXPERIENCE</w:t>
+      </w:r>
+    </w:p>
+    <w:p>
+      <w:pPr>
+        <w:tabs>
+          <w:tab w:val="right" w:pos="10800"/>
+        </w:tabs>
+        <w:spacing w:before="42" w:line="221" w:lineRule="exact"/>
+      </w:pPr>
+      <w:r>
+        <w:rPr>
+          <w:rFonts w:ascii="Times New Roman" w:cs="Times New Roman" w:eastAsia="Times New Roman" w:hAnsi="Times New Roman"/>
+          <w:b/>
+          <w:bCs/>
+          <w:sz w:val="19"/>
+          <w:szCs w:val="19"/>
+        </w:rPr>
         <w:t xml:space="preserve">Smack Technologies</w:t>
       </w:r>
       <w:r>
         <w:rPr>
           <w:rFonts w:ascii="Times New Roman" w:cs="Times New Roman" w:eastAsia="Times New Roman" w:hAnsi="Times New Roman"/>
-          <w:sz w:val="18"/>
-          <w:szCs w:val="18"/>
+          <w:sz w:val="19"/>
+          <w:szCs w:val="19"/>
         </w:rPr>
         <w:t xml:space="preserve"> · </w:t>
       </w:r>
@@ -1039,8 +1021,8 @@
           <w:rFonts w:ascii="Times New Roman" w:cs="Times New Roman" w:eastAsia="Times New Roman" w:hAnsi="Times New Roman"/>
           <w:i/>
           <w:iCs/>
-          <w:sz w:val="18"/>
-          <w:szCs w:val="18"/>
+          <w:sz w:val="19"/>
+          <w:szCs w:val="19"/>
         </w:rPr>
         <w:t xml:space="preserve">Software Engineer Intern</w:t>
       </w:r>
@@ -1050,8 +1032,8 @@
       <w:r>
         <w:rPr>
           <w:rFonts w:ascii="Times New Roman" w:cs="Times New Roman" w:eastAsia="Times New Roman" w:hAnsi="Times New Roman"/>
-          <w:sz w:val="18"/>
-          <w:szCs w:val="18"/>
+          <w:sz w:val="19"/>
+          <w:szCs w:val="19"/>
         </w:rPr>
         <w:t xml:space="preserve">May – Aug 2026</w:t>
       </w:r>
@@ -1063,13 +1045,13 @@
           <w:ilvl w:val="0"/>
           <w:numId w:val="2"/>
         </w:numPr>
-        <w:spacing w:before="12" w:line="215" w:lineRule="exact"/>
-      </w:pPr>
-      <w:r>
-        <w:rPr>
-          <w:rFonts w:ascii="Times New Roman" w:cs="Times New Roman" w:eastAsia="Times New Roman" w:hAnsi="Times New Roman"/>
-          <w:sz w:val="18"/>
-          <w:szCs w:val="18"/>
+        <w:spacing w:before="12" w:line="221" w:lineRule="exact"/>
+      </w:pPr>
+      <w:r>
+        <w:rPr>
+          <w:rFonts w:ascii="Times New Roman" w:cs="Times New Roman" w:eastAsia="Times New Roman" w:hAnsi="Times New Roman"/>
+          <w:sz w:val="19"/>
+          <w:szCs w:val="19"/>
         </w:rPr>
         <w:t xml:space="preserve">Built a high-fidelity physics and sensor simulation core: closed-form line-of-sight and horizon geometry, energy-maneuverability flyout, and ECI-to-ECEF coordinate transforms.</w:t>
       </w:r>
@@ -1081,13 +1063,13 @@
           <w:ilvl w:val="0"/>
           <w:numId w:val="2"/>
         </w:numPr>
-        <w:spacing w:before="12" w:line="215" w:lineRule="exact"/>
-      </w:pPr>
-      <w:r>
-        <w:rPr>
-          <w:rFonts w:ascii="Times New Roman" w:cs="Times New Roman" w:eastAsia="Times New Roman" w:hAnsi="Times New Roman"/>
-          <w:sz w:val="18"/>
-          <w:szCs w:val="18"/>
+        <w:spacing w:before="12" w:line="221" w:lineRule="exact"/>
+      </w:pPr>
+      <w:r>
+        <w:rPr>
+          <w:rFonts w:ascii="Times New Roman" w:cs="Times New Roman" w:eastAsia="Times New Roman" w:hAnsi="Times New Roman"/>
+          <w:sz w:val="19"/>
+          <w:szCs w:val="19"/>
         </w:rPr>
         <w:t xml:space="preserve">Synced platform capability data from a knowledge graph into the simulator via a retrieval-judged, human-approved pipeline.</w:t>
       </w:r>
@@ -1095,25 +1077,25 @@
     <w:p>
       <w:pPr>
         <w:tabs>
-          <w:tab w:val="right" w:pos="10656"/>
+          <w:tab w:val="right" w:pos="10800"/>
         </w:tabs>
-        <w:spacing w:before="54" w:line="215" w:lineRule="exact"/>
-      </w:pPr>
-      <w:r>
-        <w:rPr>
-          <w:rFonts w:ascii="Times New Roman" w:cs="Times New Roman" w:eastAsia="Times New Roman" w:hAnsi="Times New Roman"/>
-          <w:b/>
-          <w:bCs/>
-          <w:sz w:val="18"/>
-          <w:szCs w:val="18"/>
+        <w:spacing w:before="54" w:line="221" w:lineRule="exact"/>
+      </w:pPr>
+      <w:r>
+        <w:rPr>
+          <w:rFonts w:ascii="Times New Roman" w:cs="Times New Roman" w:eastAsia="Times New Roman" w:hAnsi="Times New Roman"/>
+          <w:b/>
+          <w:bCs/>
+          <w:sz w:val="19"/>
+          <w:szCs w:val="19"/>
         </w:rPr>
         <w:t xml:space="preserve">Highnote</w:t>
       </w:r>
       <w:r>
         <w:rPr>
           <w:rFonts w:ascii="Times New Roman" w:cs="Times New Roman" w:eastAsia="Times New Roman" w:hAnsi="Times New Roman"/>
-          <w:sz w:val="18"/>
-          <w:szCs w:val="18"/>
+          <w:sz w:val="19"/>
+          <w:szCs w:val="19"/>
         </w:rPr>
         <w:t xml:space="preserve"> · </w:t>
       </w:r>
@@ -1122,8 +1104,8 @@
           <w:rFonts w:ascii="Times New Roman" w:cs="Times New Roman" w:eastAsia="Times New Roman" w:hAnsi="Times New Roman"/>
           <w:i/>
           <w:iCs/>
-          <w:sz w:val="18"/>
-          <w:szCs w:val="18"/>
+          <w:sz w:val="19"/>
+          <w:szCs w:val="19"/>
         </w:rPr>
         <w:t xml:space="preserve">Cybersecurity Engineer Intern</w:t>
       </w:r>
@@ -1133,8 +1115,8 @@
       <w:r>
         <w:rPr>
           <w:rFonts w:ascii="Times New Roman" w:cs="Times New Roman" w:eastAsia="Times New Roman" w:hAnsi="Times New Roman"/>
-          <w:sz w:val="18"/>
-          <w:szCs w:val="18"/>
+          <w:sz w:val="19"/>
+          <w:szCs w:val="19"/>
         </w:rPr>
         <w:t xml:space="preserve">May – Jul 2024</w:t>
       </w:r>
@@ -1146,13 +1128,13 @@
           <w:ilvl w:val="0"/>
           <w:numId w:val="2"/>
         </w:numPr>
-        <w:spacing w:before="12" w:line="215" w:lineRule="exact"/>
-      </w:pPr>
-      <w:r>
-        <w:rPr>
-          <w:rFonts w:ascii="Times New Roman" w:cs="Times New Roman" w:eastAsia="Times New Roman" w:hAnsi="Times New Roman"/>
-          <w:sz w:val="18"/>
-          <w:szCs w:val="18"/>
+        <w:spacing w:before="12" w:line="221" w:lineRule="exact"/>
+      </w:pPr>
+      <w:r>
+        <w:rPr>
+          <w:rFonts w:ascii="Times New Roman" w:cs="Times New Roman" w:eastAsia="Times New Roman" w:hAnsi="Times New Roman"/>
+          <w:sz w:val="19"/>
+          <w:szCs w:val="19"/>
         </w:rPr>
         <w:t xml:space="preserve">Designed and deployed the company-wide SIEM for a card-issuing fintech, unifying AWS, GCP, and Datadog telemetry into one Elasticsearch cluster ingesting over 1 TB/day, and wrote 100+ rule-based and ML anomaly detections.</w:t>
       </w:r>
@@ -1160,25 +1142,25 @@
     <w:p>
       <w:pPr>
         <w:tabs>
-          <w:tab w:val="right" w:pos="10656"/>
+          <w:tab w:val="right" w:pos="10800"/>
         </w:tabs>
-        <w:spacing w:before="54" w:line="215" w:lineRule="exact"/>
-      </w:pPr>
-      <w:r>
-        <w:rPr>
-          <w:rFonts w:ascii="Times New Roman" w:cs="Times New Roman" w:eastAsia="Times New Roman" w:hAnsi="Times New Roman"/>
-          <w:b/>
-          <w:bCs/>
-          <w:sz w:val="18"/>
-          <w:szCs w:val="18"/>
+        <w:spacing w:before="54" w:line="221" w:lineRule="exact"/>
+      </w:pPr>
+      <w:r>
+        <w:rPr>
+          <w:rFonts w:ascii="Times New Roman" w:cs="Times New Roman" w:eastAsia="Times New Roman" w:hAnsi="Times New Roman"/>
+          <w:b/>
+          <w:bCs/>
+          <w:sz w:val="19"/>
+          <w:szCs w:val="19"/>
         </w:rPr>
         <w:t xml:space="preserve">Mindtrip</w:t>
       </w:r>
       <w:r>
         <w:rPr>
           <w:rFonts w:ascii="Times New Roman" w:cs="Times New Roman" w:eastAsia="Times New Roman" w:hAnsi="Times New Roman"/>
-          <w:sz w:val="18"/>
-          <w:szCs w:val="18"/>
+          <w:sz w:val="19"/>
+          <w:szCs w:val="19"/>
         </w:rPr>
         <w:t xml:space="preserve"> · </w:t>
       </w:r>
@@ -1187,8 +1169,8 @@
           <w:rFonts w:ascii="Times New Roman" w:cs="Times New Roman" w:eastAsia="Times New Roman" w:hAnsi="Times New Roman"/>
           <w:i/>
           <w:iCs/>
-          <w:sz w:val="18"/>
-          <w:szCs w:val="18"/>
+          <w:sz w:val="19"/>
+          <w:szCs w:val="19"/>
         </w:rPr>
         <w:t xml:space="preserve">Software Engineer Intern</w:t>
       </w:r>
@@ -1198,8 +1180,8 @@
       <w:r>
         <w:rPr>
           <w:rFonts w:ascii="Times New Roman" w:cs="Times New Roman" w:eastAsia="Times New Roman" w:hAnsi="Times New Roman"/>
-          <w:sz w:val="18"/>
-          <w:szCs w:val="18"/>
+          <w:sz w:val="19"/>
+          <w:szCs w:val="19"/>
         </w:rPr>
         <w:t xml:space="preserve">May – Jul 2023</w:t>
       </w:r>
@@ -1211,48 +1193,15 @@
           <w:ilvl w:val="0"/>
           <w:numId w:val="2"/>
         </w:numPr>
-        <w:spacing w:before="12" w:line="215" w:lineRule="exact"/>
-      </w:pPr>
-      <w:r>
-        <w:rPr>
-          <w:rFonts w:ascii="Times New Roman" w:cs="Times New Roman" w:eastAsia="Times New Roman" w:hAnsi="Times New Roman"/>
-          <w:sz w:val="18"/>
-          <w:szCs w:val="18"/>
+        <w:spacing w:before="12" w:line="221" w:lineRule="exact"/>
+      </w:pPr>
+      <w:r>
+        <w:rPr>
+          <w:rFonts w:ascii="Times New Roman" w:cs="Times New Roman" w:eastAsia="Times New Roman" w:hAnsi="Times New Roman"/>
+          <w:sz w:val="19"/>
+          <w:szCs w:val="19"/>
         </w:rPr>
         <w:t xml:space="preserve">Built internal admin and secure-query tooling in JavaScript and Rails via Retool, saving roughly 250 engineering hours a month.</w:t>
-      </w:r>
-    </w:p>
-    <w:p>
-      <w:pPr>
-        <w:spacing w:before="42" w:line="215" w:lineRule="exact"/>
-      </w:pPr>
-      <w:r>
-        <w:rPr>
-          <w:rFonts w:ascii="Times New Roman" w:cs="Times New Roman" w:eastAsia="Times New Roman" w:hAnsi="Times New Roman"/>
-          <w:b/>
-          <w:bCs/>
-          <w:sz w:val="18"/>
-          <w:szCs w:val="18"/>
-        </w:rPr>
-        <w:t xml:space="preserve">Earlier: </w:t>
-      </w:r>
-      <w:r>
-        <w:rPr>
-          <w:rFonts w:ascii="Times New Roman" w:cs="Times New Roman" w:eastAsia="Times New Roman" w:hAnsi="Times New Roman"/>
-          <w:b/>
-          <w:bCs/>
-          <w:sz w:val="18"/>
-          <w:szCs w:val="18"/>
-        </w:rPr>
-        <w:t xml:space="preserve">Bugcrowd</w:t>
-      </w:r>
-      <w:r>
-        <w:rPr>
-          <w:rFonts w:ascii="Times New Roman" w:cs="Times New Roman" w:eastAsia="Times New Roman" w:hAnsi="Times New Roman"/>
-          <w:sz w:val="18"/>
-          <w:szCs w:val="18"/>
-        </w:rPr>
-        <w:t xml:space="preserve">, Associate Application Security Engineer (May–Jul 2020): vulnerability triage and client disclosure work.</w:t>
       </w:r>
     </w:p>
     <w:p>
@@ -1260,7 +1209,7 @@
         <w:pBdr>
           <w:bottom w:val="single" w:color="000000" w:sz="6" w:space="1"/>
         </w:pBdr>
-        <w:spacing w:after="16" w:before="100" w:line="215" w:lineRule="exact"/>
+        <w:spacing w:after="16" w:before="100" w:line="221" w:lineRule="exact"/>
       </w:pPr>
       <w:r>
         <w:rPr>
@@ -1268,8 +1217,8 @@
           <w:b/>
           <w:bCs/>
           <w:spacing w:val="16"/>
-          <w:sz w:val="17"/>
-          <w:szCs w:val="17"/>
+          <w:sz w:val="18"/>
+          <w:szCs w:val="18"/>
         </w:rPr>
         <w:t xml:space="preserve">HONORS &amp; LEADERSHIP</w:t>
       </w:r>
@@ -1281,23 +1230,23 @@
           <w:ilvl w:val="0"/>
           <w:numId w:val="2"/>
         </w:numPr>
-        <w:spacing w:before="12" w:line="215" w:lineRule="exact"/>
-      </w:pPr>
-      <w:r>
-        <w:rPr>
-          <w:rFonts w:ascii="Times New Roman" w:cs="Times New Roman" w:eastAsia="Times New Roman" w:hAnsi="Times New Roman"/>
-          <w:b/>
-          <w:bCs/>
-          <w:sz w:val="18"/>
-          <w:szCs w:val="18"/>
+        <w:spacing w:before="12" w:line="221" w:lineRule="exact"/>
+      </w:pPr>
+      <w:r>
+        <w:rPr>
+          <w:rFonts w:ascii="Times New Roman" w:cs="Times New Roman" w:eastAsia="Times New Roman" w:hAnsi="Times New Roman"/>
+          <w:b/>
+          <w:bCs/>
+          <w:sz w:val="19"/>
+          <w:szCs w:val="19"/>
         </w:rPr>
         <w:t xml:space="preserve">Overall Winner</w:t>
       </w:r>
       <w:r>
         <w:rPr>
           <w:rFonts w:ascii="Times New Roman" w:cs="Times New Roman" w:eastAsia="Times New Roman" w:hAnsi="Times New Roman"/>
-          <w:sz w:val="18"/>
-          <w:szCs w:val="18"/>
+          <w:sz w:val="19"/>
+          <w:szCs w:val="19"/>
         </w:rPr>
         <w:t xml:space="preserve"> and </w:t>
       </w:r>
@@ -1306,40 +1255,40 @@
           <w:rFonts w:ascii="Times New Roman" w:cs="Times New Roman" w:eastAsia="Times New Roman" w:hAnsi="Times New Roman"/>
           <w:b/>
           <w:bCs/>
-          <w:sz w:val="18"/>
-          <w:szCs w:val="18"/>
+          <w:sz w:val="19"/>
+          <w:szCs w:val="19"/>
         </w:rPr>
         <w:t xml:space="preserve">NVIDIA Ecosystem Award</w:t>
       </w:r>
       <w:r>
         <w:rPr>
           <w:rFonts w:ascii="Times New Roman" w:cs="Times New Roman" w:eastAsia="Times New Roman" w:hAnsi="Times New Roman"/>
-          <w:sz w:val="18"/>
-          <w:szCs w:val="18"/>
+          <w:sz w:val="19"/>
+          <w:szCs w:val="19"/>
         </w:rPr>
         <w:t xml:space="preserve">, MIT iQuHACK 2026</w:t>
       </w:r>
       <w:r>
         <w:rPr>
           <w:rFonts w:ascii="Times New Roman" w:cs="Times New Roman" w:eastAsia="Times New Roman" w:hAnsi="Times New Roman"/>
-          <w:sz w:val="18"/>
-          <w:szCs w:val="18"/>
+          <w:sz w:val="19"/>
+          <w:szCs w:val="19"/>
         </w:rPr>
         <w:t xml:space="preserve"> · </w:t>
       </w:r>
       <w:r>
         <w:rPr>
           <w:rFonts w:ascii="Times New Roman" w:cs="Times New Roman" w:eastAsia="Times New Roman" w:hAnsi="Times New Roman"/>
-          <w:sz w:val="18"/>
-          <w:szCs w:val="18"/>
+          <w:sz w:val="19"/>
+          <w:szCs w:val="19"/>
         </w:rPr>
         <w:t xml:space="preserve">Qualified, NYU Abu Dhabi Quantum Hackathon for Social Good 2027</w:t>
       </w:r>
       <w:r>
         <w:rPr>
           <w:rFonts w:ascii="Times New Roman" w:cs="Times New Roman" w:eastAsia="Times New Roman" w:hAnsi="Times New Roman"/>
-          <w:sz w:val="18"/>
-          <w:szCs w:val="18"/>
+          <w:sz w:val="19"/>
+          <w:szCs w:val="19"/>
         </w:rPr>
         <w:t xml:space="preserve"> · </w:t>
       </w:r>
@@ -1348,24 +1297,24 @@
           <w:rFonts w:ascii="Times New Roman" w:cs="Times New Roman" w:eastAsia="Times New Roman" w:hAnsi="Times New Roman"/>
           <w:b/>
           <w:bCs/>
-          <w:sz w:val="18"/>
-          <w:szCs w:val="18"/>
+          <w:sz w:val="19"/>
+          <w:szCs w:val="19"/>
         </w:rPr>
         <w:t xml:space="preserve">Audience Favorite</w:t>
       </w:r>
       <w:r>
         <w:rPr>
           <w:rFonts w:ascii="Times New Roman" w:cs="Times New Roman" w:eastAsia="Times New Roman" w:hAnsi="Times New Roman"/>
-          <w:sz w:val="18"/>
-          <w:szCs w:val="18"/>
+          <w:sz w:val="19"/>
+          <w:szCs w:val="19"/>
         </w:rPr>
         <w:t xml:space="preserve">, Harmoniqs Quantum Design Hackathon 2026</w:t>
       </w:r>
       <w:r>
         <w:rPr>
           <w:rFonts w:ascii="Times New Roman" w:cs="Times New Roman" w:eastAsia="Times New Roman" w:hAnsi="Times New Roman"/>
-          <w:sz w:val="18"/>
-          <w:szCs w:val="18"/>
+          <w:sz w:val="19"/>
+          <w:szCs w:val="19"/>
         </w:rPr>
         <w:t xml:space="preserve"> · </w:t>
       </w:r>
@@ -1374,16 +1323,16 @@
           <w:rFonts w:ascii="Times New Roman" w:cs="Times New Roman" w:eastAsia="Times New Roman" w:hAnsi="Times New Roman"/>
           <w:b/>
           <w:bCs/>
-          <w:sz w:val="18"/>
-          <w:szCs w:val="18"/>
+          <w:sz w:val="19"/>
+          <w:szCs w:val="19"/>
         </w:rPr>
         <w:t xml:space="preserve">Runner-Up</w:t>
       </w:r>
       <w:r>
         <w:rPr>
           <w:rFonts w:ascii="Times New Roman" w:cs="Times New Roman" w:eastAsia="Times New Roman" w:hAnsi="Times New Roman"/>
-          <w:sz w:val="18"/>
-          <w:szCs w:val="18"/>
+          <w:sz w:val="19"/>
+          <w:szCs w:val="19"/>
         </w:rPr>
         <w:t xml:space="preserve">, Qualcomm Snapdragon Multiverse Hackathon 2026</w:t>
       </w:r>
@@ -1395,23 +1344,23 @@
           <w:ilvl w:val="0"/>
           <w:numId w:val="2"/>
         </w:numPr>
-        <w:spacing w:before="12" w:line="215" w:lineRule="exact"/>
-      </w:pPr>
-      <w:r>
-        <w:rPr>
-          <w:rFonts w:ascii="Times New Roman" w:cs="Times New Roman" w:eastAsia="Times New Roman" w:hAnsi="Times New Roman"/>
-          <w:b/>
-          <w:bCs/>
-          <w:sz w:val="18"/>
-          <w:szCs w:val="18"/>
+        <w:spacing w:before="12" w:line="221" w:lineRule="exact"/>
+      </w:pPr>
+      <w:r>
+        <w:rPr>
+          <w:rFonts w:ascii="Times New Roman" w:cs="Times New Roman" w:eastAsia="Times New Roman" w:hAnsi="Times New Roman"/>
+          <w:b/>
+          <w:bCs/>
+          <w:sz w:val="19"/>
+          <w:szCs w:val="19"/>
         </w:rPr>
         <w:t xml:space="preserve">Graduate Lead</w:t>
       </w:r>
       <w:r>
         <w:rPr>
           <w:rFonts w:ascii="Times New Roman" w:cs="Times New Roman" w:eastAsia="Times New Roman" w:hAnsi="Times New Roman"/>
-          <w:sz w:val="18"/>
-          <w:szCs w:val="18"/>
+          <w:sz w:val="19"/>
+          <w:szCs w:val="19"/>
         </w:rPr>
         <w:t xml:space="preserve">, Columbia Quantum Algorithms Reading Group (Sep 2025–Jun 2026): ran weekly sessions covering all 33 chapters of Andrew Childs' quantum algorithms lecture notes, each with simulation checks.</w:t>
       </w:r>
@@ -1421,7 +1370,7 @@
         <w:pBdr>
           <w:bottom w:val="single" w:color="000000" w:sz="6" w:space="1"/>
         </w:pBdr>
-        <w:spacing w:after="16" w:before="100" w:line="215" w:lineRule="exact"/>
+        <w:spacing w:after="16" w:before="100" w:line="221" w:lineRule="exact"/>
       </w:pPr>
       <w:r>
         <w:rPr>
@@ -1429,39 +1378,39 @@
           <w:b/>
           <w:bCs/>
           <w:spacing w:val="16"/>
-          <w:sz w:val="17"/>
-          <w:szCs w:val="17"/>
-        </w:rPr>
-        <w:t xml:space="preserve">SKILLS</w:t>
-      </w:r>
-    </w:p>
-    <w:p>
-      <w:pPr>
-        <w:spacing w:before="20" w:line="215" w:lineRule="exact"/>
-        <w:ind w:left="0"/>
-      </w:pPr>
-      <w:r>
-        <w:rPr>
-          <w:rFonts w:ascii="Times New Roman" w:cs="Times New Roman" w:eastAsia="Times New Roman" w:hAnsi="Times New Roman"/>
-          <w:b/>
-          <w:bCs/>
           <w:sz w:val="18"/>
           <w:szCs w:val="18"/>
         </w:rPr>
+        <w:t xml:space="preserve">SKILLS</w:t>
+      </w:r>
+    </w:p>
+    <w:p>
+      <w:pPr>
+        <w:spacing w:before="20" w:line="221" w:lineRule="exact"/>
+        <w:ind w:left="0"/>
+      </w:pPr>
+      <w:r>
+        <w:rPr>
+          <w:rFonts w:ascii="Times New Roman" w:cs="Times New Roman" w:eastAsia="Times New Roman" w:hAnsi="Times New Roman"/>
+          <w:b/>
+          <w:bCs/>
+          <w:sz w:val="19"/>
+          <w:szCs w:val="19"/>
+        </w:rPr>
         <w:t xml:space="preserve">Quantum:  </w:t>
       </w:r>
       <w:r>
         <w:rPr>
           <w:rFonts w:ascii="Times New Roman" w:cs="Times New Roman" w:eastAsia="Times New Roman" w:hAnsi="Times New Roman"/>
-          <w:sz w:val="18"/>
-          <w:szCs w:val="18"/>
+          <w:sz w:val="19"/>
+          <w:szCs w:val="19"/>
         </w:rPr>
         <w:t xml:space="preserve">Qiskit and Qiskit Runtime, CUDA-Q, Stim, PyMatching, QuTiP · Hamiltonian simulation, phase and amplitude estimation, QSVT, LCU, VQE, QAOA · surface codes, MWPM and Union-Find decoding · randomized benchmarking, tomography</w:t>
       </w:r>
     </w:p>
     <w:p>
       <w:pPr>
-        <w:spacing w:before="20" w:line="215" w:lineRule="exact"/>
+        <w:spacing w:before="20" w:line="221" w:lineRule="exact"/>
         <w:ind w:left="0"/>
       </w:pPr>
       <w:r>
@@ -1469,23 +1418,23 @@
           <w:rFonts w:ascii="Times New Roman" w:cs="Times New Roman" w:eastAsia="Times New Roman" w:hAnsi="Times New Roman"/>
           <w:b/>
           <w:bCs/>
-          <w:sz w:val="18"/>
-          <w:szCs w:val="18"/>
+          <w:sz w:val="19"/>
+          <w:szCs w:val="19"/>
         </w:rPr>
         <w:t xml:space="preserve">Languages:  </w:t>
       </w:r>
       <w:r>
         <w:rPr>
           <w:rFonts w:ascii="Times New Roman" w:cs="Times New Roman" w:eastAsia="Times New Roman" w:hAnsi="Times New Roman"/>
-          <w:sz w:val="18"/>
-          <w:szCs w:val="18"/>
+          <w:sz w:val="19"/>
+          <w:szCs w:val="19"/>
         </w:rPr>
         <w:t xml:space="preserve">Python, C++, Rust, C, MATLAB, JavaScript, TypeScript, Go, Java</w:t>
       </w:r>
     </w:p>
     <w:p>
       <w:pPr>
-        <w:spacing w:before="20" w:line="215" w:lineRule="exact"/>
+        <w:spacing w:before="20" w:line="221" w:lineRule="exact"/>
         <w:ind w:left="0"/>
       </w:pPr>
       <w:r>
@@ -1493,23 +1442,23 @@
           <w:rFonts w:ascii="Times New Roman" w:cs="Times New Roman" w:eastAsia="Times New Roman" w:hAnsi="Times New Roman"/>
           <w:b/>
           <w:bCs/>
-          <w:sz w:val="18"/>
-          <w:szCs w:val="18"/>
+          <w:sz w:val="19"/>
+          <w:szCs w:val="19"/>
         </w:rPr>
         <w:t xml:space="preserve">ML &amp; systems:  </w:t>
       </w:r>
       <w:r>
         <w:rPr>
           <w:rFonts w:ascii="Times New Roman" w:cs="Times New Roman" w:eastAsia="Times New Roman" w:hAnsi="Times New Roman"/>
-          <w:sz w:val="18"/>
-          <w:szCs w:val="18"/>
+          <w:sz w:val="19"/>
+          <w:szCs w:val="19"/>
         </w:rPr>
         <w:t xml:space="preserve">PyTorch, CUDA, Hugging Face · Linux, Git, Docker, WebAssembly, AWS, GCP, Elasticsearch, LaTeX</w:t>
       </w:r>
     </w:p>
     <w:p>
       <w:pPr>
-        <w:spacing w:before="20" w:line="215" w:lineRule="exact"/>
+        <w:spacing w:before="20" w:line="221" w:lineRule="exact"/>
         <w:ind w:left="0"/>
       </w:pPr>
       <w:r>
@@ -1517,23 +1466,23 @@
           <w:rFonts w:ascii="Times New Roman" w:cs="Times New Roman" w:eastAsia="Times New Roman" w:hAnsi="Times New Roman"/>
           <w:b/>
           <w:bCs/>
-          <w:sz w:val="18"/>
-          <w:szCs w:val="18"/>
+          <w:sz w:val="19"/>
+          <w:szCs w:val="19"/>
         </w:rPr>
         <w:t xml:space="preserve">Mathematics:  </w:t>
       </w:r>
       <w:r>
         <w:rPr>
           <w:rFonts w:ascii="Times New Roman" w:cs="Times New Roman" w:eastAsia="Times New Roman" w:hAnsi="Times New Roman"/>
-          <w:sz w:val="18"/>
-          <w:szCs w:val="18"/>
+          <w:sz w:val="19"/>
+          <w:szCs w:val="19"/>
         </w:rPr>
         <w:t xml:space="preserve">Linear algebra, tensor networks, probability, convex optimization, quantum complexity (BQP, QMA), query complexity</w:t>
       </w:r>
     </w:p>
     <w:sectPr>
       <w:pgSz w:w="12240" w:h="15840" w:orient="portrait"/>
-      <w:pgMar w:top="648" w:right="792" w:bottom="547" w:left="792" w:header="708" w:footer="708" w:gutter="0"/>
+      <w:pgMar w:top="648" w:right="720" w:bottom="547" w:left="720" w:header="708" w:footer="708" w:gutter="0"/>
       <w:pgNumType/>
       <w:docGrid w:linePitch="360"/>
     </w:sectPr>

</xml_diff>

<commit_message>
Correct the graph direction; drop the individual bug fix
The integration ran the other way from what the résumé said. The
knowledge graph was integrated into the simulator to widen what corpus
generation could draw on; the graph itself was not expanded. Both the
résumé and the site had it backwards.

The unit-conversion fix is out. A single bug belongs in a commit
message, not on a résumé, and the overall result carries better: the
64x now attaches to corpus generation, where it belongs, rather than to
simulator run time.

Three bullets, one line each: what was built, the model benchmarks and
their speedup, and the error bound.

"Qualified" is bolded like the other three outcomes in the honors line.
It marks a competition result the same way they do, so leaving it plain
read as an oversight rather than as modesty.

Co-Authored-By: Claude Opus 5 <noreply@anthropic.com>
Claude-Session: https://claude.ai/code/session_01EbsTbSDgvxSSfAYTVqmk9g
</commit_message>
<xml_diff>
--- a/resume/jaspersands_resume.docx
+++ b/resume/jaspersands_resume.docx
@@ -32,7 +32,7 @@
         </w:rPr>
         <w:t xml:space="preserve">Palo Alto, CA | (650) 924-8429 | </w:t>
       </w:r>
-      <w:hyperlink w:history="1" r:id="rId6bnbedmrsou9htusxzy9c">
+      <w:hyperlink w:history="1" r:id="rIda4mjj1otbapjmlcj7wk4l">
         <w:r>
           <w:rPr>
             <w:rFonts w:ascii="Times New Roman" w:cs="Times New Roman" w:eastAsia="Times New Roman" w:hAnsi="Times New Roman"/>
@@ -50,7 +50,7 @@
         </w:rPr>
         <w:t xml:space="preserve"> | </w:t>
       </w:r>
-      <w:hyperlink w:history="1" r:id="rIdmvr7_yiczvjuy-k3avr-q">
+      <w:hyperlink w:history="1" r:id="rIdrbgfbi5ylxbepj_yhoaqe">
         <w:r>
           <w:rPr>
             <w:rFonts w:ascii="Times New Roman" w:cs="Times New Roman" w:eastAsia="Times New Roman" w:hAnsi="Times New Roman"/>
@@ -68,7 +68,7 @@
         </w:rPr>
         <w:t xml:space="preserve"> | </w:t>
       </w:r>
-      <w:hyperlink w:history="1" r:id="rIdtf3zjdzwywlvka1zhfod4">
+      <w:hyperlink w:history="1" r:id="rIdpmmu79zyccmrz3ny8uaiu">
         <w:r>
           <w:rPr>
             <w:rFonts w:ascii="Times New Roman" w:cs="Times New Roman" w:eastAsia="Times New Roman" w:hAnsi="Times New Roman"/>
@@ -86,7 +86,7 @@
         </w:rPr>
         <w:t xml:space="preserve"> | </w:t>
       </w:r>
-      <w:hyperlink w:history="1" r:id="rIdro1n2bck8xbkg5phrywio">
+      <w:hyperlink w:history="1" r:id="rIdekvomvlpd_zbctejubpgg">
         <w:r>
           <w:rPr>
             <w:rFonts w:ascii="Times New Roman" w:cs="Times New Roman" w:eastAsia="Times New Roman" w:hAnsi="Times New Roman"/>
@@ -452,7 +452,7 @@
         </w:tabs>
         <w:spacing w:before="42" w:line="235" w:lineRule="exact"/>
       </w:pPr>
-      <w:hyperlink w:history="1" r:id="rId4lbz6udyzd4snbkwkudqy">
+      <w:hyperlink w:history="1" r:id="rIdbjjprniw16ao3wykv-_mo">
         <w:r>
           <w:rPr>
             <w:rFonts w:ascii="Times New Roman" w:cs="Times New Roman" w:eastAsia="Times New Roman" w:hAnsi="Times New Roman"/>
@@ -545,7 +545,7 @@
         </w:tabs>
         <w:spacing w:before="54" w:line="235" w:lineRule="exact"/>
       </w:pPr>
-      <w:hyperlink w:history="1" r:id="rIdsonhkfg4c6vpnq0yjlida">
+      <w:hyperlink w:history="1" r:id="rIdcofi2zczx4nucfty1uz4s">
         <w:r>
           <w:rPr>
             <w:rFonts w:ascii="Times New Roman" w:cs="Times New Roman" w:eastAsia="Times New Roman" w:hAnsi="Times New Roman"/>
@@ -586,7 +586,7 @@
       <w:r>
         <w:tab/>
       </w:r>
-      <w:hyperlink w:history="1" r:id="rIdg7treogdlbd1dtcfdxuoz">
+      <w:hyperlink w:history="1" r:id="rIdzvxq7jx3aodgzcb9aou9c">
         <w:r>
           <w:rPr>
             <w:rFonts w:ascii="Times New Roman" w:cs="Times New Roman" w:eastAsia="Times New Roman" w:hAnsi="Times New Roman"/>
@@ -640,7 +640,7 @@
         </w:tabs>
         <w:spacing w:before="54" w:line="235" w:lineRule="exact"/>
       </w:pPr>
-      <w:hyperlink w:history="1" r:id="rIdycxm_zulbfzau3i_w0j4m">
+      <w:hyperlink w:history="1" r:id="rIdn1kds0gmrk5txcmkrgasx">
         <w:r>
           <w:rPr>
             <w:rFonts w:ascii="Times New Roman" w:cs="Times New Roman" w:eastAsia="Times New Roman" w:hAnsi="Times New Roman"/>
@@ -663,7 +663,7 @@
       <w:r>
         <w:tab/>
       </w:r>
-      <w:hyperlink w:history="1" r:id="rIdcrbclhzzcokiepyfj77ia">
+      <w:hyperlink w:history="1" r:id="rIdfp8rnuzfzzephvvpuiwjm">
         <w:r>
           <w:rPr>
             <w:rFonts w:ascii="Times New Roman" w:cs="Times New Roman" w:eastAsia="Times New Roman" w:hAnsi="Times New Roman"/>
@@ -717,7 +717,7 @@
         </w:tabs>
         <w:spacing w:before="54" w:line="235" w:lineRule="exact"/>
       </w:pPr>
-      <w:hyperlink w:history="1" r:id="rId2denltlrraguqruvj_lpn">
+      <w:hyperlink w:history="1" r:id="rIdm9sjbnimdzpazjr4cz94h">
         <w:r>
           <w:rPr>
             <w:rFonts w:ascii="Times New Roman" w:cs="Times New Roman" w:eastAsia="Times New Roman" w:hAnsi="Times New Roman"/>
@@ -1129,7 +1129,7 @@
           <w:sz w:val="20"/>
           <w:szCs w:val="20"/>
         </w:rPr>
-        <w:t xml:space="preserve">Built physics and sensor simulation, and fixed a unit-conversion bug that cut simulated speeds 60% per run.</w:t>
+        <w:t xml:space="preserve">Built physics and sensor simulation, integrating the knowledge graph to expand corpus generation.</w:t>
       </w:r>
     </w:p>
     <w:p>
@@ -1147,7 +1147,7 @@
           <w:sz w:val="20"/>
           <w:szCs w:val="20"/>
         </w:rPr>
-        <w:t xml:space="preserve">Expanded the knowledge graph with far more platforms, weapons and sensors, and the pipeline feeding them to the simulator.</w:t>
+        <w:t xml:space="preserve">Benchmarked open-weight models head to head on speed, intelligence and concurrency, speeding corpus generation 64x.</w:t>
       </w:r>
     </w:p>
     <w:p>
@@ -1165,7 +1165,54 @@
           <w:sz w:val="20"/>
           <w:szCs w:val="20"/>
         </w:rPr>
-        <w:t xml:space="preserve">Ran head-to-head benchmarks across open-weight language models and wrote up the evidence behind the choice.</w:t>
+        <w:t xml:space="preserve">Bounded simulator error to 0.55% against references chosen outside the simulator, and wrote the bounds the team works from.</w:t>
+      </w:r>
+    </w:p>
+    <w:p>
+      <w:pPr>
+        <w:tabs>
+          <w:tab w:val="right" w:pos="10800"/>
+        </w:tabs>
+        <w:spacing w:before="54" w:line="235" w:lineRule="exact"/>
+      </w:pPr>
+      <w:r>
+        <w:rPr>
+          <w:rFonts w:ascii="Times New Roman" w:cs="Times New Roman" w:eastAsia="Times New Roman" w:hAnsi="Times New Roman"/>
+          <w:b/>
+          <w:bCs/>
+          <w:sz w:val="20"/>
+          <w:szCs w:val="20"/>
+        </w:rPr>
+        <w:t xml:space="preserve">Highnote</w:t>
+      </w:r>
+      <w:r>
+        <w:rPr>
+          <w:rFonts w:ascii="Times New Roman" w:cs="Times New Roman" w:eastAsia="Times New Roman" w:hAnsi="Times New Roman"/>
+          <w:sz w:val="20"/>
+          <w:szCs w:val="20"/>
+        </w:rPr>
+        <w:t xml:space="preserve"> · </w:t>
+      </w:r>
+      <w:r>
+        <w:rPr>
+          <w:rFonts w:ascii="Times New Roman" w:cs="Times New Roman" w:eastAsia="Times New Roman" w:hAnsi="Times New Roman"/>
+          <w:i/>
+          <w:iCs/>
+          <w:sz w:val="20"/>
+          <w:szCs w:val="20"/>
+        </w:rPr>
+        <w:t xml:space="preserve">Cybersecurity Engineer Intern</w:t>
+      </w:r>
+      <w:r>
+        <w:tab/>
+      </w:r>
+      <w:r>
+        <w:rPr>
+          <w:rFonts w:ascii="Times New Roman" w:cs="Times New Roman" w:eastAsia="Times New Roman" w:hAnsi="Times New Roman"/>
+          <w:sz w:val="20"/>
+          <w:szCs w:val="20"/>
+        </w:rPr>
+        <w:t xml:space="preserve">May – Jul 2024</w:t>
       </w:r>
     </w:p>
     <w:p>
@@ -1183,7 +1230,7 @@
           <w:sz w:val="20"/>
           <w:szCs w:val="20"/>
         </w:rPr>
-        <w:t xml:space="preserve">Bounded simulator error to 0.55% against independent references, and cut run time up to 64x with concurrency.</w:t>
+        <w:t xml:space="preserve">Designed and deployed the company-wide SIEM for a card-issuing fintech, unifying AWS, GCP, and Datadog telemetry into one Elasticsearch cluster ingesting over 1 TB/day, and wrote 100+ rule-based and ML anomaly detections.</w:t>
       </w:r>
     </w:p>
     <w:p>
@@ -1201,7 +1248,7 @@
           <w:sz w:val="20"/>
           <w:szCs w:val="20"/>
         </w:rPr>
-        <w:t xml:space="preserve">Highnote</w:t>
+        <w:t xml:space="preserve">Mindtrip</w:t>
       </w:r>
       <w:r>
         <w:rPr>
@@ -1219,7 +1266,7 @@
           <w:sz w:val="20"/>
           <w:szCs w:val="20"/>
         </w:rPr>
-        <w:t xml:space="preserve">Cybersecurity Engineer Intern</w:t>
+        <w:t xml:space="preserve">Software Engineer Intern</w:t>
       </w:r>
       <w:r>
         <w:tab/>
@@ -1230,7 +1277,7 @@
           <w:sz w:val="20"/>
           <w:szCs w:val="20"/>
         </w:rPr>
-        <w:t xml:space="preserve">May – Jul 2024</w:t>
+        <w:t xml:space="preserve">May – Jul 2023</w:t>
       </w:r>
     </w:p>
     <w:p>
@@ -1248,54 +1295,26 @@
           <w:sz w:val="20"/>
           <w:szCs w:val="20"/>
         </w:rPr>
-        <w:t xml:space="preserve">Designed and deployed the company-wide SIEM for a card-issuing fintech, unifying AWS, GCP, and Datadog telemetry into one Elasticsearch cluster ingesting over 1 TB/day, and wrote 100+ rule-based and ML anomaly detections.</w:t>
-      </w:r>
-    </w:p>
-    <w:p>
-      <w:pPr>
-        <w:tabs>
-          <w:tab w:val="right" w:pos="10800"/>
-        </w:tabs>
-        <w:spacing w:before="54" w:line="235" w:lineRule="exact"/>
-      </w:pPr>
-      <w:r>
-        <w:rPr>
-          <w:rFonts w:ascii="Times New Roman" w:cs="Times New Roman" w:eastAsia="Times New Roman" w:hAnsi="Times New Roman"/>
-          <w:b/>
-          <w:bCs/>
-          <w:sz w:val="20"/>
-          <w:szCs w:val="20"/>
-        </w:rPr>
-        <w:t xml:space="preserve">Mindtrip</w:t>
-      </w:r>
-      <w:r>
-        <w:rPr>
-          <w:rFonts w:ascii="Times New Roman" w:cs="Times New Roman" w:eastAsia="Times New Roman" w:hAnsi="Times New Roman"/>
-          <w:sz w:val="20"/>
-          <w:szCs w:val="20"/>
-        </w:rPr>
-        <w:t xml:space="preserve"> · </w:t>
-      </w:r>
-      <w:r>
-        <w:rPr>
-          <w:rFonts w:ascii="Times New Roman" w:cs="Times New Roman" w:eastAsia="Times New Roman" w:hAnsi="Times New Roman"/>
-          <w:i/>
-          <w:iCs/>
-          <w:sz w:val="20"/>
-          <w:szCs w:val="20"/>
-        </w:rPr>
-        <w:t xml:space="preserve">Software Engineer Intern</w:t>
-      </w:r>
-      <w:r>
-        <w:tab/>
-      </w:r>
-      <w:r>
-        <w:rPr>
-          <w:rFonts w:ascii="Times New Roman" w:cs="Times New Roman" w:eastAsia="Times New Roman" w:hAnsi="Times New Roman"/>
-          <w:sz w:val="20"/>
-          <w:szCs w:val="20"/>
-        </w:rPr>
-        <w:t xml:space="preserve">May – Jul 2023</w:t>
+        <w:t xml:space="preserve">Built internal admin and secure-query tooling in JavaScript and Rails via Retool, saving roughly 250 engineering hours a month.</w:t>
+      </w:r>
+    </w:p>
+    <w:p>
+      <w:pPr>
+        <w:pBdr>
+          <w:bottom w:val="single" w:color="000000" w:sz="6" w:space="1"/>
+        </w:pBdr>
+        <w:spacing w:after="16" w:before="100" w:line="235" w:lineRule="exact"/>
+      </w:pPr>
+      <w:r>
+        <w:rPr>
+          <w:rFonts w:ascii="Times New Roman" w:cs="Times New Roman" w:eastAsia="Times New Roman" w:hAnsi="Times New Roman"/>
+          <w:b/>
+          <w:bCs/>
+          <w:spacing w:val="16"/>
+          <w:sz w:val="19"/>
+          <w:szCs w:val="19"/>
+        </w:rPr>
+        <w:t xml:space="preserve">HONORS &amp; LEADERSHIP</w:t>
       </w:r>
     </w:p>
     <w:p>
@@ -1310,43 +1329,6 @@
       <w:r>
         <w:rPr>
           <w:rFonts w:ascii="Times New Roman" w:cs="Times New Roman" w:eastAsia="Times New Roman" w:hAnsi="Times New Roman"/>
-          <w:sz w:val="20"/>
-          <w:szCs w:val="20"/>
-        </w:rPr>
-        <w:t xml:space="preserve">Built internal admin and secure-query tooling in JavaScript and Rails via Retool, saving roughly 250 engineering hours a month.</w:t>
-      </w:r>
-    </w:p>
-    <w:p>
-      <w:pPr>
-        <w:pBdr>
-          <w:bottom w:val="single" w:color="000000" w:sz="6" w:space="1"/>
-        </w:pBdr>
-        <w:spacing w:after="16" w:before="100" w:line="235" w:lineRule="exact"/>
-      </w:pPr>
-      <w:r>
-        <w:rPr>
-          <w:rFonts w:ascii="Times New Roman" w:cs="Times New Roman" w:eastAsia="Times New Roman" w:hAnsi="Times New Roman"/>
-          <w:b/>
-          <w:bCs/>
-          <w:spacing w:val="16"/>
-          <w:sz w:val="19"/>
-          <w:szCs w:val="19"/>
-        </w:rPr>
-        <w:t xml:space="preserve">HONORS &amp; LEADERSHIP</w:t>
-      </w:r>
-    </w:p>
-    <w:p>
-      <w:pPr>
-        <w:pStyle w:val="ListParagraph"/>
-        <w:numPr>
-          <w:ilvl w:val="0"/>
-          <w:numId w:val="2"/>
-        </w:numPr>
-        <w:spacing w:before="12" w:line="235" w:lineRule="exact"/>
-      </w:pPr>
-      <w:r>
-        <w:rPr>
-          <w:rFonts w:ascii="Times New Roman" w:cs="Times New Roman" w:eastAsia="Times New Roman" w:hAnsi="Times New Roman"/>
           <w:b/>
           <w:bCs/>
           <w:sz w:val="20"/>
@@ -1443,10 +1425,20 @@
       <w:r>
         <w:rPr>
           <w:rFonts w:ascii="Times New Roman" w:cs="Times New Roman" w:eastAsia="Times New Roman" w:hAnsi="Times New Roman"/>
-          <w:sz w:val="20"/>
-          <w:szCs w:val="20"/>
-        </w:rPr>
-        <w:t xml:space="preserve">Qualified, NYU Abu Dhabi Hackathon for Social Good 2027</w:t>
+          <w:b/>
+          <w:bCs/>
+          <w:sz w:val="20"/>
+          <w:szCs w:val="20"/>
+        </w:rPr>
+        <w:t xml:space="preserve">Qualified</w:t>
+      </w:r>
+      <w:r>
+        <w:rPr>
+          <w:rFonts w:ascii="Times New Roman" w:cs="Times New Roman" w:eastAsia="Times New Roman" w:hAnsi="Times New Roman"/>
+          <w:sz w:val="20"/>
+          <w:szCs w:val="20"/>
+        </w:rPr>
+        <w:t xml:space="preserve">, NYU Abu Dhabi Hackathon for Social Good 2027</w:t>
       </w:r>
     </w:p>
     <w:p>

</xml_diff>

<commit_message>
AI Intern at Smack; three thresholds; say what the report is
Title corrected to AI Intern on both the résumé and the site. Cirq and
PennyLane are back in the tools row at Jasper's call.

The threshold bullet carried one number where the work produced three.
It now reads 3.2% with MWPM, 2.7% with Union-Find, and 14.7% under
code-capacity noise, which shows a sweep across two decoders and two
noise models rather than a single measurement. Same one line.

"Wrote the bounds the team works from" said nothing a reader could
picture. It is a report that regenerates when the physics changes, which
is concrete and is the part that outlives the internship. The reference
phrasing also sharpened: "outside its own tests" is the distinction the
whole study rests on, and "independent" alone did not carry it.

Co-Authored-By: Claude Opus 5 <noreply@anthropic.com>
Claude-Session: https://claude.ai/code/session_01EbsTbSDgvxSSfAYTVqmk9g
</commit_message>
<xml_diff>
--- a/resume/jaspersands_resume.docx
+++ b/resume/jaspersands_resume.docx
@@ -32,7 +32,7 @@
         </w:rPr>
         <w:t xml:space="preserve">Palo Alto, CA | (650) 924-8429 | </w:t>
       </w:r>
-      <w:hyperlink w:history="1" r:id="rIda4mjj1otbapjmlcj7wk4l">
+      <w:hyperlink w:history="1" r:id="rId2lvsdrjozdpwelyfthbk6">
         <w:r>
           <w:rPr>
             <w:rFonts w:ascii="Times New Roman" w:cs="Times New Roman" w:eastAsia="Times New Roman" w:hAnsi="Times New Roman"/>
@@ -50,7 +50,7 @@
         </w:rPr>
         <w:t xml:space="preserve"> | </w:t>
       </w:r>
-      <w:hyperlink w:history="1" r:id="rIdrbgfbi5ylxbepj_yhoaqe">
+      <w:hyperlink w:history="1" r:id="rIdaozmpznxmzomexdl4fdq7">
         <w:r>
           <w:rPr>
             <w:rFonts w:ascii="Times New Roman" w:cs="Times New Roman" w:eastAsia="Times New Roman" w:hAnsi="Times New Roman"/>
@@ -68,7 +68,7 @@
         </w:rPr>
         <w:t xml:space="preserve"> | </w:t>
       </w:r>
-      <w:hyperlink w:history="1" r:id="rIdpmmu79zyccmrz3ny8uaiu">
+      <w:hyperlink w:history="1" r:id="rIdn4xqqjbt-lmgd9iwyvhok">
         <w:r>
           <w:rPr>
             <w:rFonts w:ascii="Times New Roman" w:cs="Times New Roman" w:eastAsia="Times New Roman" w:hAnsi="Times New Roman"/>
@@ -86,7 +86,7 @@
         </w:rPr>
         <w:t xml:space="preserve"> | </w:t>
       </w:r>
-      <w:hyperlink w:history="1" r:id="rIdekvomvlpd_zbctejubpgg">
+      <w:hyperlink w:history="1" r:id="rIdmkjvni7rs6a8lshkgqlv3">
         <w:r>
           <w:rPr>
             <w:rFonts w:ascii="Times New Roman" w:cs="Times New Roman" w:eastAsia="Times New Roman" w:hAnsi="Times New Roman"/>
@@ -452,7 +452,7 @@
         </w:tabs>
         <w:spacing w:before="42" w:line="235" w:lineRule="exact"/>
       </w:pPr>
-      <w:hyperlink w:history="1" r:id="rIdbjjprniw16ao3wykv-_mo">
+      <w:hyperlink w:history="1" r:id="rId0xev0uudpv_pdmzcanmm6">
         <w:r>
           <w:rPr>
             <w:rFonts w:ascii="Times New Roman" w:cs="Times New Roman" w:eastAsia="Times New Roman" w:hAnsi="Times New Roman"/>
@@ -545,7 +545,7 @@
         </w:tabs>
         <w:spacing w:before="54" w:line="235" w:lineRule="exact"/>
       </w:pPr>
-      <w:hyperlink w:history="1" r:id="rIdcofi2zczx4nucfty1uz4s">
+      <w:hyperlink w:history="1" r:id="rId4bgbmok3qppwgoqaycfti">
         <w:r>
           <w:rPr>
             <w:rFonts w:ascii="Times New Roman" w:cs="Times New Roman" w:eastAsia="Times New Roman" w:hAnsi="Times New Roman"/>
@@ -586,7 +586,7 @@
       <w:r>
         <w:tab/>
       </w:r>
-      <w:hyperlink w:history="1" r:id="rIdzvxq7jx3aodgzcb9aou9c">
+      <w:hyperlink w:history="1" r:id="rIdvhsdxuntqpcwsd2zxmva2">
         <w:r>
           <w:rPr>
             <w:rFonts w:ascii="Times New Roman" w:cs="Times New Roman" w:eastAsia="Times New Roman" w:hAnsi="Times New Roman"/>
@@ -630,7 +630,7 @@
           <w:sz w:val="20"/>
           <w:szCs w:val="20"/>
         </w:rPr>
-        <w:t xml:space="preserve">Finite-size scaling puts the error threshold at 3.2% under phenomenological noise.</w:t>
+        <w:t xml:space="preserve">Finite-size scaling puts the threshold at 3.2% with MWPM, 2.7% with Union-Find, and 14.7% under code-capacity noise.</w:t>
       </w:r>
     </w:p>
     <w:p>
@@ -640,7 +640,7 @@
         </w:tabs>
         <w:spacing w:before="54" w:line="235" w:lineRule="exact"/>
       </w:pPr>
-      <w:hyperlink w:history="1" r:id="rIdn1kds0gmrk5txcmkrgasx">
+      <w:hyperlink w:history="1" r:id="rIdqirgyhgzfxj7irk3virgo">
         <w:r>
           <w:rPr>
             <w:rFonts w:ascii="Times New Roman" w:cs="Times New Roman" w:eastAsia="Times New Roman" w:hAnsi="Times New Roman"/>
@@ -663,7 +663,7 @@
       <w:r>
         <w:tab/>
       </w:r>
-      <w:hyperlink w:history="1" r:id="rIdfp8rnuzfzzephvvpuiwjm">
+      <w:hyperlink w:history="1" r:id="rIdiu2linx36u6smgda0hvvq">
         <w:r>
           <w:rPr>
             <w:rFonts w:ascii="Times New Roman" w:cs="Times New Roman" w:eastAsia="Times New Roman" w:hAnsi="Times New Roman"/>
@@ -717,7 +717,7 @@
         </w:tabs>
         <w:spacing w:before="54" w:line="235" w:lineRule="exact"/>
       </w:pPr>
-      <w:hyperlink w:history="1" r:id="rIdm9sjbnimdzpazjr4cz94h">
+      <w:hyperlink w:history="1" r:id="rIdbow06lqmdxa2tmyng5jwg">
         <w:r>
           <w:rPr>
             <w:rFonts w:ascii="Times New Roman" w:cs="Times New Roman" w:eastAsia="Times New Roman" w:hAnsi="Times New Roman"/>
@@ -1100,7 +1100,7 @@
           <w:sz w:val="20"/>
           <w:szCs w:val="20"/>
         </w:rPr>
-        <w:t xml:space="preserve">Software Engineer Intern</w:t>
+        <w:t xml:space="preserve">AI Intern</w:t>
       </w:r>
       <w:r>
         <w:tab/>
@@ -1165,7 +1165,7 @@
           <w:sz w:val="20"/>
           <w:szCs w:val="20"/>
         </w:rPr>
-        <w:t xml:space="preserve">Bounded simulator error to 0.55% against references chosen outside the simulator, and wrote the bounds the team works from.</w:t>
+        <w:t xml:space="preserve">Bounded simulator error to 0.55% against references outside its own tests, in a report that regenerates when the physics changes.</w:t>
       </w:r>
     </w:p>
     <w:p>
@@ -1509,7 +1509,7 @@
           <w:sz w:val="20"/>
           <w:szCs w:val="20"/>
         </w:rPr>
-        <w:t xml:space="preserve">Qiskit and Qiskit Runtime, CUDA-Q, Stim, PyMatching, QuTiP</w:t>
+        <w:t xml:space="preserve">Qiskit and Qiskit Runtime, Cirq, PennyLane, CUDA-Q, Stim, PyMatching, QuTiP</w:t>
       </w:r>
     </w:p>
     <w:p>

</xml_diff>

<commit_message>
Lead Research with the Diraq thesis; drop Desdr
The thesis was a one-line note buried in Education, which is the wrong
place for the most relevant research on the page. It is now the first
Research entry with room to say what the work actually is: automating
silicon spin qubit characterization, pipelines that acquire charge
measurements from cryogenic probing, and classification benchmarked
against expert reading.

Removing the Education note at the same time means the résumé states it
once rather than twice. On the site the Education line now points at the
Research entry instead of repeating it.

Desdr is out of the résumé. Foster Care stayed: with Desdr and the
Education note gone, the page had room for the thesis entry without it,
so there was no reason to spend it.

Co-Authored-By: Claude Opus 5 <noreply@anthropic.com>
Claude-Session: https://claude.ai/code/session_01EbsTbSDgvxSSfAYTVqmk9g
</commit_message>
<xml_diff>
--- a/resume/jaspersands_resume.docx
+++ b/resume/jaspersands_resume.docx
@@ -32,7 +32,7 @@
         </w:rPr>
         <w:t xml:space="preserve">Palo Alto, CA | (650) 924-8429 | </w:t>
       </w:r>
-      <w:hyperlink w:history="1" r:id="rId2lvsdrjozdpwelyfthbk6">
+      <w:hyperlink w:history="1" r:id="rIdohjplg_gz5vcfebdclnfe">
         <w:r>
           <w:rPr>
             <w:rFonts w:ascii="Times New Roman" w:cs="Times New Roman" w:eastAsia="Times New Roman" w:hAnsi="Times New Roman"/>
@@ -50,7 +50,7 @@
         </w:rPr>
         <w:t xml:space="preserve"> | </w:t>
       </w:r>
-      <w:hyperlink w:history="1" r:id="rIdaozmpznxmzomexdl4fdq7">
+      <w:hyperlink w:history="1" r:id="rIdubnsckhmrizybzea2gdlk">
         <w:r>
           <w:rPr>
             <w:rFonts w:ascii="Times New Roman" w:cs="Times New Roman" w:eastAsia="Times New Roman" w:hAnsi="Times New Roman"/>
@@ -68,7 +68,7 @@
         </w:rPr>
         <w:t xml:space="preserve"> | </w:t>
       </w:r>
-      <w:hyperlink w:history="1" r:id="rIdn4xqqjbt-lmgd9iwyvhok">
+      <w:hyperlink w:history="1" r:id="rIdrppjrpf_cpfjc8gwicyns">
         <w:r>
           <w:rPr>
             <w:rFonts w:ascii="Times New Roman" w:cs="Times New Roman" w:eastAsia="Times New Roman" w:hAnsi="Times New Roman"/>
@@ -86,7 +86,7 @@
         </w:rPr>
         <w:t xml:space="preserve"> | </w:t>
       </w:r>
-      <w:hyperlink w:history="1" r:id="rIdmkjvni7rs6a8lshkgqlv3">
+      <w:hyperlink w:history="1" r:id="rIdelmw-sjputps-5rc-a7s2">
         <w:r>
           <w:rPr>
             <w:rFonts w:ascii="Times New Roman" w:cs="Times New Roman" w:eastAsia="Times New Roman" w:hAnsi="Times New Roman"/>
@@ -195,29 +195,6 @@
           <w:sz w:val="20"/>
           <w:szCs w:val="20"/>
         </w:rPr>
-        <w:t xml:space="preserve">Thesis: </w:t>
-      </w:r>
-      <w:r>
-        <w:rPr>
-          <w:rFonts w:ascii="Times New Roman" w:cs="Times New Roman" w:eastAsia="Times New Roman" w:hAnsi="Times New Roman"/>
-          <w:sz w:val="20"/>
-          <w:szCs w:val="20"/>
-        </w:rPr>
-        <w:t xml:space="preserve">Automating silicon spin qubit measurement with machine learning. Diraq and UNSW Sydney, Sep 2026 – May 2027, co-supervised by Dr. Nard Dumoulin Stuyck and Dr. Henry Yuen.</w:t>
-      </w:r>
-    </w:p>
-    <w:p>
-      <w:pPr>
-        <w:spacing w:before="6" w:line="235" w:lineRule="exact"/>
-      </w:pPr>
-      <w:r>
-        <w:rPr>
-          <w:rFonts w:ascii="Times New Roman" w:cs="Times New Roman" w:eastAsia="Times New Roman" w:hAnsi="Times New Roman"/>
-          <w:b/>
-          <w:bCs/>
-          <w:sz w:val="20"/>
-          <w:szCs w:val="20"/>
-        </w:rPr>
         <w:t xml:space="preserve">Quantum coursework: </w:t>
       </w:r>
       <w:r>
@@ -452,7 +429,7 @@
         </w:tabs>
         <w:spacing w:before="42" w:line="235" w:lineRule="exact"/>
       </w:pPr>
-      <w:hyperlink w:history="1" r:id="rId0xev0uudpv_pdmzcanmm6">
+      <w:hyperlink w:history="1" r:id="rId4uuvsbtr_qqdzlv7u6h3u">
         <w:r>
           <w:rPr>
             <w:rFonts w:ascii="Times New Roman" w:cs="Times New Roman" w:eastAsia="Times New Roman" w:hAnsi="Times New Roman"/>
@@ -545,7 +522,7 @@
         </w:tabs>
         <w:spacing w:before="54" w:line="235" w:lineRule="exact"/>
       </w:pPr>
-      <w:hyperlink w:history="1" r:id="rId4bgbmok3qppwgoqaycfti">
+      <w:hyperlink w:history="1" r:id="rId8ejsnj6zjwjnh_jcg_lrh">
         <w:r>
           <w:rPr>
             <w:rFonts w:ascii="Times New Roman" w:cs="Times New Roman" w:eastAsia="Times New Roman" w:hAnsi="Times New Roman"/>
@@ -586,7 +563,7 @@
       <w:r>
         <w:tab/>
       </w:r>
-      <w:hyperlink w:history="1" r:id="rIdvhsdxuntqpcwsd2zxmva2">
+      <w:hyperlink w:history="1" r:id="rIdfdlfpjvaguhsiojrssnad">
         <w:r>
           <w:rPr>
             <w:rFonts w:ascii="Times New Roman" w:cs="Times New Roman" w:eastAsia="Times New Roman" w:hAnsi="Times New Roman"/>
@@ -640,7 +617,7 @@
         </w:tabs>
         <w:spacing w:before="54" w:line="235" w:lineRule="exact"/>
       </w:pPr>
-      <w:hyperlink w:history="1" r:id="rIdqirgyhgzfxj7irk3virgo">
+      <w:hyperlink w:history="1" r:id="rIdf7f_8ouiibn-7dzucz_sh">
         <w:r>
           <w:rPr>
             <w:rFonts w:ascii="Times New Roman" w:cs="Times New Roman" w:eastAsia="Times New Roman" w:hAnsi="Times New Roman"/>
@@ -663,7 +640,7 @@
       <w:r>
         <w:tab/>
       </w:r>
-      <w:hyperlink w:history="1" r:id="rIdiu2linx36u6smgda0hvvq">
+      <w:hyperlink w:history="1" r:id="rIdhmputhdhrvsx9cxr5io5n">
         <w:r>
           <w:rPr>
             <w:rFonts w:ascii="Times New Roman" w:cs="Times New Roman" w:eastAsia="Times New Roman" w:hAnsi="Times New Roman"/>
@@ -717,7 +694,7 @@
         </w:tabs>
         <w:spacing w:before="54" w:line="235" w:lineRule="exact"/>
       </w:pPr>
-      <w:hyperlink w:history="1" r:id="rIdbow06lqmdxa2tmyng5jwg">
+      <w:hyperlink w:history="1" r:id="rIdv1ovp6qxnanxvw4ubjd1b">
         <w:r>
           <w:rPr>
             <w:rFonts w:ascii="Times New Roman" w:cs="Times New Roman" w:eastAsia="Times New Roman" w:hAnsi="Times New Roman"/>
@@ -811,15 +788,7 @@
           <w:sz w:val="20"/>
           <w:szCs w:val="20"/>
         </w:rPr>
-        <w:t xml:space="preserve">Cidon Systems Research Lab</w:t>
-      </w:r>
-      <w:r>
-        <w:rPr>
-          <w:rFonts w:ascii="Times New Roman" w:cs="Times New Roman" w:eastAsia="Times New Roman" w:hAnsi="Times New Roman"/>
-          <w:sz w:val="20"/>
-          <w:szCs w:val="20"/>
-        </w:rPr>
-        <w:t xml:space="preserve">, Columbia University</w:t>
+        <w:t xml:space="preserve">Diraq / UNSW Sydney</w:t>
       </w:r>
       <w:r>
         <w:rPr>
@@ -837,7 +806,7 @@
           <w:sz w:val="20"/>
           <w:szCs w:val="20"/>
         </w:rPr>
-        <w:t xml:space="preserve">Graduate Researcher</w:t>
+        <w:t xml:space="preserve">MS Thesis Research</w:t>
       </w:r>
       <w:r>
         <w:tab/>
@@ -848,7 +817,7 @@
           <w:sz w:val="20"/>
           <w:szCs w:val="20"/>
         </w:rPr>
-        <w:t xml:space="preserve">Sep 2025 – Jun 2026</w:t>
+        <w:t xml:space="preserve">Sep 2026 – May 2027</w:t>
       </w:r>
     </w:p>
     <w:p>
@@ -866,62 +835,7 @@
           <w:sz w:val="20"/>
           <w:szCs w:val="20"/>
         </w:rPr>
-        <w:t xml:space="preserve">Built phishing and spam detection pipelines with Dr. Asaf Cidon and Barracuda Networks, combining language-model embeddings with production email telemetry and tuning for precision against a fixed false-positive budget.</w:t>
-      </w:r>
-    </w:p>
-    <w:p>
-      <w:pPr>
-        <w:tabs>
-          <w:tab w:val="right" w:pos="10800"/>
-        </w:tabs>
-        <w:spacing w:before="54" w:line="235" w:lineRule="exact"/>
-      </w:pPr>
-      <w:r>
-        <w:rPr>
-          <w:rFonts w:ascii="Times New Roman" w:cs="Times New Roman" w:eastAsia="Times New Roman" w:hAnsi="Times New Roman"/>
-          <w:b/>
-          <w:bCs/>
-          <w:sz w:val="20"/>
-          <w:szCs w:val="20"/>
-        </w:rPr>
-        <w:t xml:space="preserve">Complex Resilient Intelligent Systems Lab</w:t>
-      </w:r>
-      <w:r>
-        <w:rPr>
-          <w:rFonts w:ascii="Times New Roman" w:cs="Times New Roman" w:eastAsia="Times New Roman" w:hAnsi="Times New Roman"/>
-          <w:sz w:val="20"/>
-          <w:szCs w:val="20"/>
-        </w:rPr>
-        <w:t xml:space="preserve">, Columbia University</w:t>
-      </w:r>
-      <w:r>
-        <w:rPr>
-          <w:rFonts w:ascii="Times New Roman" w:cs="Times New Roman" w:eastAsia="Times New Roman" w:hAnsi="Times New Roman"/>
-          <w:sz w:val="20"/>
-          <w:szCs w:val="20"/>
-        </w:rPr>
-        <w:t xml:space="preserve"> · </w:t>
-      </w:r>
-      <w:r>
-        <w:rPr>
-          <w:rFonts w:ascii="Times New Roman" w:cs="Times New Roman" w:eastAsia="Times New Roman" w:hAnsi="Times New Roman"/>
-          <w:i/>
-          <w:iCs/>
-          <w:sz w:val="20"/>
-          <w:szCs w:val="20"/>
-        </w:rPr>
-        <w:t xml:space="preserve">Graduate Researcher</w:t>
-      </w:r>
-      <w:r>
-        <w:tab/>
-      </w:r>
-      <w:r>
-        <w:rPr>
-          <w:rFonts w:ascii="Times New Roman" w:cs="Times New Roman" w:eastAsia="Times New Roman" w:hAnsi="Times New Roman"/>
-          <w:sz w:val="20"/>
-          <w:szCs w:val="20"/>
-        </w:rPr>
-        <w:t xml:space="preserve">May – Dec 2025</w:t>
+        <w:t xml:space="preserve">Automating silicon spin qubit characterization under Dr. Nard Dumoulin Stuyck, replacing manual tuning and interpretation.</w:t>
       </w:r>
     </w:p>
     <w:p>
@@ -939,7 +853,7 @@
           <w:sz w:val="20"/>
           <w:szCs w:val="20"/>
         </w:rPr>
-        <w:t xml:space="preserve">Reduced hallucination in generative protein modeling under Dr. Venkat Venkatasubramanian, grounded in molecular graph data.</w:t>
+        <w:t xml:space="preserve">Pipelines to acquire charge measurements from cryogenic probing and classify device states, benchmarked against expert reading.</w:t>
       </w:r>
     </w:p>
     <w:p>
@@ -957,15 +871,15 @@
           <w:sz w:val="20"/>
           <w:szCs w:val="20"/>
         </w:rPr>
-        <w:t xml:space="preserve">Foster Care Policy Database</w:t>
-      </w:r>
-      <w:r>
-        <w:rPr>
-          <w:rFonts w:ascii="Times New Roman" w:cs="Times New Roman" w:eastAsia="Times New Roman" w:hAnsi="Times New Roman"/>
-          <w:sz w:val="20"/>
-          <w:szCs w:val="20"/>
-        </w:rPr>
-        <w:t xml:space="preserve">, Washington University in St. Louis</w:t>
+        <w:t xml:space="preserve">Cidon Systems Research Lab</w:t>
+      </w:r>
+      <w:r>
+        <w:rPr>
+          <w:rFonts w:ascii="Times New Roman" w:cs="Times New Roman" w:eastAsia="Times New Roman" w:hAnsi="Times New Roman"/>
+          <w:sz w:val="20"/>
+          <w:szCs w:val="20"/>
+        </w:rPr>
+        <w:t xml:space="preserve">, Columbia University</w:t>
       </w:r>
       <w:r>
         <w:rPr>
@@ -983,7 +897,7 @@
           <w:sz w:val="20"/>
           <w:szCs w:val="20"/>
         </w:rPr>
-        <w:t xml:space="preserve">Undergraduate Researcher</w:t>
+        <w:t xml:space="preserve">Graduate Researcher</w:t>
       </w:r>
       <w:r>
         <w:tab/>
@@ -994,7 +908,7 @@
           <w:sz w:val="20"/>
           <w:szCs w:val="20"/>
         </w:rPr>
-        <w:t xml:space="preserve">Sep 2024 – Jun 2025</w:t>
+        <w:t xml:space="preserve">Sep 2025 – Jun 2026</w:t>
       </w:r>
     </w:p>
     <w:p>
@@ -1012,40 +926,153 @@
           <w:sz w:val="20"/>
           <w:szCs w:val="20"/>
         </w:rPr>
+        <w:t xml:space="preserve">Built phishing and spam detection pipelines with Dr. Asaf Cidon and Barracuda Networks, combining language-model embeddings with production email telemetry and tuning for precision against a fixed false-positive budget.</w:t>
+      </w:r>
+    </w:p>
+    <w:p>
+      <w:pPr>
+        <w:tabs>
+          <w:tab w:val="right" w:pos="10800"/>
+        </w:tabs>
+        <w:spacing w:before="54" w:line="235" w:lineRule="exact"/>
+      </w:pPr>
+      <w:r>
+        <w:rPr>
+          <w:rFonts w:ascii="Times New Roman" w:cs="Times New Roman" w:eastAsia="Times New Roman" w:hAnsi="Times New Roman"/>
+          <w:b/>
+          <w:bCs/>
+          <w:sz w:val="20"/>
+          <w:szCs w:val="20"/>
+        </w:rPr>
+        <w:t xml:space="preserve">Complex Resilient Intelligent Systems Lab</w:t>
+      </w:r>
+      <w:r>
+        <w:rPr>
+          <w:rFonts w:ascii="Times New Roman" w:cs="Times New Roman" w:eastAsia="Times New Roman" w:hAnsi="Times New Roman"/>
+          <w:sz w:val="20"/>
+          <w:szCs w:val="20"/>
+        </w:rPr>
+        <w:t xml:space="preserve">, Columbia University</w:t>
+      </w:r>
+      <w:r>
+        <w:rPr>
+          <w:rFonts w:ascii="Times New Roman" w:cs="Times New Roman" w:eastAsia="Times New Roman" w:hAnsi="Times New Roman"/>
+          <w:sz w:val="20"/>
+          <w:szCs w:val="20"/>
+        </w:rPr>
+        <w:t xml:space="preserve"> · </w:t>
+      </w:r>
+      <w:r>
+        <w:rPr>
+          <w:rFonts w:ascii="Times New Roman" w:cs="Times New Roman" w:eastAsia="Times New Roman" w:hAnsi="Times New Roman"/>
+          <w:i/>
+          <w:iCs/>
+          <w:sz w:val="20"/>
+          <w:szCs w:val="20"/>
+        </w:rPr>
+        <w:t xml:space="preserve">Graduate Researcher</w:t>
+      </w:r>
+      <w:r>
+        <w:tab/>
+      </w:r>
+      <w:r>
+        <w:rPr>
+          <w:rFonts w:ascii="Times New Roman" w:cs="Times New Roman" w:eastAsia="Times New Roman" w:hAnsi="Times New Roman"/>
+          <w:sz w:val="20"/>
+          <w:szCs w:val="20"/>
+        </w:rPr>
+        <w:t xml:space="preserve">May – Dec 2025</w:t>
+      </w:r>
+    </w:p>
+    <w:p>
+      <w:pPr>
+        <w:pStyle w:val="ListParagraph"/>
+        <w:numPr>
+          <w:ilvl w:val="0"/>
+          <w:numId w:val="2"/>
+        </w:numPr>
+        <w:spacing w:before="12" w:line="235" w:lineRule="exact"/>
+      </w:pPr>
+      <w:r>
+        <w:rPr>
+          <w:rFonts w:ascii="Times New Roman" w:cs="Times New Roman" w:eastAsia="Times New Roman" w:hAnsi="Times New Roman"/>
+          <w:sz w:val="20"/>
+          <w:szCs w:val="20"/>
+        </w:rPr>
+        <w:t xml:space="preserve">Reduced hallucination in generative protein modeling under Dr. Venkat Venkatasubramanian, grounded in molecular graph data.</w:t>
+      </w:r>
+    </w:p>
+    <w:p>
+      <w:pPr>
+        <w:tabs>
+          <w:tab w:val="right" w:pos="10800"/>
+        </w:tabs>
+        <w:spacing w:before="54" w:line="235" w:lineRule="exact"/>
+      </w:pPr>
+      <w:r>
+        <w:rPr>
+          <w:rFonts w:ascii="Times New Roman" w:cs="Times New Roman" w:eastAsia="Times New Roman" w:hAnsi="Times New Roman"/>
+          <w:b/>
+          <w:bCs/>
+          <w:sz w:val="20"/>
+          <w:szCs w:val="20"/>
+        </w:rPr>
+        <w:t xml:space="preserve">Foster Care Policy Database</w:t>
+      </w:r>
+      <w:r>
+        <w:rPr>
+          <w:rFonts w:ascii="Times New Roman" w:cs="Times New Roman" w:eastAsia="Times New Roman" w:hAnsi="Times New Roman"/>
+          <w:sz w:val="20"/>
+          <w:szCs w:val="20"/>
+        </w:rPr>
+        <w:t xml:space="preserve">, Washington University in St. Louis</w:t>
+      </w:r>
+      <w:r>
+        <w:rPr>
+          <w:rFonts w:ascii="Times New Roman" w:cs="Times New Roman" w:eastAsia="Times New Roman" w:hAnsi="Times New Roman"/>
+          <w:sz w:val="20"/>
+          <w:szCs w:val="20"/>
+        </w:rPr>
+        <w:t xml:space="preserve"> · </w:t>
+      </w:r>
+      <w:r>
+        <w:rPr>
+          <w:rFonts w:ascii="Times New Roman" w:cs="Times New Roman" w:eastAsia="Times New Roman" w:hAnsi="Times New Roman"/>
+          <w:i/>
+          <w:iCs/>
+          <w:sz w:val="20"/>
+          <w:szCs w:val="20"/>
+        </w:rPr>
+        <w:t xml:space="preserve">Undergraduate Researcher</w:t>
+      </w:r>
+      <w:r>
+        <w:tab/>
+      </w:r>
+      <w:r>
+        <w:rPr>
+          <w:rFonts w:ascii="Times New Roman" w:cs="Times New Roman" w:eastAsia="Times New Roman" w:hAnsi="Times New Roman"/>
+          <w:sz w:val="20"/>
+          <w:szCs w:val="20"/>
+        </w:rPr>
+        <w:t xml:space="preserve">Sep 2024 – Jun 2025</w:t>
+      </w:r>
+    </w:p>
+    <w:p>
+      <w:pPr>
+        <w:pStyle w:val="ListParagraph"/>
+        <w:numPr>
+          <w:ilvl w:val="0"/>
+          <w:numId w:val="2"/>
+        </w:numPr>
+        <w:spacing w:before="12" w:line="235" w:lineRule="exact"/>
+      </w:pPr>
+      <w:r>
+        <w:rPr>
+          <w:rFonts w:ascii="Times New Roman" w:cs="Times New Roman" w:eastAsia="Times New Roman" w:hAnsi="Times New Roman"/>
+          <w:sz w:val="20"/>
+          <w:szCs w:val="20"/>
+        </w:rPr>
         <w:t xml:space="preserve">Fine-tuned LLaMA-3 with Hugging Face for QA over 50k foster-care policy documents, with human-in-the-loop feedback.</w:t>
-      </w:r>
-    </w:p>
-    <w:p>
-      <w:pPr>
-        <w:spacing w:before="42" w:line="235" w:lineRule="exact"/>
-      </w:pPr>
-      <w:r>
-        <w:rPr>
-          <w:rFonts w:ascii="Times New Roman" w:cs="Times New Roman" w:eastAsia="Times New Roman" w:hAnsi="Times New Roman"/>
-          <w:b/>
-          <w:bCs/>
-          <w:sz w:val="20"/>
-          <w:szCs w:val="20"/>
-        </w:rPr>
-        <w:t xml:space="preserve">Also: </w:t>
-      </w:r>
-      <w:r>
-        <w:rPr>
-          <w:rFonts w:ascii="Times New Roman" w:cs="Times New Roman" w:eastAsia="Times New Roman" w:hAnsi="Times New Roman"/>
-          <w:b/>
-          <w:bCs/>
-          <w:sz w:val="20"/>
-          <w:szCs w:val="20"/>
-        </w:rPr>
-        <w:t xml:space="preserve">Desdr Open Insurance Toolkit</w:t>
-      </w:r>
-      <w:r>
-        <w:rPr>
-          <w:rFonts w:ascii="Times New Roman" w:cs="Times New Roman" w:eastAsia="Times New Roman" w:hAnsi="Times New Roman"/>
-          <w:sz w:val="20"/>
-          <w:szCs w:val="20"/>
-        </w:rPr>
-        <w:t xml:space="preserve">, Columbia (Dr. Eugene Wu, Sep–Dec 2025): actuarial and climate-risk modeling.</w:t>
       </w:r>
     </w:p>
     <w:p>

</xml_diff>

<commit_message>
Thesis ends June 2027; say what the expert comparison is
"Benchmarked against expert reading" was jargon standing in for the
comparison the proposal actually describes: classifying device states
and checking that against manual expert interpretation. It now says what
it means, "against what an expert would call by hand", still on one
line.

Thesis end date corrected to June 2027 on the résumé and the site. The
Columbia degree line still reads May 2027, which is a separate date and
is left alone.

Education names the thesis again without costing a line: the TA line had
room, so it now carries "MS thesis at Diraq and UNSW Sydney" while the
Research entry keeps the detail.

Co-Authored-By: Claude Opus 5 <noreply@anthropic.com>
Claude-Session: https://claude.ai/code/session_01EbsTbSDgvxSSfAYTVqmk9g
</commit_message>
<xml_diff>
--- a/resume/jaspersands_resume.docx
+++ b/resume/jaspersands_resume.docx
@@ -32,7 +32,7 @@
         </w:rPr>
         <w:t xml:space="preserve">Palo Alto, CA | (650) 924-8429 | </w:t>
       </w:r>
-      <w:hyperlink w:history="1" r:id="rIdohjplg_gz5vcfebdclnfe">
+      <w:hyperlink w:history="1" r:id="rIdamj1rzydnvgwzh1m9z1j_">
         <w:r>
           <w:rPr>
             <w:rFonts w:ascii="Times New Roman" w:cs="Times New Roman" w:eastAsia="Times New Roman" w:hAnsi="Times New Roman"/>
@@ -50,7 +50,7 @@
         </w:rPr>
         <w:t xml:space="preserve"> | </w:t>
       </w:r>
-      <w:hyperlink w:history="1" r:id="rIdubnsckhmrizybzea2gdlk">
+      <w:hyperlink w:history="1" r:id="rIdiobw21yv6i-djhnajookv">
         <w:r>
           <w:rPr>
             <w:rFonts w:ascii="Times New Roman" w:cs="Times New Roman" w:eastAsia="Times New Roman" w:hAnsi="Times New Roman"/>
@@ -68,7 +68,7 @@
         </w:rPr>
         <w:t xml:space="preserve"> | </w:t>
       </w:r>
-      <w:hyperlink w:history="1" r:id="rIdrppjrpf_cpfjc8gwicyns">
+      <w:hyperlink w:history="1" r:id="rIdtekq5dz944ag_3oqjieqn">
         <w:r>
           <w:rPr>
             <w:rFonts w:ascii="Times New Roman" w:cs="Times New Roman" w:eastAsia="Times New Roman" w:hAnsi="Times New Roman"/>
@@ -86,7 +86,7 @@
         </w:rPr>
         <w:t xml:space="preserve"> | </w:t>
       </w:r>
-      <w:hyperlink w:history="1" r:id="rIdelmw-sjputps-5rc-a7s2">
+      <w:hyperlink w:history="1" r:id="rIdgzry6vijmplo1phqcyxaz">
         <w:r>
           <w:rPr>
             <w:rFonts w:ascii="Times New Roman" w:cs="Times New Roman" w:eastAsia="Times New Roman" w:hAnsi="Times New Roman"/>
@@ -274,7 +274,25 @@
           <w:sz w:val="20"/>
           <w:szCs w:val="20"/>
         </w:rPr>
-        <w:t xml:space="preserve">Introduction to Quantum Computing.</w:t>
+        <w:t xml:space="preserve">Introduction to Quantum Computing. </w:t>
+      </w:r>
+      <w:r>
+        <w:rPr>
+          <w:rFonts w:ascii="Times New Roman" w:cs="Times New Roman" w:eastAsia="Times New Roman" w:hAnsi="Times New Roman"/>
+          <w:b/>
+          <w:bCs/>
+          <w:sz w:val="20"/>
+          <w:szCs w:val="20"/>
+        </w:rPr>
+        <w:t xml:space="preserve">MS thesis</w:t>
+      </w:r>
+      <w:r>
+        <w:rPr>
+          <w:rFonts w:ascii="Times New Roman" w:cs="Times New Roman" w:eastAsia="Times New Roman" w:hAnsi="Times New Roman"/>
+          <w:sz w:val="20"/>
+          <w:szCs w:val="20"/>
+        </w:rPr>
+        <w:t xml:space="preserve"> at Diraq and UNSW Sydney.</w:t>
       </w:r>
     </w:p>
     <w:p>
@@ -429,7 +447,7 @@
         </w:tabs>
         <w:spacing w:before="42" w:line="235" w:lineRule="exact"/>
       </w:pPr>
-      <w:hyperlink w:history="1" r:id="rId4uuvsbtr_qqdzlv7u6h3u">
+      <w:hyperlink w:history="1" r:id="rIda-0grgnhk1kougj5pec_h">
         <w:r>
           <w:rPr>
             <w:rFonts w:ascii="Times New Roman" w:cs="Times New Roman" w:eastAsia="Times New Roman" w:hAnsi="Times New Roman"/>
@@ -522,7 +540,7 @@
         </w:tabs>
         <w:spacing w:before="54" w:line="235" w:lineRule="exact"/>
       </w:pPr>
-      <w:hyperlink w:history="1" r:id="rId8ejsnj6zjwjnh_jcg_lrh">
+      <w:hyperlink w:history="1" r:id="rId1hhgwoncn9j-hdl52vgrt">
         <w:r>
           <w:rPr>
             <w:rFonts w:ascii="Times New Roman" w:cs="Times New Roman" w:eastAsia="Times New Roman" w:hAnsi="Times New Roman"/>
@@ -563,7 +581,7 @@
       <w:r>
         <w:tab/>
       </w:r>
-      <w:hyperlink w:history="1" r:id="rIdfdlfpjvaguhsiojrssnad">
+      <w:hyperlink w:history="1" r:id="rIdkqmxbh3jhxd-ehuxrok7e">
         <w:r>
           <w:rPr>
             <w:rFonts w:ascii="Times New Roman" w:cs="Times New Roman" w:eastAsia="Times New Roman" w:hAnsi="Times New Roman"/>
@@ -617,7 +635,7 @@
         </w:tabs>
         <w:spacing w:before="54" w:line="235" w:lineRule="exact"/>
       </w:pPr>
-      <w:hyperlink w:history="1" r:id="rIdf7f_8ouiibn-7dzucz_sh">
+      <w:hyperlink w:history="1" r:id="rId5gjqbgwvogilzlgbdoysv">
         <w:r>
           <w:rPr>
             <w:rFonts w:ascii="Times New Roman" w:cs="Times New Roman" w:eastAsia="Times New Roman" w:hAnsi="Times New Roman"/>
@@ -640,7 +658,7 @@
       <w:r>
         <w:tab/>
       </w:r>
-      <w:hyperlink w:history="1" r:id="rIdhmputhdhrvsx9cxr5io5n">
+      <w:hyperlink w:history="1" r:id="rIdlf7l139-vf-x7cegve2uc">
         <w:r>
           <w:rPr>
             <w:rFonts w:ascii="Times New Roman" w:cs="Times New Roman" w:eastAsia="Times New Roman" w:hAnsi="Times New Roman"/>
@@ -694,7 +712,7 @@
         </w:tabs>
         <w:spacing w:before="54" w:line="235" w:lineRule="exact"/>
       </w:pPr>
-      <w:hyperlink w:history="1" r:id="rIdv1ovp6qxnanxvw4ubjd1b">
+      <w:hyperlink w:history="1" r:id="rIdihzgupvzaqy3zjsp-ak79">
         <w:r>
           <w:rPr>
             <w:rFonts w:ascii="Times New Roman" w:cs="Times New Roman" w:eastAsia="Times New Roman" w:hAnsi="Times New Roman"/>
@@ -817,7 +835,7 @@
           <w:sz w:val="20"/>
           <w:szCs w:val="20"/>
         </w:rPr>
-        <w:t xml:space="preserve">Sep 2026 – May 2027</w:t>
+        <w:t xml:space="preserve">Sep 2026 – Jun 2027</w:t>
       </w:r>
     </w:p>
     <w:p>
@@ -853,7 +871,7 @@
           <w:sz w:val="20"/>
           <w:szCs w:val="20"/>
         </w:rPr>
-        <w:t xml:space="preserve">Pipelines to acquire charge measurements from cryogenic probing and classify device states, benchmarked against expert reading.</w:t>
+        <w:t xml:space="preserve">Acquiring charge measurements from cryogenic probing, and classifying device states against what an expert would call by hand.</w:t>
       </w:r>
     </w:p>
     <w:p>

</xml_diff>

<commit_message>
Raise the two elements that were still under body size
Section headings were set at 9.67pt, smaller than the 10pt body they
head. Bold uppercase letterspacing hid it, but a heading below body size
is backwards. They are 10.5pt now, so the hierarchy reads as intended
rather than as an accident of fitting.

The contact strip was 8.99pt, the smallest text on the page by some
margin, and it carries the phone number and address someone actually has
to read. It is 9.7pt now, still one line.

Everything else was already at 10pt: 125 of the 143 text runs. The
rendered sizes are now name 19.2, headings 10.5, body 10, contact 9.7.
The .docx matches at 10.5 and 9.5, since Word measures in half-points
and cannot express 9.7.

Page sits at 99.1%.

Co-Authored-By: Claude Opus 5 <noreply@anthropic.com>
Claude-Session: https://claude.ai/code/session_01EbsTbSDgvxSSfAYTVqmk9g
</commit_message>
<xml_diff>
--- a/resume/jaspersands_resume.docx
+++ b/resume/jaspersands_resume.docx
@@ -27,17 +27,17 @@
       <w:r>
         <w:rPr>
           <w:rFonts w:ascii="Times New Roman" w:cs="Times New Roman" w:eastAsia="Times New Roman" w:hAnsi="Times New Roman"/>
-          <w:sz w:val="18"/>
-          <w:szCs w:val="18"/>
+          <w:sz w:val="19"/>
+          <w:szCs w:val="19"/>
         </w:rPr>
         <w:t xml:space="preserve">Palo Alto, CA | (650) 924-8429 | </w:t>
       </w:r>
-      <w:hyperlink w:history="1" r:id="rIdamj1rzydnvgwzh1m9z1j_">
+      <w:hyperlink w:history="1" r:id="rIdnd4slh0nokc1h7crmafh4">
         <w:r>
           <w:rPr>
             <w:rFonts w:ascii="Times New Roman" w:cs="Times New Roman" w:eastAsia="Times New Roman" w:hAnsi="Times New Roman"/>
-            <w:sz w:val="18"/>
-            <w:szCs w:val="18"/>
+            <w:sz w:val="19"/>
+            <w:szCs w:val="19"/>
           </w:rPr>
           <w:t xml:space="preserve">jaspersands02@gmail.com</w:t>
         </w:r>
@@ -45,17 +45,17 @@
       <w:r>
         <w:rPr>
           <w:rFonts w:ascii="Times New Roman" w:cs="Times New Roman" w:eastAsia="Times New Roman" w:hAnsi="Times New Roman"/>
-          <w:sz w:val="18"/>
-          <w:szCs w:val="18"/>
+          <w:sz w:val="19"/>
+          <w:szCs w:val="19"/>
         </w:rPr>
         <w:t xml:space="preserve"> | </w:t>
       </w:r>
-      <w:hyperlink w:history="1" r:id="rIdiobw21yv6i-djhnajookv">
+      <w:hyperlink w:history="1" r:id="rId3zqgfgz63eeyayudjbjvv">
         <w:r>
           <w:rPr>
             <w:rFonts w:ascii="Times New Roman" w:cs="Times New Roman" w:eastAsia="Times New Roman" w:hAnsi="Times New Roman"/>
-            <w:sz w:val="18"/>
-            <w:szCs w:val="18"/>
+            <w:sz w:val="19"/>
+            <w:szCs w:val="19"/>
           </w:rPr>
           <w:t xml:space="preserve">jaspersands.com</w:t>
         </w:r>
@@ -63,17 +63,17 @@
       <w:r>
         <w:rPr>
           <w:rFonts w:ascii="Times New Roman" w:cs="Times New Roman" w:eastAsia="Times New Roman" w:hAnsi="Times New Roman"/>
-          <w:sz w:val="18"/>
-          <w:szCs w:val="18"/>
+          <w:sz w:val="19"/>
+          <w:szCs w:val="19"/>
         </w:rPr>
         <w:t xml:space="preserve"> | </w:t>
       </w:r>
-      <w:hyperlink w:history="1" r:id="rIdtekq5dz944ag_3oqjieqn">
+      <w:hyperlink w:history="1" r:id="rId708artcqzzmvjtpvrx-xb">
         <w:r>
           <w:rPr>
             <w:rFonts w:ascii="Times New Roman" w:cs="Times New Roman" w:eastAsia="Times New Roman" w:hAnsi="Times New Roman"/>
-            <w:sz w:val="18"/>
-            <w:szCs w:val="18"/>
+            <w:sz w:val="19"/>
+            <w:szCs w:val="19"/>
           </w:rPr>
           <w:t xml:space="preserve">github.com/Jaspersands</w:t>
         </w:r>
@@ -81,17 +81,17 @@
       <w:r>
         <w:rPr>
           <w:rFonts w:ascii="Times New Roman" w:cs="Times New Roman" w:eastAsia="Times New Roman" w:hAnsi="Times New Roman"/>
-          <w:sz w:val="18"/>
-          <w:szCs w:val="18"/>
+          <w:sz w:val="19"/>
+          <w:szCs w:val="19"/>
         </w:rPr>
         <w:t xml:space="preserve"> | </w:t>
       </w:r>
-      <w:hyperlink w:history="1" r:id="rIdgzry6vijmplo1phqcyxaz">
+      <w:hyperlink w:history="1" r:id="rIdy7p3r3yxqpeud5f41afgp">
         <w:r>
           <w:rPr>
             <w:rFonts w:ascii="Times New Roman" w:cs="Times New Roman" w:eastAsia="Times New Roman" w:hAnsi="Times New Roman"/>
-            <w:sz w:val="18"/>
-            <w:szCs w:val="18"/>
+            <w:sz w:val="19"/>
+            <w:szCs w:val="19"/>
           </w:rPr>
           <w:t xml:space="preserve">linkedin.com/in/jaspersands</w:t>
         </w:r>
@@ -124,8 +124,8 @@
           <w:b/>
           <w:bCs/>
           <w:spacing w:val="16"/>
-          <w:sz w:val="19"/>
-          <w:szCs w:val="19"/>
+          <w:sz w:val="21"/>
+          <w:szCs w:val="21"/>
         </w:rPr>
         <w:t xml:space="preserve">EDUCATION</w:t>
       </w:r>
@@ -434,8 +434,8 @@
           <w:b/>
           <w:bCs/>
           <w:spacing w:val="16"/>
-          <w:sz w:val="19"/>
-          <w:szCs w:val="19"/>
+          <w:sz w:val="21"/>
+          <w:szCs w:val="21"/>
         </w:rPr>
         <w:t xml:space="preserve">SELECTED PROJECTS</w:t>
       </w:r>
@@ -447,7 +447,7 @@
         </w:tabs>
         <w:spacing w:before="42" w:line="235" w:lineRule="exact"/>
       </w:pPr>
-      <w:hyperlink w:history="1" r:id="rIda-0grgnhk1kougj5pec_h">
+      <w:hyperlink w:history="1" r:id="rIdmtlmvtfzys8hgwcmvkejq">
         <w:r>
           <w:rPr>
             <w:rFonts w:ascii="Times New Roman" w:cs="Times New Roman" w:eastAsia="Times New Roman" w:hAnsi="Times New Roman"/>
@@ -540,7 +540,7 @@
         </w:tabs>
         <w:spacing w:before="54" w:line="235" w:lineRule="exact"/>
       </w:pPr>
-      <w:hyperlink w:history="1" r:id="rId1hhgwoncn9j-hdl52vgrt">
+      <w:hyperlink w:history="1" r:id="rIdl7n8klvl2-hspwovw3bmv">
         <w:r>
           <w:rPr>
             <w:rFonts w:ascii="Times New Roman" w:cs="Times New Roman" w:eastAsia="Times New Roman" w:hAnsi="Times New Roman"/>
@@ -581,7 +581,7 @@
       <w:r>
         <w:tab/>
       </w:r>
-      <w:hyperlink w:history="1" r:id="rIdkqmxbh3jhxd-ehuxrok7e">
+      <w:hyperlink w:history="1" r:id="rIdmobz5e6olb4oevvm926k8">
         <w:r>
           <w:rPr>
             <w:rFonts w:ascii="Times New Roman" w:cs="Times New Roman" w:eastAsia="Times New Roman" w:hAnsi="Times New Roman"/>
@@ -635,7 +635,7 @@
         </w:tabs>
         <w:spacing w:before="54" w:line="235" w:lineRule="exact"/>
       </w:pPr>
-      <w:hyperlink w:history="1" r:id="rId5gjqbgwvogilzlgbdoysv">
+      <w:hyperlink w:history="1" r:id="rIdcejlzjfsgoxykysh4zkgp">
         <w:r>
           <w:rPr>
             <w:rFonts w:ascii="Times New Roman" w:cs="Times New Roman" w:eastAsia="Times New Roman" w:hAnsi="Times New Roman"/>
@@ -658,7 +658,7 @@
       <w:r>
         <w:tab/>
       </w:r>
-      <w:hyperlink w:history="1" r:id="rIdlf7l139-vf-x7cegve2uc">
+      <w:hyperlink w:history="1" r:id="rIdctgjksanauli0fcqunirc">
         <w:r>
           <w:rPr>
             <w:rFonts w:ascii="Times New Roman" w:cs="Times New Roman" w:eastAsia="Times New Roman" w:hAnsi="Times New Roman"/>
@@ -712,7 +712,7 @@
         </w:tabs>
         <w:spacing w:before="54" w:line="235" w:lineRule="exact"/>
       </w:pPr>
-      <w:hyperlink w:history="1" r:id="rIdihzgupvzaqy3zjsp-ak79">
+      <w:hyperlink w:history="1" r:id="rIdbzokex9i-33bmb-gswmyj">
         <w:r>
           <w:rPr>
             <w:rFonts w:ascii="Times New Roman" w:cs="Times New Roman" w:eastAsia="Times New Roman" w:hAnsi="Times New Roman"/>
@@ -785,8 +785,8 @@
           <w:b/>
           <w:bCs/>
           <w:spacing w:val="16"/>
-          <w:sz w:val="19"/>
-          <w:szCs w:val="19"/>
+          <w:sz w:val="21"/>
+          <w:szCs w:val="21"/>
         </w:rPr>
         <w:t xml:space="preserve">RESEARCH</w:t>
       </w:r>
@@ -1106,8 +1106,8 @@
           <w:b/>
           <w:bCs/>
           <w:spacing w:val="16"/>
-          <w:sz w:val="19"/>
-          <w:szCs w:val="19"/>
+          <w:sz w:val="21"/>
+          <w:szCs w:val="21"/>
         </w:rPr>
         <w:t xml:space="preserve">EXPERIENCE</w:t>
       </w:r>
@@ -1356,8 +1356,8 @@
           <w:b/>
           <w:bCs/>
           <w:spacing w:val="16"/>
-          <w:sz w:val="19"/>
-          <w:szCs w:val="19"/>
+          <w:sz w:val="21"/>
+          <w:szCs w:val="21"/>
         </w:rPr>
         <w:t xml:space="preserve">HONORS &amp; LEADERSHIP</w:t>
       </w:r>
@@ -1527,8 +1527,8 @@
           <w:b/>
           <w:bCs/>
           <w:spacing w:val="16"/>
-          <w:sz w:val="19"/>
-          <w:szCs w:val="19"/>
+          <w:sz w:val="21"/>
+          <w:szCs w:val="21"/>
         </w:rPr>
         <w:t xml:space="preserve">SKILLS</w:t>
       </w:r>

</xml_diff>

<commit_message>
Fix a scrambled PDF text layer that hid every bullet from parsers
li was position:relative with an absolutely positioned ::before marker.
That makes each li its own paint layer, and Chromium writes those to the
PDF content stream last, so the extracted text ran: every section
heading and entry title, then Skills, then all 21 bullets in a block at
the end. HONORS & LEADERSHIP extracted as an empty section, and no
bullet sat anywhere near the job it belonged to.

Anything reading the text layer rather than the pixels, which includes
applicant tracking systems, would have attributed the wrong achievements
to the wrong roles or dropped them entirely.

Replaced with a plain hanging indent: padding-left plus a negative
text-indent, marker as inline ::before content. Identical rendering,
identical page height, and the text layer now reads in document order.

Co-Authored-By: Claude Opus 5 <noreply@anthropic.com>
Claude-Session: https://claude.ai/code/session_01EbsTbSDgvxSSfAYTVqmk9g
</commit_message>
<xml_diff>
--- a/resume/jaspersands_resume.docx
+++ b/resume/jaspersands_resume.docx
@@ -32,7 +32,7 @@
         </w:rPr>
         <w:t xml:space="preserve">Palo Alto, CA | (650) 924-8429 | </w:t>
       </w:r>
-      <w:hyperlink w:history="1" r:id="rIdnd4slh0nokc1h7crmafh4">
+      <w:hyperlink w:history="1" r:id="rIdyey4zq4exqmnfjnjctklo">
         <w:r>
           <w:rPr>
             <w:rFonts w:ascii="Times New Roman" w:cs="Times New Roman" w:eastAsia="Times New Roman" w:hAnsi="Times New Roman"/>
@@ -50,7 +50,7 @@
         </w:rPr>
         <w:t xml:space="preserve"> | </w:t>
       </w:r>
-      <w:hyperlink w:history="1" r:id="rId3zqgfgz63eeyayudjbjvv">
+      <w:hyperlink w:history="1" r:id="rIdoed8iwoj3kbh5cbobe3cw">
         <w:r>
           <w:rPr>
             <w:rFonts w:ascii="Times New Roman" w:cs="Times New Roman" w:eastAsia="Times New Roman" w:hAnsi="Times New Roman"/>
@@ -68,7 +68,7 @@
         </w:rPr>
         <w:t xml:space="preserve"> | </w:t>
       </w:r>
-      <w:hyperlink w:history="1" r:id="rId708artcqzzmvjtpvrx-xb">
+      <w:hyperlink w:history="1" r:id="rIdvpewdsedezpzlqlkacvoj">
         <w:r>
           <w:rPr>
             <w:rFonts w:ascii="Times New Roman" w:cs="Times New Roman" w:eastAsia="Times New Roman" w:hAnsi="Times New Roman"/>
@@ -86,7 +86,7 @@
         </w:rPr>
         <w:t xml:space="preserve"> | </w:t>
       </w:r>
-      <w:hyperlink w:history="1" r:id="rIdy7p3r3yxqpeud5f41afgp">
+      <w:hyperlink w:history="1" r:id="rIdjdgynsom2-igi37qggzlz">
         <w:r>
           <w:rPr>
             <w:rFonts w:ascii="Times New Roman" w:cs="Times New Roman" w:eastAsia="Times New Roman" w:hAnsi="Times New Roman"/>
@@ -447,7 +447,7 @@
         </w:tabs>
         <w:spacing w:before="42" w:line="235" w:lineRule="exact"/>
       </w:pPr>
-      <w:hyperlink w:history="1" r:id="rIdmtlmvtfzys8hgwcmvkejq">
+      <w:hyperlink w:history="1" r:id="rIdbzrhsarognmkvsm4jfllt">
         <w:r>
           <w:rPr>
             <w:rFonts w:ascii="Times New Roman" w:cs="Times New Roman" w:eastAsia="Times New Roman" w:hAnsi="Times New Roman"/>
@@ -540,7 +540,7 @@
         </w:tabs>
         <w:spacing w:before="54" w:line="235" w:lineRule="exact"/>
       </w:pPr>
-      <w:hyperlink w:history="1" r:id="rIdl7n8klvl2-hspwovw3bmv">
+      <w:hyperlink w:history="1" r:id="rIdewme7xv-9ig7ii0bkqebq">
         <w:r>
           <w:rPr>
             <w:rFonts w:ascii="Times New Roman" w:cs="Times New Roman" w:eastAsia="Times New Roman" w:hAnsi="Times New Roman"/>
@@ -581,7 +581,7 @@
       <w:r>
         <w:tab/>
       </w:r>
-      <w:hyperlink w:history="1" r:id="rIdmobz5e6olb4oevvm926k8">
+      <w:hyperlink w:history="1" r:id="rIdoiwag-60eqisq_m1dgth8">
         <w:r>
           <w:rPr>
             <w:rFonts w:ascii="Times New Roman" w:cs="Times New Roman" w:eastAsia="Times New Roman" w:hAnsi="Times New Roman"/>
@@ -635,7 +635,7 @@
         </w:tabs>
         <w:spacing w:before="54" w:line="235" w:lineRule="exact"/>
       </w:pPr>
-      <w:hyperlink w:history="1" r:id="rIdcejlzjfsgoxykysh4zkgp">
+      <w:hyperlink w:history="1" r:id="rIdlyqqjo410kl-sm6y1qdjd">
         <w:r>
           <w:rPr>
             <w:rFonts w:ascii="Times New Roman" w:cs="Times New Roman" w:eastAsia="Times New Roman" w:hAnsi="Times New Roman"/>
@@ -658,7 +658,7 @@
       <w:r>
         <w:tab/>
       </w:r>
-      <w:hyperlink w:history="1" r:id="rIdctgjksanauli0fcqunirc">
+      <w:hyperlink w:history="1" r:id="rIdu-chi8dripq40q-wj2v6k">
         <w:r>
           <w:rPr>
             <w:rFonts w:ascii="Times New Roman" w:cs="Times New Roman" w:eastAsia="Times New Roman" w:hAnsi="Times New Roman"/>
@@ -712,7 +712,7 @@
         </w:tabs>
         <w:spacing w:before="54" w:line="235" w:lineRule="exact"/>
       </w:pPr>
-      <w:hyperlink w:history="1" r:id="rIdbzokex9i-33bmb-gswmyj">
+      <w:hyperlink w:history="1" r:id="rId4bjpbmhznysxq1rxa0zdr">
         <w:r>
           <w:rPr>
             <w:rFonts w:ascii="Times New Roman" w:cs="Times New Roman" w:eastAsia="Times New Roman" w:hAnsi="Times New Roman"/>

</xml_diff>

<commit_message>
Resolve every finding from the adversarial pass
Dates: thesis and Columbia both end May 2027, Foster Care ends May 2025,
and the site's CRIS Lab entry is corrected to May – Dec 2025 so it stops
contradicting the résumé. Smack stays as it is. The Cidon/CRIS overlap is
real and left alone.

Consistency: "MIT iQuHACK 2026" in the project column to match the
honors line, "MS in Computer Science" in the tagline to match Education,
and the thesis dropped from the TA line so it appears twice rather than
three times.

The LLM project's right column said "Systems optimization", a category
label carrying no information where every other project shows a link.
It is the repo now, so that column reads award, link, link, link.

Co-Authored-By: Claude Opus 5 <noreply@anthropic.com>
Claude-Session: https://claude.ai/code/session_01EbsTbSDgvxSSfAYTVqmk9g
</commit_message>
<xml_diff>
--- a/resume/jaspersands_resume.docx
+++ b/resume/jaspersands_resume.docx
@@ -32,7 +32,7 @@
         </w:rPr>
         <w:t xml:space="preserve">Palo Alto, CA | (650) 924-8429 | </w:t>
       </w:r>
-      <w:hyperlink w:history="1" r:id="rIdyey4zq4exqmnfjnjctklo">
+      <w:hyperlink w:history="1" r:id="rIdariktowvkfp63nohj3nmd">
         <w:r>
           <w:rPr>
             <w:rFonts w:ascii="Times New Roman" w:cs="Times New Roman" w:eastAsia="Times New Roman" w:hAnsi="Times New Roman"/>
@@ -50,7 +50,7 @@
         </w:rPr>
         <w:t xml:space="preserve"> | </w:t>
       </w:r>
-      <w:hyperlink w:history="1" r:id="rIdoed8iwoj3kbh5cbobe3cw">
+      <w:hyperlink w:history="1" r:id="rIdy8y_nartc8m1xbsxqaomo">
         <w:r>
           <w:rPr>
             <w:rFonts w:ascii="Times New Roman" w:cs="Times New Roman" w:eastAsia="Times New Roman" w:hAnsi="Times New Roman"/>
@@ -68,7 +68,7 @@
         </w:rPr>
         <w:t xml:space="preserve"> | </w:t>
       </w:r>
-      <w:hyperlink w:history="1" r:id="rIdvpewdsedezpzlqlkacvoj">
+      <w:hyperlink w:history="1" r:id="rIdsb76fmwidecog9buozro7">
         <w:r>
           <w:rPr>
             <w:rFonts w:ascii="Times New Roman" w:cs="Times New Roman" w:eastAsia="Times New Roman" w:hAnsi="Times New Roman"/>
@@ -86,7 +86,7 @@
         </w:rPr>
         <w:t xml:space="preserve"> | </w:t>
       </w:r>
-      <w:hyperlink w:history="1" r:id="rIdjdgynsom2-igi37qggzlz">
+      <w:hyperlink w:history="1" r:id="rIdnb80ntnx2yqw68zdu9st7">
         <w:r>
           <w:rPr>
             <w:rFonts w:ascii="Times New Roman" w:cs="Times New Roman" w:eastAsia="Times New Roman" w:hAnsi="Times New Roman"/>
@@ -108,7 +108,7 @@
           <w:sz w:val="20"/>
           <w:szCs w:val="20"/>
         </w:rPr>
-        <w:t xml:space="preserve">Quantum algorithms, error correction, and machine learning for qubit control. MS in computer science at Columbia. Thesis at Diraq and UNSW Sydney on automating silicon spin qubit measurement.</w:t>
+        <w:t xml:space="preserve">Quantum algorithms, error correction, and machine learning for qubit control. MS in Computer Science at Columbia. Thesis at Diraq and UNSW Sydney on automating silicon spin qubit measurement.</w:t>
       </w:r>
     </w:p>
     <w:p>
@@ -274,25 +274,7 @@
           <w:sz w:val="20"/>
           <w:szCs w:val="20"/>
         </w:rPr>
-        <w:t xml:space="preserve">Introduction to Quantum Computing. </w:t>
-      </w:r>
-      <w:r>
-        <w:rPr>
-          <w:rFonts w:ascii="Times New Roman" w:cs="Times New Roman" w:eastAsia="Times New Roman" w:hAnsi="Times New Roman"/>
-          <w:b/>
-          <w:bCs/>
-          <w:sz w:val="20"/>
-          <w:szCs w:val="20"/>
-        </w:rPr>
-        <w:t xml:space="preserve">MS thesis</w:t>
-      </w:r>
-      <w:r>
-        <w:rPr>
-          <w:rFonts w:ascii="Times New Roman" w:cs="Times New Roman" w:eastAsia="Times New Roman" w:hAnsi="Times New Roman"/>
-          <w:sz w:val="20"/>
-          <w:szCs w:val="20"/>
-        </w:rPr>
-        <w:t xml:space="preserve"> at Diraq and UNSW Sydney.</w:t>
+        <w:t xml:space="preserve">Introduction to Quantum Computing.</w:t>
       </w:r>
     </w:p>
     <w:p>
@@ -447,7 +429,7 @@
         </w:tabs>
         <w:spacing w:before="42" w:line="235" w:lineRule="exact"/>
       </w:pPr>
-      <w:hyperlink w:history="1" r:id="rIdbzrhsarognmkvsm4jfllt">
+      <w:hyperlink w:history="1" r:id="rId1qsyg4cf2m-vxu_lhojuk">
         <w:r>
           <w:rPr>
             <w:rFonts w:ascii="Times New Roman" w:cs="Times New Roman" w:eastAsia="Times New Roman" w:hAnsi="Times New Roman"/>
@@ -494,7 +476,7 @@
           <w:sz w:val="20"/>
           <w:szCs w:val="20"/>
         </w:rPr>
-        <w:t xml:space="preserve">Overall Winner, iQuHACK 2026</w:t>
+        <w:t xml:space="preserve">Overall Winner, MIT iQuHACK 2026</w:t>
       </w:r>
     </w:p>
     <w:p>
@@ -540,7 +522,7 @@
         </w:tabs>
         <w:spacing w:before="54" w:line="235" w:lineRule="exact"/>
       </w:pPr>
-      <w:hyperlink w:history="1" r:id="rIdewme7xv-9ig7ii0bkqebq">
+      <w:hyperlink w:history="1" r:id="rIdpommeh74ld3n5bhutzrf9">
         <w:r>
           <w:rPr>
             <w:rFonts w:ascii="Times New Roman" w:cs="Times New Roman" w:eastAsia="Times New Roman" w:hAnsi="Times New Roman"/>
@@ -581,7 +563,7 @@
       <w:r>
         <w:tab/>
       </w:r>
-      <w:hyperlink w:history="1" r:id="rIdoiwag-60eqisq_m1dgth8">
+      <w:hyperlink w:history="1" r:id="rIdaymtbcahxdkhwjumfpqmi">
         <w:r>
           <w:rPr>
             <w:rFonts w:ascii="Times New Roman" w:cs="Times New Roman" w:eastAsia="Times New Roman" w:hAnsi="Times New Roman"/>
@@ -635,7 +617,7 @@
         </w:tabs>
         <w:spacing w:before="54" w:line="235" w:lineRule="exact"/>
       </w:pPr>
-      <w:hyperlink w:history="1" r:id="rIdlyqqjo410kl-sm6y1qdjd">
+      <w:hyperlink w:history="1" r:id="rIdc2f-qw_fs3wuo1iwqjaaz">
         <w:r>
           <w:rPr>
             <w:rFonts w:ascii="Times New Roman" w:cs="Times New Roman" w:eastAsia="Times New Roman" w:hAnsi="Times New Roman"/>
@@ -658,7 +640,7 @@
       <w:r>
         <w:tab/>
       </w:r>
-      <w:hyperlink w:history="1" r:id="rIdu-chi8dripq40q-wj2v6k">
+      <w:hyperlink w:history="1" r:id="rIdbp9ia18sf8zaddnhet7ex">
         <w:r>
           <w:rPr>
             <w:rFonts w:ascii="Times New Roman" w:cs="Times New Roman" w:eastAsia="Times New Roman" w:hAnsi="Times New Roman"/>
@@ -712,7 +694,7 @@
         </w:tabs>
         <w:spacing w:before="54" w:line="235" w:lineRule="exact"/>
       </w:pPr>
-      <w:hyperlink w:history="1" r:id="rId4bjpbmhznysxq1rxa0zdr">
+      <w:hyperlink w:history="1" r:id="rIdvacjtw-87bxxofulmb_t7">
         <w:r>
           <w:rPr>
             <w:rFonts w:ascii="Times New Roman" w:cs="Times New Roman" w:eastAsia="Times New Roman" w:hAnsi="Times New Roman"/>
@@ -745,14 +727,16 @@
       <w:r>
         <w:tab/>
       </w:r>
-      <w:r>
-        <w:rPr>
-          <w:rFonts w:ascii="Times New Roman" w:cs="Times New Roman" w:eastAsia="Times New Roman" w:hAnsi="Times New Roman"/>
-          <w:sz w:val="20"/>
-          <w:szCs w:val="20"/>
-        </w:rPr>
-        <w:t xml:space="preserve">Systems optimization</w:t>
-      </w:r>
+      <w:hyperlink w:history="1" r:id="rId3kelj74aswh7rq2-kkerz">
+        <w:r>
+          <w:rPr>
+            <w:rFonts w:ascii="Times New Roman" w:cs="Times New Roman" w:eastAsia="Times New Roman" w:hAnsi="Times New Roman"/>
+            <w:sz w:val="20"/>
+            <w:szCs w:val="20"/>
+          </w:rPr>
+          <w:t xml:space="preserve">github.com/Jaspersands/LLMcompression</w:t>
+        </w:r>
+      </w:hyperlink>
     </w:p>
     <w:p>
       <w:pPr>
@@ -835,7 +819,7 @@
           <w:sz w:val="20"/>
           <w:szCs w:val="20"/>
         </w:rPr>
-        <w:t xml:space="preserve">Sep 2026 – Jun 2027</w:t>
+        <w:t xml:space="preserve">Sep 2026 – May 2027</w:t>
       </w:r>
     </w:p>
     <w:p>
@@ -1072,7 +1056,7 @@
           <w:sz w:val="20"/>
           <w:szCs w:val="20"/>
         </w:rPr>
-        <w:t xml:space="preserve">Sep 2024 – Jun 2025</w:t>
+        <w:t xml:space="preserve">Sep 2024 – May 2025</w:t>
       </w:r>
     </w:p>
     <w:p>

</xml_diff>